<commit_message>
finished the diagram and schematic. filled out the tables on the report.
</commit_message>
<xml_diff>
--- a/physical_interaction_CA2_Report.docx
+++ b/physical_interaction_CA2_Report.docx
@@ -564,7 +564,16 @@
                 <w:spacing w:val="2"/>
                 <w:lang w:eastAsia="en-IE"/>
               </w:rPr>
-              <w:t>Arduino Uno R3</w:t>
+              <w:t xml:space="preserve">Arduino </w:t>
+            </w:r>
+            <w:r>
+              <w:rPr>
+                <w:rFonts w:ascii="Cambria" w:eastAsia="Times New Roman" w:hAnsi="Cambria" w:cs="Segoe UI"/>
+                <w:color w:val="000000"/>
+                <w:spacing w:val="2"/>
+                <w:lang w:eastAsia="en-IE"/>
+              </w:rPr>
+              <w:t>Leonardo</w:t>
             </w:r>
           </w:p>
         </w:tc>
@@ -677,7 +686,16 @@
                 <w:spacing w:val="2"/>
                 <w:lang w:eastAsia="en-IE"/>
               </w:rPr>
-              <w:t>4-Digit 7-Segment</w:t>
+              <w:t>HC-SR04 Ultrasonic Sensor</w:t>
+            </w:r>
+            <w:r>
+              <w:rPr>
+                <w:rFonts w:ascii="Cambria" w:eastAsia="Times New Roman" w:hAnsi="Cambria" w:cs="Segoe UI"/>
+                <w:color w:val="000000"/>
+                <w:spacing w:val="2"/>
+                <w:lang w:eastAsia="en-IE"/>
+              </w:rPr>
+              <w:t xml:space="preserve"> </w:t>
             </w:r>
           </w:p>
         </w:tc>
@@ -717,7 +735,7 @@
                 <w:spacing w:val="2"/>
                 <w:lang w:eastAsia="en-IE"/>
               </w:rPr>
-              <w:t>4</w:t>
+              <w:t>1</w:t>
             </w:r>
           </w:p>
         </w:tc>
@@ -757,7 +775,61 @@
                 <w:spacing w:val="2"/>
                 <w:lang w:eastAsia="en-IE"/>
               </w:rPr>
-              <w:t>Common Anode, 14 pins</w:t>
+              <w:t xml:space="preserve">To measure </w:t>
+            </w:r>
+            <w:r>
+              <w:rPr>
+                <w:rFonts w:ascii="Cambria" w:eastAsia="Times New Roman" w:hAnsi="Cambria" w:cs="Segoe UI"/>
+                <w:color w:val="000000"/>
+                <w:spacing w:val="2"/>
+                <w:lang w:eastAsia="en-IE"/>
+              </w:rPr>
+              <w:t xml:space="preserve">the </w:t>
+            </w:r>
+            <w:r>
+              <w:rPr>
+                <w:rFonts w:ascii="Cambria" w:eastAsia="Times New Roman" w:hAnsi="Cambria" w:cs="Segoe UI"/>
+                <w:color w:val="000000"/>
+                <w:spacing w:val="2"/>
+                <w:lang w:eastAsia="en-IE"/>
+              </w:rPr>
+              <w:t xml:space="preserve">distance </w:t>
+            </w:r>
+            <w:r>
+              <w:rPr>
+                <w:rFonts w:ascii="Cambria" w:eastAsia="Times New Roman" w:hAnsi="Cambria" w:cs="Segoe UI"/>
+                <w:color w:val="000000"/>
+                <w:spacing w:val="2"/>
+                <w:lang w:eastAsia="en-IE"/>
+              </w:rPr>
+              <w:t xml:space="preserve">from the </w:t>
+            </w:r>
+            <w:r>
+              <w:rPr>
+                <w:rFonts w:ascii="Cambria" w:eastAsia="Times New Roman" w:hAnsi="Cambria" w:cs="Segoe UI"/>
+                <w:color w:val="000000"/>
+                <w:spacing w:val="2"/>
+                <w:lang w:eastAsia="en-IE"/>
+              </w:rPr>
+              <w:t xml:space="preserve">hand/arm </w:t>
+            </w:r>
+            <w:r>
+              <w:rPr>
+                <w:rFonts w:ascii="Cambria" w:eastAsia="Times New Roman" w:hAnsi="Cambria" w:cs="Segoe UI"/>
+                <w:color w:val="000000"/>
+                <w:spacing w:val="2"/>
+                <w:lang w:eastAsia="en-IE"/>
+              </w:rPr>
+              <w:t>to the sensor</w:t>
+            </w:r>
+            <w:r>
+              <w:rPr>
+                <w:rFonts w:ascii="Cambria" w:eastAsia="Times New Roman" w:hAnsi="Cambria" w:cs="Segoe UI"/>
+                <w:color w:val="000000"/>
+                <w:spacing w:val="2"/>
+                <w:lang w:eastAsia="en-IE"/>
+              </w:rPr>
+              <w:t>, and steer the car accordingly.</w:t>
             </w:r>
           </w:p>
         </w:tc>
@@ -799,7 +871,16 @@
                 <w:spacing w:val="2"/>
                 <w:lang w:eastAsia="en-IE"/>
               </w:rPr>
-              <w:t>220Ω Resistor</w:t>
+              <w:t>Piranha RGB LED</w:t>
+            </w:r>
+            <w:r>
+              <w:rPr>
+                <w:rFonts w:ascii="Cambria" w:eastAsia="Times New Roman" w:hAnsi="Cambria" w:cs="Segoe UI"/>
+                <w:color w:val="000000"/>
+                <w:spacing w:val="2"/>
+                <w:lang w:eastAsia="en-IE"/>
+              </w:rPr>
+              <w:t xml:space="preserve"> (Common Anode)</w:t>
             </w:r>
           </w:p>
         </w:tc>
@@ -839,7 +920,7 @@
                 <w:spacing w:val="2"/>
                 <w:lang w:eastAsia="en-IE"/>
               </w:rPr>
-              <w:t>8</w:t>
+              <w:t>1</w:t>
             </w:r>
           </w:p>
         </w:tc>
@@ -879,7 +960,16 @@
                 <w:spacing w:val="2"/>
                 <w:lang w:eastAsia="en-IE"/>
               </w:rPr>
-              <w:t>Connect to the 7-segment segment pins</w:t>
+              <w:t>To show if the safety is on by showing red or green</w:t>
+            </w:r>
+            <w:r>
+              <w:rPr>
+                <w:rFonts w:ascii="Cambria" w:eastAsia="Times New Roman" w:hAnsi="Cambria" w:cs="Segoe UI"/>
+                <w:color w:val="000000"/>
+                <w:spacing w:val="2"/>
+                <w:lang w:eastAsia="en-IE"/>
+              </w:rPr>
+              <w:t xml:space="preserve">. Red shows that the board is disconnected, and that the safety is on. Green shows that the board is connected, and that the safety is off. </w:t>
             </w:r>
           </w:p>
         </w:tc>
@@ -921,7 +1011,16 @@
                 <w:spacing w:val="2"/>
                 <w:lang w:eastAsia="en-IE"/>
               </w:rPr>
-              <w:t>PNP Transistor</w:t>
+              <w:t>560</w:t>
+            </w:r>
+            <w:r>
+              <w:rPr>
+                <w:rFonts w:ascii="Cambria" w:eastAsia="Times New Roman" w:hAnsi="Cambria" w:cs="Segoe UI"/>
+                <w:color w:val="000000"/>
+                <w:spacing w:val="2"/>
+                <w:lang w:eastAsia="en-IE"/>
+              </w:rPr>
+              <w:t>Ω Resistor</w:t>
             </w:r>
           </w:p>
         </w:tc>
@@ -961,7 +1060,7 @@
                 <w:spacing w:val="2"/>
                 <w:lang w:eastAsia="en-IE"/>
               </w:rPr>
-              <w:t>4</w:t>
+              <w:t>2</w:t>
             </w:r>
           </w:p>
         </w:tc>
@@ -982,7 +1081,6 @@
               <w:right w:w="195" w:type="dxa"/>
             </w:tcMar>
             <w:vAlign w:val="center"/>
-            <w:hideMark/>
           </w:tcPr>
           <w:p>
             <w:pPr>
@@ -1001,7 +1099,16 @@
                 <w:spacing w:val="2"/>
                 <w:lang w:eastAsia="en-IE"/>
               </w:rPr>
-              <w:t>Optional, recommended</w:t>
+              <w:t>For the red and green pin of the piranha RGB LED</w:t>
+            </w:r>
+            <w:r>
+              <w:rPr>
+                <w:rFonts w:ascii="Cambria" w:eastAsia="Times New Roman" w:hAnsi="Cambria" w:cs="Segoe UI"/>
+                <w:color w:val="000000"/>
+                <w:spacing w:val="2"/>
+                <w:lang w:eastAsia="en-IE"/>
+              </w:rPr>
+              <w:t>. A third resistor is not needed as the only two colours I’m using are red and green, therefore there is no need from the blue pin at all.</w:t>
             </w:r>
           </w:p>
         </w:tc>
@@ -1043,7 +1150,7 @@
                 <w:spacing w:val="2"/>
                 <w:lang w:eastAsia="en-IE"/>
               </w:rPr>
-              <w:t>4.7kΩ Resistor</w:t>
+              <w:t>Breadboard</w:t>
             </w:r>
           </w:p>
         </w:tc>
@@ -1083,7 +1190,7 @@
                 <w:spacing w:val="2"/>
                 <w:lang w:eastAsia="en-IE"/>
               </w:rPr>
-              <w:t>4</w:t>
+              <w:t>2</w:t>
             </w:r>
           </w:p>
         </w:tc>
@@ -1123,7 +1230,7 @@
                 <w:spacing w:val="2"/>
                 <w:lang w:eastAsia="en-IE"/>
               </w:rPr>
-              <w:t>If you use the PNP transistors</w:t>
+              <w:t xml:space="preserve">The second breadboard is for extra space and user comfortability. </w:t>
             </w:r>
           </w:p>
         </w:tc>
@@ -1165,7 +1272,7 @@
                 <w:spacing w:val="2"/>
                 <w:lang w:eastAsia="en-IE"/>
               </w:rPr>
-              <w:t>12mm Push button</w:t>
+              <w:t>Button</w:t>
             </w:r>
           </w:p>
         </w:tc>
@@ -1205,7 +1312,7 @@
                 <w:spacing w:val="2"/>
                 <w:lang w:eastAsia="en-IE"/>
               </w:rPr>
-              <w:t>3</w:t>
+              <w:t>4</w:t>
             </w:r>
           </w:p>
         </w:tc>
@@ -1238,249 +1345,69 @@
                 <w:lang w:eastAsia="en-IE"/>
               </w:rPr>
             </w:pPr>
-          </w:p>
-        </w:tc>
-      </w:tr>
-      <w:tr>
-        <w:tc>
-          <w:tcPr>
-            <w:tcW w:w="0" w:type="auto"/>
-            <w:tcBorders>
-              <w:top w:val="single" w:sz="6" w:space="0" w:color="DFE2E5"/>
-              <w:left w:val="single" w:sz="6" w:space="0" w:color="DFE2E5"/>
-              <w:bottom w:val="single" w:sz="6" w:space="0" w:color="DFE2E5"/>
-              <w:right w:val="single" w:sz="6" w:space="0" w:color="DFE2E5"/>
-            </w:tcBorders>
-            <w:shd w:val="clear" w:color="auto" w:fill="FFFFFF"/>
-            <w:tcMar>
-              <w:top w:w="90" w:type="dxa"/>
-              <w:left w:w="195" w:type="dxa"/>
-              <w:bottom w:w="90" w:type="dxa"/>
-              <w:right w:w="195" w:type="dxa"/>
-            </w:tcMar>
-            <w:vAlign w:val="center"/>
-            <w:hideMark/>
-          </w:tcPr>
-          <w:p>
-            <w:pPr>
-              <w:spacing w:after="240" w:line="240" w:lineRule="auto"/>
-              <w:rPr>
-                <w:rFonts w:ascii="Cambria" w:eastAsia="Times New Roman" w:hAnsi="Cambria" w:cs="Segoe UI"/>
-                <w:color w:val="000000"/>
-                <w:spacing w:val="2"/>
-                <w:lang w:eastAsia="en-IE"/>
-              </w:rPr>
-            </w:pPr>
-            <w:r>
-              <w:rPr>
-                <w:rFonts w:ascii="Cambria" w:eastAsia="Times New Roman" w:hAnsi="Cambria" w:cs="Segoe UI"/>
-                <w:color w:val="000000"/>
-                <w:spacing w:val="2"/>
-                <w:lang w:eastAsia="en-IE"/>
-              </w:rPr>
-              <w:t>Piezo Buzzer</w:t>
-            </w:r>
-          </w:p>
-        </w:tc>
-        <w:tc>
-          <w:tcPr>
-            <w:tcW w:w="1507" w:type="dxa"/>
-            <w:tcBorders>
-              <w:top w:val="single" w:sz="6" w:space="0" w:color="DFE2E5"/>
-              <w:left w:val="single" w:sz="6" w:space="0" w:color="DFE2E5"/>
-              <w:bottom w:val="single" w:sz="6" w:space="0" w:color="DFE2E5"/>
-              <w:right w:val="single" w:sz="6" w:space="0" w:color="DFE2E5"/>
-            </w:tcBorders>
-            <w:shd w:val="clear" w:color="auto" w:fill="FFFFFF"/>
-            <w:tcMar>
-              <w:top w:w="90" w:type="dxa"/>
-              <w:left w:w="195" w:type="dxa"/>
-              <w:bottom w:w="90" w:type="dxa"/>
-              <w:right w:w="195" w:type="dxa"/>
-            </w:tcMar>
-            <w:vAlign w:val="center"/>
-            <w:hideMark/>
-          </w:tcPr>
-          <w:p>
-            <w:pPr>
-              <w:spacing w:after="240" w:line="240" w:lineRule="auto"/>
-              <w:rPr>
-                <w:rFonts w:ascii="Cambria" w:eastAsia="Times New Roman" w:hAnsi="Cambria" w:cs="Segoe UI"/>
-                <w:color w:val="000000"/>
-                <w:spacing w:val="2"/>
-                <w:lang w:eastAsia="en-IE"/>
-              </w:rPr>
-            </w:pPr>
-            <w:r>
-              <w:rPr>
-                <w:rFonts w:ascii="Cambria" w:eastAsia="Times New Roman" w:hAnsi="Cambria" w:cs="Segoe UI"/>
-                <w:color w:val="000000"/>
-                <w:spacing w:val="2"/>
-                <w:lang w:eastAsia="en-IE"/>
-              </w:rPr>
-              <w:t>1</w:t>
-            </w:r>
-          </w:p>
-        </w:tc>
-        <w:tc>
-          <w:tcPr>
-            <w:tcW w:w="5164" w:type="dxa"/>
-            <w:tcBorders>
-              <w:top w:val="single" w:sz="6" w:space="0" w:color="DFE2E5"/>
-              <w:left w:val="single" w:sz="6" w:space="0" w:color="DFE2E5"/>
-              <w:bottom w:val="single" w:sz="6" w:space="0" w:color="DFE2E5"/>
-              <w:right w:val="single" w:sz="6" w:space="0" w:color="DFE2E5"/>
-            </w:tcBorders>
-            <w:shd w:val="clear" w:color="auto" w:fill="FFFFFF"/>
-            <w:tcMar>
-              <w:top w:w="90" w:type="dxa"/>
-              <w:left w:w="195" w:type="dxa"/>
-              <w:bottom w:w="90" w:type="dxa"/>
-              <w:right w:w="195" w:type="dxa"/>
-            </w:tcMar>
-            <w:vAlign w:val="center"/>
-            <w:hideMark/>
-          </w:tcPr>
-          <w:p>
-            <w:pPr>
-              <w:spacing w:after="240" w:line="240" w:lineRule="auto"/>
-              <w:rPr>
-                <w:rFonts w:ascii="Cambria" w:eastAsia="Times New Roman" w:hAnsi="Cambria" w:cs="Segoe UI"/>
-                <w:color w:val="000000"/>
-                <w:spacing w:val="2"/>
-                <w:lang w:eastAsia="en-IE"/>
-              </w:rPr>
-            </w:pPr>
-            <w:r>
-              <w:rPr>
-                <w:rFonts w:ascii="Cambria" w:eastAsia="Times New Roman" w:hAnsi="Cambria" w:cs="Segoe UI"/>
-                <w:color w:val="000000"/>
-                <w:spacing w:val="2"/>
-                <w:lang w:eastAsia="en-IE"/>
-              </w:rPr>
-              <w:t>Used for the alarm</w:t>
-            </w:r>
-          </w:p>
-        </w:tc>
-      </w:tr>
-      <w:tr>
-        <w:tc>
-          <w:tcPr>
-            <w:tcW w:w="0" w:type="auto"/>
-            <w:tcBorders>
-              <w:top w:val="single" w:sz="6" w:space="0" w:color="DFE2E5"/>
-              <w:left w:val="single" w:sz="6" w:space="0" w:color="DFE2E5"/>
-              <w:bottom w:val="single" w:sz="6" w:space="0" w:color="DFE2E5"/>
-              <w:right w:val="single" w:sz="6" w:space="0" w:color="DFE2E5"/>
-            </w:tcBorders>
-            <w:shd w:val="clear" w:color="auto" w:fill="F6F8FA"/>
-            <w:tcMar>
-              <w:top w:w="90" w:type="dxa"/>
-              <w:left w:w="195" w:type="dxa"/>
-              <w:bottom w:w="90" w:type="dxa"/>
-              <w:right w:w="195" w:type="dxa"/>
-            </w:tcMar>
-            <w:vAlign w:val="center"/>
-            <w:hideMark/>
-          </w:tcPr>
-          <w:p>
-            <w:pPr>
-              <w:spacing w:after="240" w:line="240" w:lineRule="auto"/>
-              <w:rPr>
-                <w:rFonts w:ascii="Cambria" w:eastAsia="Times New Roman" w:hAnsi="Cambria" w:cs="Segoe UI"/>
-                <w:color w:val="000000"/>
-                <w:spacing w:val="2"/>
-                <w:lang w:eastAsia="en-IE"/>
-              </w:rPr>
-            </w:pPr>
-            <w:r>
-              <w:rPr>
-                <w:rFonts w:ascii="Cambria" w:eastAsia="Times New Roman" w:hAnsi="Cambria" w:cs="Segoe UI"/>
-                <w:color w:val="000000"/>
-                <w:spacing w:val="2"/>
-                <w:lang w:eastAsia="en-IE"/>
-              </w:rPr>
-              <w:t>DS1307 RTC</w:t>
-            </w:r>
-          </w:p>
-        </w:tc>
-        <w:tc>
-          <w:tcPr>
-            <w:tcW w:w="1507" w:type="dxa"/>
-            <w:tcBorders>
-              <w:top w:val="single" w:sz="6" w:space="0" w:color="DFE2E5"/>
-              <w:left w:val="single" w:sz="6" w:space="0" w:color="DFE2E5"/>
-              <w:bottom w:val="single" w:sz="6" w:space="0" w:color="DFE2E5"/>
-              <w:right w:val="single" w:sz="6" w:space="0" w:color="DFE2E5"/>
-            </w:tcBorders>
-            <w:shd w:val="clear" w:color="auto" w:fill="F6F8FA"/>
-            <w:tcMar>
-              <w:top w:w="90" w:type="dxa"/>
-              <w:left w:w="195" w:type="dxa"/>
-              <w:bottom w:w="90" w:type="dxa"/>
-              <w:right w:w="195" w:type="dxa"/>
-            </w:tcMar>
-            <w:vAlign w:val="center"/>
-            <w:hideMark/>
-          </w:tcPr>
-          <w:p>
-            <w:pPr>
-              <w:spacing w:after="240" w:line="240" w:lineRule="auto"/>
-              <w:rPr>
-                <w:rFonts w:ascii="Cambria" w:eastAsia="Times New Roman" w:hAnsi="Cambria" w:cs="Segoe UI"/>
-                <w:color w:val="000000"/>
-                <w:spacing w:val="2"/>
-                <w:lang w:eastAsia="en-IE"/>
-              </w:rPr>
-            </w:pPr>
-            <w:r>
-              <w:rPr>
-                <w:rFonts w:ascii="Cambria" w:eastAsia="Times New Roman" w:hAnsi="Cambria" w:cs="Segoe UI"/>
-                <w:color w:val="000000"/>
-                <w:spacing w:val="2"/>
-                <w:lang w:eastAsia="en-IE"/>
-              </w:rPr>
-              <w:t>1</w:t>
-            </w:r>
-          </w:p>
-        </w:tc>
-        <w:tc>
-          <w:tcPr>
-            <w:tcW w:w="5164" w:type="dxa"/>
-            <w:tcBorders>
-              <w:top w:val="single" w:sz="6" w:space="0" w:color="DFE2E5"/>
-              <w:left w:val="single" w:sz="6" w:space="0" w:color="DFE2E5"/>
-              <w:bottom w:val="single" w:sz="6" w:space="0" w:color="DFE2E5"/>
-              <w:right w:val="single" w:sz="6" w:space="0" w:color="DFE2E5"/>
-            </w:tcBorders>
-            <w:shd w:val="clear" w:color="auto" w:fill="F6F8FA"/>
-            <w:tcMar>
-              <w:top w:w="90" w:type="dxa"/>
-              <w:left w:w="195" w:type="dxa"/>
-              <w:bottom w:w="90" w:type="dxa"/>
-              <w:right w:w="195" w:type="dxa"/>
-            </w:tcMar>
-            <w:vAlign w:val="center"/>
-            <w:hideMark/>
-          </w:tcPr>
-          <w:p>
-            <w:pPr>
-              <w:spacing w:after="240" w:line="240" w:lineRule="auto"/>
-              <w:rPr>
-                <w:rFonts w:ascii="Cambria" w:eastAsia="Times New Roman" w:hAnsi="Cambria" w:cs="Segoe UI"/>
-                <w:color w:val="000000"/>
-                <w:spacing w:val="2"/>
-                <w:lang w:eastAsia="en-IE"/>
-              </w:rPr>
-            </w:pPr>
-            <w:r>
-              <w:rPr>
-                <w:rFonts w:ascii="Cambria" w:eastAsia="Times New Roman" w:hAnsi="Cambria" w:cs="Segoe UI"/>
-                <w:color w:val="000000"/>
-                <w:spacing w:val="2"/>
-                <w:lang w:eastAsia="en-IE"/>
-              </w:rPr>
-              <w:t>Optional</w:t>
+            <w:r>
+              <w:rPr>
+                <w:rFonts w:ascii="Cambria" w:eastAsia="Times New Roman" w:hAnsi="Cambria" w:cs="Segoe UI"/>
+                <w:color w:val="000000"/>
+                <w:spacing w:val="2"/>
+                <w:lang w:eastAsia="en-IE"/>
+              </w:rPr>
+              <w:t>Three of the buttons control keys on the keyboard</w:t>
+            </w:r>
+            <w:r>
+              <w:rPr>
+                <w:rFonts w:ascii="Cambria" w:eastAsia="Times New Roman" w:hAnsi="Cambria" w:cs="Segoe UI"/>
+                <w:color w:val="000000"/>
+                <w:spacing w:val="2"/>
+                <w:lang w:eastAsia="en-IE"/>
+              </w:rPr>
+              <w:t>.</w:t>
+            </w:r>
+            <w:r>
+              <w:rPr>
+                <w:rFonts w:ascii="Cambria" w:eastAsia="Times New Roman" w:hAnsi="Cambria" w:cs="Segoe UI"/>
+                <w:color w:val="000000"/>
+                <w:spacing w:val="2"/>
+                <w:lang w:eastAsia="en-IE"/>
+              </w:rPr>
+              <w:t xml:space="preserve"> ‘W’ for accelerating the car forward, ‘S’ </w:t>
+            </w:r>
+            <w:r>
+              <w:rPr>
+                <w:rFonts w:ascii="Cambria" w:eastAsia="Times New Roman" w:hAnsi="Cambria" w:cs="Segoe UI"/>
+                <w:color w:val="000000"/>
+                <w:spacing w:val="2"/>
+                <w:lang w:eastAsia="en-IE"/>
+              </w:rPr>
+              <w:lastRenderedPageBreak/>
+              <w:t xml:space="preserve">for reversing/braking, </w:t>
+            </w:r>
+            <w:r>
+              <w:rPr>
+                <w:rFonts w:ascii="Cambria" w:eastAsia="Times New Roman" w:hAnsi="Cambria" w:cs="Segoe UI"/>
+                <w:color w:val="000000"/>
+                <w:spacing w:val="2"/>
+                <w:lang w:eastAsia="en-IE"/>
+              </w:rPr>
+              <w:t xml:space="preserve">and </w:t>
+            </w:r>
+            <w:r>
+              <w:rPr>
+                <w:rFonts w:ascii="Cambria" w:eastAsia="Times New Roman" w:hAnsi="Cambria" w:cs="Segoe UI"/>
+                <w:color w:val="000000"/>
+                <w:spacing w:val="2"/>
+                <w:lang w:eastAsia="en-IE"/>
+              </w:rPr>
+              <w:t>‘R’ for resetting the car back on the road</w:t>
+            </w:r>
+            <w:r>
+              <w:rPr>
+                <w:rFonts w:ascii="Cambria" w:eastAsia="Times New Roman" w:hAnsi="Cambria" w:cs="Segoe UI"/>
+                <w:color w:val="000000"/>
+                <w:spacing w:val="2"/>
+                <w:lang w:eastAsia="en-IE"/>
+              </w:rPr>
+              <w:t xml:space="preserve">. The fourth button is a toggle that enables/disables the rest of the controls. </w:t>
             </w:r>
           </w:p>
         </w:tc>
@@ -1504,7 +1431,6 @@
         <w:rPr>
           <w:lang w:val="en-GB"/>
         </w:rPr>
-        <w:lastRenderedPageBreak/>
         <w:t>Electronics</w:t>
       </w:r>
     </w:p>
@@ -1632,6 +1558,9 @@
               </w:rPr>
             </w:pPr>
             <w:r>
+              <w:rPr>
+                <w:noProof/>
+              </w:rPr>
               <w:drawing>
                 <wp:inline distT="0" distB="0" distL="0" distR="0" wp14:anchorId="7D551F5F" wp14:editId="29D022C1">
                   <wp:extent cx="5455544" cy="2868603"/>
@@ -1746,6 +1675,7 @@
         <w:rPr>
           <w:lang w:val="en-GB"/>
         </w:rPr>
+        <w:lastRenderedPageBreak/>
         <w:t>Describe the PIN connections for your system here</w:t>
       </w:r>
     </w:p>
@@ -1770,7 +1700,6 @@
           <w:sz w:val="30"/>
           <w:szCs w:val="30"/>
         </w:rPr>
-        <w:lastRenderedPageBreak/>
         <w:t>Pin Connections</w:t>
       </w:r>
     </w:p>
@@ -1833,7 +1762,27 @@
                 <w:color w:val="000000"/>
                 <w:spacing w:val="2"/>
               </w:rPr>
-              <w:t>Arduino Uno Pin</w:t>
+              <w:t xml:space="preserve">Arduino </w:t>
+            </w:r>
+            <w:r>
+              <w:rPr>
+                <w:rFonts w:cs="Calibri"/>
+                <w:b/>
+                <w:bCs/>
+                <w:color w:val="000000"/>
+                <w:spacing w:val="2"/>
+              </w:rPr>
+              <w:t>Leonardo</w:t>
+            </w:r>
+            <w:r>
+              <w:rPr>
+                <w:rFonts w:cs="Calibri"/>
+                <w:b/>
+                <w:bCs/>
+                <w:color w:val="000000"/>
+                <w:spacing w:val="2"/>
+              </w:rPr>
+              <w:t xml:space="preserve"> Pin</w:t>
             </w:r>
           </w:p>
         </w:tc>
@@ -1997,7 +1946,15 @@
                 <w:color w:val="000000"/>
                 <w:spacing w:val="2"/>
               </w:rPr>
-              <w:t>7-Segment</w:t>
+              <w:t xml:space="preserve">Button </w:t>
+            </w:r>
+            <w:r>
+              <w:rPr>
+                <w:rFonts w:cs="Calibri"/>
+                <w:color w:val="000000"/>
+                <w:spacing w:val="2"/>
+              </w:rPr>
+              <w:t>(R Key)</w:t>
             </w:r>
           </w:p>
         </w:tc>
@@ -2035,7 +1992,15 @@
                 <w:color w:val="000000"/>
                 <w:spacing w:val="2"/>
               </w:rPr>
-              <w:t>14 (Dig 1)</w:t>
+              <w:t>One leg of button</w:t>
+            </w:r>
+            <w:r>
+              <w:rPr>
+                <w:rFonts w:cs="Calibri"/>
+                <w:color w:val="000000"/>
+                <w:spacing w:val="2"/>
+              </w:rPr>
+              <w:t xml:space="preserve"> </w:t>
             </w:r>
           </w:p>
         </w:tc>
@@ -2109,11 +2074,12 @@
             </w:pPr>
             <w:r>
               <w:rPr>
-                <w:rFonts w:cs="Calibri"/>
-                <w:color w:val="000000"/>
-                <w:spacing w:val="2"/>
-              </w:rPr>
-              <w:t>7-Segment</w:t>
+                <w:rFonts w:ascii="Cambria" w:eastAsia="Times New Roman" w:hAnsi="Cambria" w:cs="Segoe UI"/>
+                <w:color w:val="000000"/>
+                <w:spacing w:val="2"/>
+                <w:lang w:eastAsia="en-IE"/>
+              </w:rPr>
+              <w:t>HC-SR04 Ultrasonic Sensor</w:t>
             </w:r>
           </w:p>
         </w:tc>
@@ -2151,7 +2117,7 @@
                 <w:color w:val="000000"/>
                 <w:spacing w:val="2"/>
               </w:rPr>
-              <w:t>11 (Dig 2)</w:t>
+              <w:t>Echo</w:t>
             </w:r>
           </w:p>
         </w:tc>
@@ -2229,7 +2195,15 @@
                 <w:color w:val="000000"/>
                 <w:spacing w:val="2"/>
               </w:rPr>
-              <w:t>7-Segment</w:t>
+              <w:t>Button</w:t>
+            </w:r>
+            <w:r>
+              <w:rPr>
+                <w:rFonts w:cs="Calibri"/>
+                <w:color w:val="000000"/>
+                <w:spacing w:val="2"/>
+              </w:rPr>
+              <w:t xml:space="preserve"> (S Key)</w:t>
             </w:r>
           </w:p>
         </w:tc>
@@ -2267,7 +2241,7 @@
                 <w:color w:val="000000"/>
                 <w:spacing w:val="2"/>
               </w:rPr>
-              <w:t>10 (Dig 3)</w:t>
+              <w:t>One leg of button</w:t>
             </w:r>
           </w:p>
         </w:tc>
@@ -2341,11 +2315,12 @@
             </w:pPr>
             <w:r>
               <w:rPr>
-                <w:rFonts w:cs="Calibri"/>
-                <w:color w:val="000000"/>
-                <w:spacing w:val="2"/>
-              </w:rPr>
-              <w:t>7-Segment</w:t>
+                <w:rFonts w:ascii="Cambria" w:eastAsia="Times New Roman" w:hAnsi="Cambria" w:cs="Segoe UI"/>
+                <w:color w:val="000000"/>
+                <w:spacing w:val="2"/>
+                <w:lang w:eastAsia="en-IE"/>
+              </w:rPr>
+              <w:t>HC-SR04 Ultrasonic Sensor</w:t>
             </w:r>
           </w:p>
         </w:tc>
@@ -2383,7 +2358,7 @@
                 <w:color w:val="000000"/>
                 <w:spacing w:val="2"/>
               </w:rPr>
-              <w:t>6 (Dig 4)</w:t>
+              <w:t>Trig</w:t>
             </w:r>
           </w:p>
         </w:tc>
@@ -2398,7 +2373,7 @@
               <w:bottom w:val="single" w:sz="6" w:space="0" w:color="DFE2E5"/>
               <w:right w:val="single" w:sz="6" w:space="0" w:color="DFE2E5"/>
             </w:tcBorders>
-            <w:shd w:val="clear" w:color="auto" w:fill="FFFFFF"/>
+            <w:shd w:val="clear" w:color="auto" w:fill="F6F8FA"/>
             <w:tcMar>
               <w:top w:w="90" w:type="dxa"/>
               <w:left w:w="195" w:type="dxa"/>
@@ -2423,7 +2398,7 @@
                 <w:color w:val="000000"/>
                 <w:spacing w:val="2"/>
               </w:rPr>
-              <w:t>6</w:t>
+              <w:t>7</w:t>
             </w:r>
           </w:p>
         </w:tc>
@@ -2436,7 +2411,7 @@
               <w:bottom w:val="single" w:sz="6" w:space="0" w:color="DFE2E5"/>
               <w:right w:val="single" w:sz="6" w:space="0" w:color="DFE2E5"/>
             </w:tcBorders>
-            <w:shd w:val="clear" w:color="auto" w:fill="FFFFFF"/>
+            <w:shd w:val="clear" w:color="auto" w:fill="F6F8FA"/>
             <w:tcMar>
               <w:top w:w="90" w:type="dxa"/>
               <w:left w:w="195" w:type="dxa"/>
@@ -2461,7 +2436,15 @@
                 <w:color w:val="000000"/>
                 <w:spacing w:val="2"/>
               </w:rPr>
-              <w:t>7-Segment</w:t>
+              <w:t>Button</w:t>
+            </w:r>
+            <w:r>
+              <w:rPr>
+                <w:rFonts w:cs="Calibri"/>
+                <w:color w:val="000000"/>
+                <w:spacing w:val="2"/>
+              </w:rPr>
+              <w:t xml:space="preserve"> (W Key)</w:t>
             </w:r>
           </w:p>
         </w:tc>
@@ -2474,7 +2457,7 @@
               <w:bottom w:val="single" w:sz="6" w:space="0" w:color="DFE2E5"/>
               <w:right w:val="single" w:sz="6" w:space="0" w:color="DFE2E5"/>
             </w:tcBorders>
-            <w:shd w:val="clear" w:color="auto" w:fill="FFFFFF"/>
+            <w:shd w:val="clear" w:color="auto" w:fill="F6F8FA"/>
             <w:tcMar>
               <w:top w:w="90" w:type="dxa"/>
               <w:left w:w="195" w:type="dxa"/>
@@ -2499,7 +2482,7 @@
                 <w:color w:val="000000"/>
                 <w:spacing w:val="2"/>
               </w:rPr>
-              <w:t>13 (A)</w:t>
+              <w:t>One leg of button</w:t>
             </w:r>
           </w:p>
         </w:tc>
@@ -2514,7 +2497,7 @@
               <w:bottom w:val="single" w:sz="6" w:space="0" w:color="DFE2E5"/>
               <w:right w:val="single" w:sz="6" w:space="0" w:color="DFE2E5"/>
             </w:tcBorders>
-            <w:shd w:val="clear" w:color="auto" w:fill="F6F8FA"/>
+            <w:shd w:val="clear" w:color="auto" w:fill="FFFFFF"/>
             <w:tcMar>
               <w:top w:w="90" w:type="dxa"/>
               <w:left w:w="195" w:type="dxa"/>
@@ -2539,7 +2522,7 @@
                 <w:color w:val="000000"/>
                 <w:spacing w:val="2"/>
               </w:rPr>
-              <w:t>7</w:t>
+              <w:t>8</w:t>
             </w:r>
           </w:p>
         </w:tc>
@@ -2552,7 +2535,7 @@
               <w:bottom w:val="single" w:sz="6" w:space="0" w:color="DFE2E5"/>
               <w:right w:val="single" w:sz="6" w:space="0" w:color="DFE2E5"/>
             </w:tcBorders>
-            <w:shd w:val="clear" w:color="auto" w:fill="F6F8FA"/>
+            <w:shd w:val="clear" w:color="auto" w:fill="FFFFFF"/>
             <w:tcMar>
               <w:top w:w="90" w:type="dxa"/>
               <w:left w:w="195" w:type="dxa"/>
@@ -2577,7 +2560,15 @@
                 <w:color w:val="000000"/>
                 <w:spacing w:val="2"/>
               </w:rPr>
-              <w:t>7-Segment</w:t>
+              <w:t>Button</w:t>
+            </w:r>
+            <w:r>
+              <w:rPr>
+                <w:rFonts w:cs="Calibri"/>
+                <w:color w:val="000000"/>
+                <w:spacing w:val="2"/>
+              </w:rPr>
+              <w:t xml:space="preserve"> (Safety)</w:t>
             </w:r>
           </w:p>
         </w:tc>
@@ -2590,7 +2581,7 @@
               <w:bottom w:val="single" w:sz="6" w:space="0" w:color="DFE2E5"/>
               <w:right w:val="single" w:sz="6" w:space="0" w:color="DFE2E5"/>
             </w:tcBorders>
-            <w:shd w:val="clear" w:color="auto" w:fill="F6F8FA"/>
+            <w:shd w:val="clear" w:color="auto" w:fill="FFFFFF"/>
             <w:tcMar>
               <w:top w:w="90" w:type="dxa"/>
               <w:left w:w="195" w:type="dxa"/>
@@ -2615,7 +2606,7 @@
                 <w:color w:val="000000"/>
                 <w:spacing w:val="2"/>
               </w:rPr>
-              <w:t>9 (B)</w:t>
+              <w:t>One leg of button</w:t>
             </w:r>
           </w:p>
         </w:tc>
@@ -2655,7 +2646,7 @@
                 <w:color w:val="000000"/>
                 <w:spacing w:val="2"/>
               </w:rPr>
-              <w:t>8</w:t>
+              <w:t>10</w:t>
             </w:r>
           </w:p>
         </w:tc>
@@ -2689,11 +2680,12 @@
             </w:pPr>
             <w:r>
               <w:rPr>
-                <w:rFonts w:cs="Calibri"/>
-                <w:color w:val="000000"/>
-                <w:spacing w:val="2"/>
-              </w:rPr>
-              <w:t>7-Segment</w:t>
+                <w:rFonts w:ascii="Cambria" w:eastAsia="Times New Roman" w:hAnsi="Cambria" w:cs="Segoe UI"/>
+                <w:color w:val="000000"/>
+                <w:spacing w:val="2"/>
+                <w:lang w:eastAsia="en-IE"/>
+              </w:rPr>
+              <w:t>Piranha RGB LED (Common Anode)</w:t>
             </w:r>
           </w:p>
         </w:tc>
@@ -2731,7 +2723,7 @@
                 <w:color w:val="000000"/>
                 <w:spacing w:val="2"/>
               </w:rPr>
-              <w:t>4 (C)</w:t>
+              <w:t>Green</w:t>
             </w:r>
           </w:p>
         </w:tc>
@@ -2771,7 +2763,7 @@
                 <w:color w:val="000000"/>
                 <w:spacing w:val="2"/>
               </w:rPr>
-              <w:t>9</w:t>
+              <w:t>11</w:t>
             </w:r>
           </w:p>
         </w:tc>
@@ -2805,11 +2797,12 @@
             </w:pPr>
             <w:r>
               <w:rPr>
-                <w:rFonts w:cs="Calibri"/>
-                <w:color w:val="000000"/>
-                <w:spacing w:val="2"/>
-              </w:rPr>
-              <w:t>7-Segment</w:t>
+                <w:rFonts w:ascii="Cambria" w:eastAsia="Times New Roman" w:hAnsi="Cambria" w:cs="Segoe UI"/>
+                <w:color w:val="000000"/>
+                <w:spacing w:val="2"/>
+                <w:lang w:eastAsia="en-IE"/>
+              </w:rPr>
+              <w:t>Piranha RGB LED (Common Anode)</w:t>
             </w:r>
           </w:p>
         </w:tc>
@@ -2847,1168 +2840,7 @@
                 <w:color w:val="000000"/>
                 <w:spacing w:val="2"/>
               </w:rPr>
-              <w:t>2 (D)</w:t>
-            </w:r>
-          </w:p>
-        </w:tc>
-      </w:tr>
-      <w:tr>
-        <w:tc>
-          <w:tcPr>
-            <w:tcW w:w="2180" w:type="dxa"/>
-            <w:tcBorders>
-              <w:top w:val="single" w:sz="6" w:space="0" w:color="DFE2E5"/>
-              <w:left w:val="single" w:sz="6" w:space="0" w:color="DFE2E5"/>
-              <w:bottom w:val="single" w:sz="6" w:space="0" w:color="DFE2E5"/>
-              <w:right w:val="single" w:sz="6" w:space="0" w:color="DFE2E5"/>
-            </w:tcBorders>
-            <w:shd w:val="clear" w:color="auto" w:fill="FFFFFF"/>
-            <w:tcMar>
-              <w:top w:w="90" w:type="dxa"/>
-              <w:left w:w="195" w:type="dxa"/>
-              <w:bottom w:w="90" w:type="dxa"/>
-              <w:right w:w="195" w:type="dxa"/>
-            </w:tcMar>
-            <w:vAlign w:val="center"/>
-            <w:hideMark/>
-          </w:tcPr>
-          <w:p>
-            <w:pPr>
-              <w:spacing w:after="240"/>
-              <w:rPr>
-                <w:rFonts w:cs="Calibri"/>
-                <w:color w:val="000000"/>
-                <w:spacing w:val="2"/>
-              </w:rPr>
-            </w:pPr>
-            <w:r>
-              <w:rPr>
-                <w:rFonts w:cs="Calibri"/>
-                <w:color w:val="000000"/>
-                <w:spacing w:val="2"/>
-              </w:rPr>
-              <w:t>10</w:t>
-            </w:r>
-          </w:p>
-        </w:tc>
-        <w:tc>
-          <w:tcPr>
-            <w:tcW w:w="2977" w:type="dxa"/>
-            <w:tcBorders>
-              <w:top w:val="single" w:sz="6" w:space="0" w:color="DFE2E5"/>
-              <w:left w:val="single" w:sz="6" w:space="0" w:color="DFE2E5"/>
-              <w:bottom w:val="single" w:sz="6" w:space="0" w:color="DFE2E5"/>
-              <w:right w:val="single" w:sz="6" w:space="0" w:color="DFE2E5"/>
-            </w:tcBorders>
-            <w:shd w:val="clear" w:color="auto" w:fill="FFFFFF"/>
-            <w:tcMar>
-              <w:top w:w="90" w:type="dxa"/>
-              <w:left w:w="195" w:type="dxa"/>
-              <w:bottom w:w="90" w:type="dxa"/>
-              <w:right w:w="195" w:type="dxa"/>
-            </w:tcMar>
-            <w:vAlign w:val="center"/>
-            <w:hideMark/>
-          </w:tcPr>
-          <w:p>
-            <w:pPr>
-              <w:spacing w:after="240"/>
-              <w:rPr>
-                <w:rFonts w:cs="Calibri"/>
-                <w:color w:val="000000"/>
-                <w:spacing w:val="2"/>
-              </w:rPr>
-            </w:pPr>
-            <w:r>
-              <w:rPr>
-                <w:rFonts w:cs="Calibri"/>
-                <w:color w:val="000000"/>
-                <w:spacing w:val="2"/>
-              </w:rPr>
-              <w:t>7-Segment</w:t>
-            </w:r>
-          </w:p>
-        </w:tc>
-        <w:tc>
-          <w:tcPr>
-            <w:tcW w:w="2835" w:type="dxa"/>
-            <w:tcBorders>
-              <w:top w:val="single" w:sz="6" w:space="0" w:color="DFE2E5"/>
-              <w:left w:val="single" w:sz="6" w:space="0" w:color="DFE2E5"/>
-              <w:bottom w:val="single" w:sz="6" w:space="0" w:color="DFE2E5"/>
-              <w:right w:val="single" w:sz="6" w:space="0" w:color="DFE2E5"/>
-            </w:tcBorders>
-            <w:shd w:val="clear" w:color="auto" w:fill="FFFFFF"/>
-            <w:tcMar>
-              <w:top w:w="90" w:type="dxa"/>
-              <w:left w:w="195" w:type="dxa"/>
-              <w:bottom w:w="90" w:type="dxa"/>
-              <w:right w:w="195" w:type="dxa"/>
-            </w:tcMar>
-            <w:vAlign w:val="center"/>
-            <w:hideMark/>
-          </w:tcPr>
-          <w:p>
-            <w:pPr>
-              <w:spacing w:after="240"/>
-              <w:rPr>
-                <w:rFonts w:cs="Calibri"/>
-                <w:color w:val="000000"/>
-                <w:spacing w:val="2"/>
-              </w:rPr>
-            </w:pPr>
-            <w:r>
-              <w:rPr>
-                <w:rFonts w:cs="Calibri"/>
-                <w:color w:val="000000"/>
-                <w:spacing w:val="2"/>
-              </w:rPr>
-              <w:t>1 (E)</w:t>
-            </w:r>
-          </w:p>
-        </w:tc>
-      </w:tr>
-      <w:tr>
-        <w:tc>
-          <w:tcPr>
-            <w:tcW w:w="2180" w:type="dxa"/>
-            <w:tcBorders>
-              <w:top w:val="single" w:sz="6" w:space="0" w:color="DFE2E5"/>
-              <w:left w:val="single" w:sz="6" w:space="0" w:color="DFE2E5"/>
-              <w:bottom w:val="single" w:sz="6" w:space="0" w:color="DFE2E5"/>
-              <w:right w:val="single" w:sz="6" w:space="0" w:color="DFE2E5"/>
-            </w:tcBorders>
-            <w:shd w:val="clear" w:color="auto" w:fill="F6F8FA"/>
-            <w:tcMar>
-              <w:top w:w="90" w:type="dxa"/>
-              <w:left w:w="195" w:type="dxa"/>
-              <w:bottom w:w="90" w:type="dxa"/>
-              <w:right w:w="195" w:type="dxa"/>
-            </w:tcMar>
-            <w:vAlign w:val="center"/>
-            <w:hideMark/>
-          </w:tcPr>
-          <w:p>
-            <w:pPr>
-              <w:spacing w:after="240"/>
-              <w:rPr>
-                <w:rFonts w:cs="Calibri"/>
-                <w:color w:val="000000"/>
-                <w:spacing w:val="2"/>
-              </w:rPr>
-            </w:pPr>
-            <w:r>
-              <w:rPr>
-                <w:rFonts w:cs="Calibri"/>
-                <w:color w:val="000000"/>
-                <w:spacing w:val="2"/>
-              </w:rPr>
-              <w:t>11</w:t>
-            </w:r>
-          </w:p>
-        </w:tc>
-        <w:tc>
-          <w:tcPr>
-            <w:tcW w:w="2977" w:type="dxa"/>
-            <w:tcBorders>
-              <w:top w:val="single" w:sz="6" w:space="0" w:color="DFE2E5"/>
-              <w:left w:val="single" w:sz="6" w:space="0" w:color="DFE2E5"/>
-              <w:bottom w:val="single" w:sz="6" w:space="0" w:color="DFE2E5"/>
-              <w:right w:val="single" w:sz="6" w:space="0" w:color="DFE2E5"/>
-            </w:tcBorders>
-            <w:shd w:val="clear" w:color="auto" w:fill="F6F8FA"/>
-            <w:tcMar>
-              <w:top w:w="90" w:type="dxa"/>
-              <w:left w:w="195" w:type="dxa"/>
-              <w:bottom w:w="90" w:type="dxa"/>
-              <w:right w:w="195" w:type="dxa"/>
-            </w:tcMar>
-            <w:vAlign w:val="center"/>
-            <w:hideMark/>
-          </w:tcPr>
-          <w:p>
-            <w:pPr>
-              <w:spacing w:after="240"/>
-              <w:rPr>
-                <w:rFonts w:cs="Calibri"/>
-                <w:color w:val="000000"/>
-                <w:spacing w:val="2"/>
-              </w:rPr>
-            </w:pPr>
-            <w:r>
-              <w:rPr>
-                <w:rFonts w:cs="Calibri"/>
-                <w:color w:val="000000"/>
-                <w:spacing w:val="2"/>
-              </w:rPr>
-              <w:t>7-Segment</w:t>
-            </w:r>
-          </w:p>
-        </w:tc>
-        <w:tc>
-          <w:tcPr>
-            <w:tcW w:w="2835" w:type="dxa"/>
-            <w:tcBorders>
-              <w:top w:val="single" w:sz="6" w:space="0" w:color="DFE2E5"/>
-              <w:left w:val="single" w:sz="6" w:space="0" w:color="DFE2E5"/>
-              <w:bottom w:val="single" w:sz="6" w:space="0" w:color="DFE2E5"/>
-              <w:right w:val="single" w:sz="6" w:space="0" w:color="DFE2E5"/>
-            </w:tcBorders>
-            <w:shd w:val="clear" w:color="auto" w:fill="F6F8FA"/>
-            <w:tcMar>
-              <w:top w:w="90" w:type="dxa"/>
-              <w:left w:w="195" w:type="dxa"/>
-              <w:bottom w:w="90" w:type="dxa"/>
-              <w:right w:w="195" w:type="dxa"/>
-            </w:tcMar>
-            <w:vAlign w:val="center"/>
-            <w:hideMark/>
-          </w:tcPr>
-          <w:p>
-            <w:pPr>
-              <w:spacing w:after="240"/>
-              <w:rPr>
-                <w:rFonts w:cs="Calibri"/>
-                <w:color w:val="000000"/>
-                <w:spacing w:val="2"/>
-              </w:rPr>
-            </w:pPr>
-            <w:r>
-              <w:rPr>
-                <w:rFonts w:cs="Calibri"/>
-                <w:color w:val="000000"/>
-                <w:spacing w:val="2"/>
-              </w:rPr>
-              <w:t>12 (F)</w:t>
-            </w:r>
-          </w:p>
-        </w:tc>
-      </w:tr>
-      <w:tr>
-        <w:tc>
-          <w:tcPr>
-            <w:tcW w:w="2180" w:type="dxa"/>
-            <w:tcBorders>
-              <w:top w:val="single" w:sz="6" w:space="0" w:color="DFE2E5"/>
-              <w:left w:val="single" w:sz="6" w:space="0" w:color="DFE2E5"/>
-              <w:bottom w:val="single" w:sz="6" w:space="0" w:color="DFE2E5"/>
-              <w:right w:val="single" w:sz="6" w:space="0" w:color="DFE2E5"/>
-            </w:tcBorders>
-            <w:shd w:val="clear" w:color="auto" w:fill="FFFFFF"/>
-            <w:tcMar>
-              <w:top w:w="90" w:type="dxa"/>
-              <w:left w:w="195" w:type="dxa"/>
-              <w:bottom w:w="90" w:type="dxa"/>
-              <w:right w:w="195" w:type="dxa"/>
-            </w:tcMar>
-            <w:vAlign w:val="center"/>
-            <w:hideMark/>
-          </w:tcPr>
-          <w:p>
-            <w:pPr>
-              <w:spacing w:after="240"/>
-              <w:rPr>
-                <w:rFonts w:cs="Calibri"/>
-                <w:color w:val="000000"/>
-                <w:spacing w:val="2"/>
-              </w:rPr>
-            </w:pPr>
-            <w:r>
-              <w:rPr>
-                <w:rFonts w:cs="Calibri"/>
-                <w:color w:val="000000"/>
-                <w:spacing w:val="2"/>
-              </w:rPr>
-              <w:t>12</w:t>
-            </w:r>
-          </w:p>
-        </w:tc>
-        <w:tc>
-          <w:tcPr>
-            <w:tcW w:w="2977" w:type="dxa"/>
-            <w:tcBorders>
-              <w:top w:val="single" w:sz="6" w:space="0" w:color="DFE2E5"/>
-              <w:left w:val="single" w:sz="6" w:space="0" w:color="DFE2E5"/>
-              <w:bottom w:val="single" w:sz="6" w:space="0" w:color="DFE2E5"/>
-              <w:right w:val="single" w:sz="6" w:space="0" w:color="DFE2E5"/>
-            </w:tcBorders>
-            <w:shd w:val="clear" w:color="auto" w:fill="FFFFFF"/>
-            <w:tcMar>
-              <w:top w:w="90" w:type="dxa"/>
-              <w:left w:w="195" w:type="dxa"/>
-              <w:bottom w:w="90" w:type="dxa"/>
-              <w:right w:w="195" w:type="dxa"/>
-            </w:tcMar>
-            <w:vAlign w:val="center"/>
-            <w:hideMark/>
-          </w:tcPr>
-          <w:p>
-            <w:pPr>
-              <w:spacing w:after="240"/>
-              <w:rPr>
-                <w:rFonts w:cs="Calibri"/>
-                <w:color w:val="000000"/>
-                <w:spacing w:val="2"/>
-              </w:rPr>
-            </w:pPr>
-            <w:r>
-              <w:rPr>
-                <w:rFonts w:cs="Calibri"/>
-                <w:color w:val="000000"/>
-                <w:spacing w:val="2"/>
-              </w:rPr>
-              <w:t>7-Segment</w:t>
-            </w:r>
-          </w:p>
-        </w:tc>
-        <w:tc>
-          <w:tcPr>
-            <w:tcW w:w="2835" w:type="dxa"/>
-            <w:tcBorders>
-              <w:top w:val="single" w:sz="6" w:space="0" w:color="DFE2E5"/>
-              <w:left w:val="single" w:sz="6" w:space="0" w:color="DFE2E5"/>
-              <w:bottom w:val="single" w:sz="6" w:space="0" w:color="DFE2E5"/>
-              <w:right w:val="single" w:sz="6" w:space="0" w:color="DFE2E5"/>
-            </w:tcBorders>
-            <w:shd w:val="clear" w:color="auto" w:fill="FFFFFF"/>
-            <w:tcMar>
-              <w:top w:w="90" w:type="dxa"/>
-              <w:left w:w="195" w:type="dxa"/>
-              <w:bottom w:w="90" w:type="dxa"/>
-              <w:right w:w="195" w:type="dxa"/>
-            </w:tcMar>
-            <w:vAlign w:val="center"/>
-            <w:hideMark/>
-          </w:tcPr>
-          <w:p>
-            <w:pPr>
-              <w:spacing w:after="240"/>
-              <w:rPr>
-                <w:rFonts w:cs="Calibri"/>
-                <w:color w:val="000000"/>
-                <w:spacing w:val="2"/>
-              </w:rPr>
-            </w:pPr>
-            <w:r>
-              <w:rPr>
-                <w:rFonts w:cs="Calibri"/>
-                <w:color w:val="000000"/>
-                <w:spacing w:val="2"/>
-              </w:rPr>
-              <w:t>5 (G)</w:t>
-            </w:r>
-          </w:p>
-        </w:tc>
-      </w:tr>
-      <w:tr>
-        <w:tc>
-          <w:tcPr>
-            <w:tcW w:w="2180" w:type="dxa"/>
-            <w:tcBorders>
-              <w:top w:val="single" w:sz="6" w:space="0" w:color="DFE2E5"/>
-              <w:left w:val="single" w:sz="6" w:space="0" w:color="DFE2E5"/>
-              <w:bottom w:val="single" w:sz="6" w:space="0" w:color="DFE2E5"/>
-              <w:right w:val="single" w:sz="6" w:space="0" w:color="DFE2E5"/>
-            </w:tcBorders>
-            <w:shd w:val="clear" w:color="auto" w:fill="F6F8FA"/>
-            <w:tcMar>
-              <w:top w:w="90" w:type="dxa"/>
-              <w:left w:w="195" w:type="dxa"/>
-              <w:bottom w:w="90" w:type="dxa"/>
-              <w:right w:w="195" w:type="dxa"/>
-            </w:tcMar>
-            <w:vAlign w:val="center"/>
-            <w:hideMark/>
-          </w:tcPr>
-          <w:p>
-            <w:pPr>
-              <w:spacing w:after="240"/>
-              <w:rPr>
-                <w:rFonts w:cs="Calibri"/>
-                <w:color w:val="000000"/>
-                <w:spacing w:val="2"/>
-              </w:rPr>
-            </w:pPr>
-            <w:r>
-              <w:rPr>
-                <w:rFonts w:cs="Calibri"/>
-                <w:color w:val="000000"/>
-                <w:spacing w:val="2"/>
-              </w:rPr>
-              <w:t>13</w:t>
-            </w:r>
-          </w:p>
-        </w:tc>
-        <w:tc>
-          <w:tcPr>
-            <w:tcW w:w="2977" w:type="dxa"/>
-            <w:tcBorders>
-              <w:top w:val="single" w:sz="6" w:space="0" w:color="DFE2E5"/>
-              <w:left w:val="single" w:sz="6" w:space="0" w:color="DFE2E5"/>
-              <w:bottom w:val="single" w:sz="6" w:space="0" w:color="DFE2E5"/>
-              <w:right w:val="single" w:sz="6" w:space="0" w:color="DFE2E5"/>
-            </w:tcBorders>
-            <w:shd w:val="clear" w:color="auto" w:fill="F6F8FA"/>
-            <w:tcMar>
-              <w:top w:w="90" w:type="dxa"/>
-              <w:left w:w="195" w:type="dxa"/>
-              <w:bottom w:w="90" w:type="dxa"/>
-              <w:right w:w="195" w:type="dxa"/>
-            </w:tcMar>
-            <w:vAlign w:val="center"/>
-            <w:hideMark/>
-          </w:tcPr>
-          <w:p>
-            <w:pPr>
-              <w:spacing w:after="240"/>
-              <w:rPr>
-                <w:rFonts w:cs="Calibri"/>
-                <w:color w:val="000000"/>
-                <w:spacing w:val="2"/>
-              </w:rPr>
-            </w:pPr>
-            <w:r>
-              <w:rPr>
-                <w:rFonts w:cs="Calibri"/>
-                <w:color w:val="000000"/>
-                <w:spacing w:val="2"/>
-              </w:rPr>
-              <w:t>7-Segment</w:t>
-            </w:r>
-          </w:p>
-        </w:tc>
-        <w:tc>
-          <w:tcPr>
-            <w:tcW w:w="2835" w:type="dxa"/>
-            <w:tcBorders>
-              <w:top w:val="single" w:sz="6" w:space="0" w:color="DFE2E5"/>
-              <w:left w:val="single" w:sz="6" w:space="0" w:color="DFE2E5"/>
-              <w:bottom w:val="single" w:sz="6" w:space="0" w:color="DFE2E5"/>
-              <w:right w:val="single" w:sz="6" w:space="0" w:color="DFE2E5"/>
-            </w:tcBorders>
-            <w:shd w:val="clear" w:color="auto" w:fill="F6F8FA"/>
-            <w:tcMar>
-              <w:top w:w="90" w:type="dxa"/>
-              <w:left w:w="195" w:type="dxa"/>
-              <w:bottom w:w="90" w:type="dxa"/>
-              <w:right w:w="195" w:type="dxa"/>
-            </w:tcMar>
-            <w:vAlign w:val="center"/>
-            <w:hideMark/>
-          </w:tcPr>
-          <w:p>
-            <w:pPr>
-              <w:spacing w:after="240"/>
-              <w:rPr>
-                <w:rFonts w:cs="Calibri"/>
-                <w:color w:val="000000"/>
-                <w:spacing w:val="2"/>
-              </w:rPr>
-            </w:pPr>
-            <w:r>
-              <w:rPr>
-                <w:rFonts w:cs="Calibri"/>
-                <w:color w:val="000000"/>
-                <w:spacing w:val="2"/>
-              </w:rPr>
-              <w:t>8 (Colon)</w:t>
-            </w:r>
-          </w:p>
-        </w:tc>
-      </w:tr>
-      <w:tr>
-        <w:tc>
-          <w:tcPr>
-            <w:tcW w:w="2180" w:type="dxa"/>
-            <w:tcBorders>
-              <w:top w:val="single" w:sz="6" w:space="0" w:color="DFE2E5"/>
-              <w:left w:val="single" w:sz="6" w:space="0" w:color="DFE2E5"/>
-              <w:bottom w:val="single" w:sz="6" w:space="0" w:color="DFE2E5"/>
-              <w:right w:val="single" w:sz="6" w:space="0" w:color="DFE2E5"/>
-            </w:tcBorders>
-            <w:shd w:val="clear" w:color="auto" w:fill="FFFFFF"/>
-            <w:tcMar>
-              <w:top w:w="90" w:type="dxa"/>
-              <w:left w:w="195" w:type="dxa"/>
-              <w:bottom w:w="90" w:type="dxa"/>
-              <w:right w:w="195" w:type="dxa"/>
-            </w:tcMar>
-            <w:vAlign w:val="center"/>
-            <w:hideMark/>
-          </w:tcPr>
-          <w:p>
-            <w:pPr>
-              <w:spacing w:after="240"/>
-              <w:rPr>
-                <w:rFonts w:cs="Calibri"/>
-                <w:color w:val="000000"/>
-                <w:spacing w:val="2"/>
-              </w:rPr>
-            </w:pPr>
-            <w:r>
-              <w:rPr>
-                <w:rFonts w:cs="Calibri"/>
-                <w:color w:val="000000"/>
-                <w:spacing w:val="2"/>
-              </w:rPr>
-              <w:t>A0</w:t>
-            </w:r>
-          </w:p>
-        </w:tc>
-        <w:tc>
-          <w:tcPr>
-            <w:tcW w:w="2977" w:type="dxa"/>
-            <w:tcBorders>
-              <w:top w:val="single" w:sz="6" w:space="0" w:color="DFE2E5"/>
-              <w:left w:val="single" w:sz="6" w:space="0" w:color="DFE2E5"/>
-              <w:bottom w:val="single" w:sz="6" w:space="0" w:color="DFE2E5"/>
-              <w:right w:val="single" w:sz="6" w:space="0" w:color="DFE2E5"/>
-            </w:tcBorders>
-            <w:shd w:val="clear" w:color="auto" w:fill="FFFFFF"/>
-            <w:tcMar>
-              <w:top w:w="90" w:type="dxa"/>
-              <w:left w:w="195" w:type="dxa"/>
-              <w:bottom w:w="90" w:type="dxa"/>
-              <w:right w:w="195" w:type="dxa"/>
-            </w:tcMar>
-            <w:vAlign w:val="center"/>
-            <w:hideMark/>
-          </w:tcPr>
-          <w:p>
-            <w:pPr>
-              <w:spacing w:after="240"/>
-              <w:rPr>
-                <w:rFonts w:cs="Calibri"/>
-                <w:color w:val="000000"/>
-                <w:spacing w:val="2"/>
-              </w:rPr>
-            </w:pPr>
-            <w:r>
-              <w:rPr>
-                <w:rFonts w:cs="Calibri"/>
-                <w:color w:val="000000"/>
-                <w:spacing w:val="2"/>
-              </w:rPr>
-              <w:t>Hour Button</w:t>
-            </w:r>
-          </w:p>
-        </w:tc>
-        <w:tc>
-          <w:tcPr>
-            <w:tcW w:w="2835" w:type="dxa"/>
-            <w:tcBorders>
-              <w:top w:val="single" w:sz="6" w:space="0" w:color="DFE2E5"/>
-              <w:left w:val="single" w:sz="6" w:space="0" w:color="DFE2E5"/>
-              <w:bottom w:val="single" w:sz="6" w:space="0" w:color="DFE2E5"/>
-              <w:right w:val="single" w:sz="6" w:space="0" w:color="DFE2E5"/>
-            </w:tcBorders>
-            <w:shd w:val="clear" w:color="auto" w:fill="FFFFFF"/>
-            <w:tcMar>
-              <w:top w:w="90" w:type="dxa"/>
-              <w:left w:w="195" w:type="dxa"/>
-              <w:bottom w:w="90" w:type="dxa"/>
-              <w:right w:w="195" w:type="dxa"/>
-            </w:tcMar>
-            <w:vAlign w:val="center"/>
-            <w:hideMark/>
-          </w:tcPr>
-          <w:p>
-            <w:pPr>
-              <w:spacing w:after="240"/>
-              <w:rPr>
-                <w:rFonts w:cs="Calibri"/>
-                <w:color w:val="000000"/>
-                <w:spacing w:val="2"/>
-              </w:rPr>
-            </w:pPr>
-            <w:r>
-              <w:rPr>
-                <w:rFonts w:cs="Calibri"/>
-                <w:color w:val="000000"/>
-                <w:spacing w:val="2"/>
-              </w:rPr>
-              <w:t>-</w:t>
-            </w:r>
-          </w:p>
-        </w:tc>
-      </w:tr>
-      <w:tr>
-        <w:tc>
-          <w:tcPr>
-            <w:tcW w:w="2180" w:type="dxa"/>
-            <w:tcBorders>
-              <w:top w:val="single" w:sz="6" w:space="0" w:color="DFE2E5"/>
-              <w:left w:val="single" w:sz="6" w:space="0" w:color="DFE2E5"/>
-              <w:bottom w:val="single" w:sz="6" w:space="0" w:color="DFE2E5"/>
-              <w:right w:val="single" w:sz="6" w:space="0" w:color="DFE2E5"/>
-            </w:tcBorders>
-            <w:shd w:val="clear" w:color="auto" w:fill="F6F8FA"/>
-            <w:tcMar>
-              <w:top w:w="90" w:type="dxa"/>
-              <w:left w:w="195" w:type="dxa"/>
-              <w:bottom w:w="90" w:type="dxa"/>
-              <w:right w:w="195" w:type="dxa"/>
-            </w:tcMar>
-            <w:vAlign w:val="center"/>
-            <w:hideMark/>
-          </w:tcPr>
-          <w:p>
-            <w:pPr>
-              <w:spacing w:after="240"/>
-              <w:rPr>
-                <w:rFonts w:cs="Calibri"/>
-                <w:color w:val="000000"/>
-                <w:spacing w:val="2"/>
-              </w:rPr>
-            </w:pPr>
-            <w:r>
-              <w:rPr>
-                <w:rFonts w:cs="Calibri"/>
-                <w:color w:val="000000"/>
-                <w:spacing w:val="2"/>
-              </w:rPr>
-              <w:t>A1</w:t>
-            </w:r>
-          </w:p>
-        </w:tc>
-        <w:tc>
-          <w:tcPr>
-            <w:tcW w:w="2977" w:type="dxa"/>
-            <w:tcBorders>
-              <w:top w:val="single" w:sz="6" w:space="0" w:color="DFE2E5"/>
-              <w:left w:val="single" w:sz="6" w:space="0" w:color="DFE2E5"/>
-              <w:bottom w:val="single" w:sz="6" w:space="0" w:color="DFE2E5"/>
-              <w:right w:val="single" w:sz="6" w:space="0" w:color="DFE2E5"/>
-            </w:tcBorders>
-            <w:shd w:val="clear" w:color="auto" w:fill="F6F8FA"/>
-            <w:tcMar>
-              <w:top w:w="90" w:type="dxa"/>
-              <w:left w:w="195" w:type="dxa"/>
-              <w:bottom w:w="90" w:type="dxa"/>
-              <w:right w:w="195" w:type="dxa"/>
-            </w:tcMar>
-            <w:vAlign w:val="center"/>
-            <w:hideMark/>
-          </w:tcPr>
-          <w:p>
-            <w:pPr>
-              <w:spacing w:after="240"/>
-              <w:rPr>
-                <w:rFonts w:cs="Calibri"/>
-                <w:color w:val="000000"/>
-                <w:spacing w:val="2"/>
-              </w:rPr>
-            </w:pPr>
-            <w:r>
-              <w:rPr>
-                <w:rFonts w:cs="Calibri"/>
-                <w:color w:val="000000"/>
-                <w:spacing w:val="2"/>
-              </w:rPr>
-              <w:t>Minute Button</w:t>
-            </w:r>
-          </w:p>
-        </w:tc>
-        <w:tc>
-          <w:tcPr>
-            <w:tcW w:w="2835" w:type="dxa"/>
-            <w:tcBorders>
-              <w:top w:val="single" w:sz="6" w:space="0" w:color="DFE2E5"/>
-              <w:left w:val="single" w:sz="6" w:space="0" w:color="DFE2E5"/>
-              <w:bottom w:val="single" w:sz="6" w:space="0" w:color="DFE2E5"/>
-              <w:right w:val="single" w:sz="6" w:space="0" w:color="DFE2E5"/>
-            </w:tcBorders>
-            <w:shd w:val="clear" w:color="auto" w:fill="F6F8FA"/>
-            <w:tcMar>
-              <w:top w:w="90" w:type="dxa"/>
-              <w:left w:w="195" w:type="dxa"/>
-              <w:bottom w:w="90" w:type="dxa"/>
-              <w:right w:w="195" w:type="dxa"/>
-            </w:tcMar>
-            <w:vAlign w:val="center"/>
-            <w:hideMark/>
-          </w:tcPr>
-          <w:p>
-            <w:pPr>
-              <w:spacing w:after="240"/>
-              <w:rPr>
-                <w:rFonts w:cs="Calibri"/>
-                <w:color w:val="000000"/>
-                <w:spacing w:val="2"/>
-              </w:rPr>
-            </w:pPr>
-            <w:r>
-              <w:rPr>
-                <w:rFonts w:cs="Calibri"/>
-                <w:color w:val="000000"/>
-                <w:spacing w:val="2"/>
-              </w:rPr>
-              <w:t>-</w:t>
-            </w:r>
-          </w:p>
-        </w:tc>
-      </w:tr>
-      <w:tr>
-        <w:tc>
-          <w:tcPr>
-            <w:tcW w:w="2180" w:type="dxa"/>
-            <w:tcBorders>
-              <w:top w:val="single" w:sz="6" w:space="0" w:color="DFE2E5"/>
-              <w:left w:val="single" w:sz="6" w:space="0" w:color="DFE2E5"/>
-              <w:bottom w:val="single" w:sz="6" w:space="0" w:color="DFE2E5"/>
-              <w:right w:val="single" w:sz="6" w:space="0" w:color="DFE2E5"/>
-            </w:tcBorders>
-            <w:shd w:val="clear" w:color="auto" w:fill="FFFFFF"/>
-            <w:tcMar>
-              <w:top w:w="90" w:type="dxa"/>
-              <w:left w:w="195" w:type="dxa"/>
-              <w:bottom w:w="90" w:type="dxa"/>
-              <w:right w:w="195" w:type="dxa"/>
-            </w:tcMar>
-            <w:vAlign w:val="center"/>
-            <w:hideMark/>
-          </w:tcPr>
-          <w:p>
-            <w:pPr>
-              <w:spacing w:after="240"/>
-              <w:rPr>
-                <w:rFonts w:cs="Calibri"/>
-                <w:color w:val="000000"/>
-                <w:spacing w:val="2"/>
-              </w:rPr>
-            </w:pPr>
-            <w:r>
-              <w:rPr>
-                <w:rFonts w:cs="Calibri"/>
-                <w:color w:val="000000"/>
-                <w:spacing w:val="2"/>
-              </w:rPr>
-              <w:t>A2</w:t>
-            </w:r>
-          </w:p>
-        </w:tc>
-        <w:tc>
-          <w:tcPr>
-            <w:tcW w:w="2977" w:type="dxa"/>
-            <w:tcBorders>
-              <w:top w:val="single" w:sz="6" w:space="0" w:color="DFE2E5"/>
-              <w:left w:val="single" w:sz="6" w:space="0" w:color="DFE2E5"/>
-              <w:bottom w:val="single" w:sz="6" w:space="0" w:color="DFE2E5"/>
-              <w:right w:val="single" w:sz="6" w:space="0" w:color="DFE2E5"/>
-            </w:tcBorders>
-            <w:shd w:val="clear" w:color="auto" w:fill="FFFFFF"/>
-            <w:tcMar>
-              <w:top w:w="90" w:type="dxa"/>
-              <w:left w:w="195" w:type="dxa"/>
-              <w:bottom w:w="90" w:type="dxa"/>
-              <w:right w:w="195" w:type="dxa"/>
-            </w:tcMar>
-            <w:vAlign w:val="center"/>
-            <w:hideMark/>
-          </w:tcPr>
-          <w:p>
-            <w:pPr>
-              <w:spacing w:after="240"/>
-              <w:rPr>
-                <w:rFonts w:cs="Calibri"/>
-                <w:color w:val="000000"/>
-                <w:spacing w:val="2"/>
-              </w:rPr>
-            </w:pPr>
-            <w:r>
-              <w:rPr>
-                <w:rFonts w:cs="Calibri"/>
-                <w:color w:val="000000"/>
-                <w:spacing w:val="2"/>
-              </w:rPr>
-              <w:t>Alarm Button</w:t>
-            </w:r>
-          </w:p>
-        </w:tc>
-        <w:tc>
-          <w:tcPr>
-            <w:tcW w:w="2835" w:type="dxa"/>
-            <w:tcBorders>
-              <w:top w:val="single" w:sz="6" w:space="0" w:color="DFE2E5"/>
-              <w:left w:val="single" w:sz="6" w:space="0" w:color="DFE2E5"/>
-              <w:bottom w:val="single" w:sz="6" w:space="0" w:color="DFE2E5"/>
-              <w:right w:val="single" w:sz="6" w:space="0" w:color="DFE2E5"/>
-            </w:tcBorders>
-            <w:shd w:val="clear" w:color="auto" w:fill="FFFFFF"/>
-            <w:tcMar>
-              <w:top w:w="90" w:type="dxa"/>
-              <w:left w:w="195" w:type="dxa"/>
-              <w:bottom w:w="90" w:type="dxa"/>
-              <w:right w:w="195" w:type="dxa"/>
-            </w:tcMar>
-            <w:vAlign w:val="center"/>
-            <w:hideMark/>
-          </w:tcPr>
-          <w:p>
-            <w:pPr>
-              <w:spacing w:after="240"/>
-              <w:rPr>
-                <w:rFonts w:cs="Calibri"/>
-                <w:color w:val="000000"/>
-                <w:spacing w:val="2"/>
-              </w:rPr>
-            </w:pPr>
-            <w:r>
-              <w:rPr>
-                <w:rFonts w:cs="Calibri"/>
-                <w:color w:val="000000"/>
-                <w:spacing w:val="2"/>
-              </w:rPr>
-              <w:t>-</w:t>
-            </w:r>
-          </w:p>
-        </w:tc>
-      </w:tr>
-      <w:tr>
-        <w:tc>
-          <w:tcPr>
-            <w:tcW w:w="2180" w:type="dxa"/>
-            <w:tcBorders>
-              <w:top w:val="single" w:sz="6" w:space="0" w:color="DFE2E5"/>
-              <w:left w:val="single" w:sz="6" w:space="0" w:color="DFE2E5"/>
-              <w:bottom w:val="single" w:sz="6" w:space="0" w:color="DFE2E5"/>
-              <w:right w:val="single" w:sz="6" w:space="0" w:color="DFE2E5"/>
-            </w:tcBorders>
-            <w:shd w:val="clear" w:color="auto" w:fill="F6F8FA"/>
-            <w:tcMar>
-              <w:top w:w="90" w:type="dxa"/>
-              <w:left w:w="195" w:type="dxa"/>
-              <w:bottom w:w="90" w:type="dxa"/>
-              <w:right w:w="195" w:type="dxa"/>
-            </w:tcMar>
-            <w:vAlign w:val="center"/>
-            <w:hideMark/>
-          </w:tcPr>
-          <w:p>
-            <w:pPr>
-              <w:spacing w:after="240"/>
-              <w:rPr>
-                <w:rFonts w:cs="Calibri"/>
-                <w:color w:val="000000"/>
-                <w:spacing w:val="2"/>
-              </w:rPr>
-            </w:pPr>
-            <w:r>
-              <w:rPr>
-                <w:rFonts w:cs="Calibri"/>
-                <w:color w:val="000000"/>
-                <w:spacing w:val="2"/>
-              </w:rPr>
-              <w:t>A3</w:t>
-            </w:r>
-          </w:p>
-        </w:tc>
-        <w:tc>
-          <w:tcPr>
-            <w:tcW w:w="2977" w:type="dxa"/>
-            <w:tcBorders>
-              <w:top w:val="single" w:sz="6" w:space="0" w:color="DFE2E5"/>
-              <w:left w:val="single" w:sz="6" w:space="0" w:color="DFE2E5"/>
-              <w:bottom w:val="single" w:sz="6" w:space="0" w:color="DFE2E5"/>
-              <w:right w:val="single" w:sz="6" w:space="0" w:color="DFE2E5"/>
-            </w:tcBorders>
-            <w:shd w:val="clear" w:color="auto" w:fill="F6F8FA"/>
-            <w:tcMar>
-              <w:top w:w="90" w:type="dxa"/>
-              <w:left w:w="195" w:type="dxa"/>
-              <w:bottom w:w="90" w:type="dxa"/>
-              <w:right w:w="195" w:type="dxa"/>
-            </w:tcMar>
-            <w:vAlign w:val="center"/>
-            <w:hideMark/>
-          </w:tcPr>
-          <w:p>
-            <w:pPr>
-              <w:spacing w:after="240"/>
-              <w:rPr>
-                <w:rFonts w:cs="Calibri"/>
-                <w:color w:val="000000"/>
-                <w:spacing w:val="2"/>
-              </w:rPr>
-            </w:pPr>
-            <w:r>
-              <w:rPr>
-                <w:rFonts w:cs="Calibri"/>
-                <w:color w:val="000000"/>
-                <w:spacing w:val="2"/>
-              </w:rPr>
-              <w:t>Buzzer / Speaker</w:t>
-            </w:r>
-          </w:p>
-        </w:tc>
-        <w:tc>
-          <w:tcPr>
-            <w:tcW w:w="2835" w:type="dxa"/>
-            <w:tcBorders>
-              <w:top w:val="single" w:sz="6" w:space="0" w:color="DFE2E5"/>
-              <w:left w:val="single" w:sz="6" w:space="0" w:color="DFE2E5"/>
-              <w:bottom w:val="single" w:sz="6" w:space="0" w:color="DFE2E5"/>
-              <w:right w:val="single" w:sz="6" w:space="0" w:color="DFE2E5"/>
-            </w:tcBorders>
-            <w:shd w:val="clear" w:color="auto" w:fill="F6F8FA"/>
-            <w:tcMar>
-              <w:top w:w="90" w:type="dxa"/>
-              <w:left w:w="195" w:type="dxa"/>
-              <w:bottom w:w="90" w:type="dxa"/>
-              <w:right w:w="195" w:type="dxa"/>
-            </w:tcMar>
-            <w:vAlign w:val="center"/>
-            <w:hideMark/>
-          </w:tcPr>
-          <w:p>
-            <w:pPr>
-              <w:spacing w:after="240"/>
-              <w:rPr>
-                <w:rFonts w:cs="Calibri"/>
-                <w:color w:val="000000"/>
-                <w:spacing w:val="2"/>
-              </w:rPr>
-            </w:pPr>
-            <w:r>
-              <w:rPr>
-                <w:rFonts w:cs="Calibri"/>
-                <w:color w:val="000000"/>
-                <w:spacing w:val="2"/>
-              </w:rPr>
-              <w:t>-</w:t>
-            </w:r>
-          </w:p>
-        </w:tc>
-      </w:tr>
-      <w:tr>
-        <w:tc>
-          <w:tcPr>
-            <w:tcW w:w="2180" w:type="dxa"/>
-            <w:tcBorders>
-              <w:top w:val="single" w:sz="6" w:space="0" w:color="DFE2E5"/>
-              <w:left w:val="single" w:sz="6" w:space="0" w:color="DFE2E5"/>
-              <w:bottom w:val="single" w:sz="6" w:space="0" w:color="DFE2E5"/>
-              <w:right w:val="single" w:sz="6" w:space="0" w:color="DFE2E5"/>
-            </w:tcBorders>
-            <w:shd w:val="clear" w:color="auto" w:fill="FFFFFF"/>
-            <w:tcMar>
-              <w:top w:w="90" w:type="dxa"/>
-              <w:left w:w="195" w:type="dxa"/>
-              <w:bottom w:w="90" w:type="dxa"/>
-              <w:right w:w="195" w:type="dxa"/>
-            </w:tcMar>
-            <w:vAlign w:val="center"/>
-            <w:hideMark/>
-          </w:tcPr>
-          <w:p>
-            <w:pPr>
-              <w:spacing w:after="240"/>
-              <w:rPr>
-                <w:rFonts w:cs="Calibri"/>
-                <w:color w:val="000000"/>
-                <w:spacing w:val="2"/>
-              </w:rPr>
-            </w:pPr>
-            <w:r>
-              <w:rPr>
-                <w:rFonts w:cs="Calibri"/>
-                <w:color w:val="000000"/>
-                <w:spacing w:val="2"/>
-              </w:rPr>
-              <w:t>A4</w:t>
-            </w:r>
-          </w:p>
-        </w:tc>
-        <w:tc>
-          <w:tcPr>
-            <w:tcW w:w="2977" w:type="dxa"/>
-            <w:tcBorders>
-              <w:top w:val="single" w:sz="6" w:space="0" w:color="DFE2E5"/>
-              <w:left w:val="single" w:sz="6" w:space="0" w:color="DFE2E5"/>
-              <w:bottom w:val="single" w:sz="6" w:space="0" w:color="DFE2E5"/>
-              <w:right w:val="single" w:sz="6" w:space="0" w:color="DFE2E5"/>
-            </w:tcBorders>
-            <w:shd w:val="clear" w:color="auto" w:fill="FFFFFF"/>
-            <w:tcMar>
-              <w:top w:w="90" w:type="dxa"/>
-              <w:left w:w="195" w:type="dxa"/>
-              <w:bottom w:w="90" w:type="dxa"/>
-              <w:right w:w="195" w:type="dxa"/>
-            </w:tcMar>
-            <w:vAlign w:val="center"/>
-            <w:hideMark/>
-          </w:tcPr>
-          <w:p>
-            <w:pPr>
-              <w:spacing w:after="240"/>
-              <w:rPr>
-                <w:rFonts w:cs="Calibri"/>
-                <w:color w:val="000000"/>
-                <w:spacing w:val="2"/>
-              </w:rPr>
-            </w:pPr>
-            <w:r>
-              <w:rPr>
-                <w:rFonts w:cs="Calibri"/>
-                <w:color w:val="000000"/>
-                <w:spacing w:val="2"/>
-              </w:rPr>
-              <w:t>DS1307 RTC</w:t>
-            </w:r>
-          </w:p>
-        </w:tc>
-        <w:tc>
-          <w:tcPr>
-            <w:tcW w:w="2835" w:type="dxa"/>
-            <w:tcBorders>
-              <w:top w:val="single" w:sz="6" w:space="0" w:color="DFE2E5"/>
-              <w:left w:val="single" w:sz="6" w:space="0" w:color="DFE2E5"/>
-              <w:bottom w:val="single" w:sz="6" w:space="0" w:color="DFE2E5"/>
-              <w:right w:val="single" w:sz="6" w:space="0" w:color="DFE2E5"/>
-            </w:tcBorders>
-            <w:shd w:val="clear" w:color="auto" w:fill="FFFFFF"/>
-            <w:tcMar>
-              <w:top w:w="90" w:type="dxa"/>
-              <w:left w:w="195" w:type="dxa"/>
-              <w:bottom w:w="90" w:type="dxa"/>
-              <w:right w:w="195" w:type="dxa"/>
-            </w:tcMar>
-            <w:vAlign w:val="center"/>
-            <w:hideMark/>
-          </w:tcPr>
-          <w:p>
-            <w:pPr>
-              <w:spacing w:after="240"/>
-              <w:rPr>
-                <w:rFonts w:cs="Calibri"/>
-                <w:color w:val="000000"/>
-                <w:spacing w:val="2"/>
-              </w:rPr>
-            </w:pPr>
-            <w:r>
-              <w:rPr>
-                <w:rFonts w:cs="Calibri"/>
-                <w:color w:val="000000"/>
-                <w:spacing w:val="2"/>
-              </w:rPr>
-              <w:t>SDA</w:t>
-            </w:r>
-          </w:p>
-        </w:tc>
-      </w:tr>
-      <w:tr>
-        <w:tc>
-          <w:tcPr>
-            <w:tcW w:w="2180" w:type="dxa"/>
-            <w:tcBorders>
-              <w:top w:val="single" w:sz="6" w:space="0" w:color="DFE2E5"/>
-              <w:left w:val="single" w:sz="6" w:space="0" w:color="DFE2E5"/>
-              <w:bottom w:val="single" w:sz="6" w:space="0" w:color="DFE2E5"/>
-              <w:right w:val="single" w:sz="6" w:space="0" w:color="DFE2E5"/>
-            </w:tcBorders>
-            <w:shd w:val="clear" w:color="auto" w:fill="F6F8FA"/>
-            <w:tcMar>
-              <w:top w:w="90" w:type="dxa"/>
-              <w:left w:w="195" w:type="dxa"/>
-              <w:bottom w:w="90" w:type="dxa"/>
-              <w:right w:w="195" w:type="dxa"/>
-            </w:tcMar>
-            <w:vAlign w:val="center"/>
-            <w:hideMark/>
-          </w:tcPr>
-          <w:p>
-            <w:pPr>
-              <w:spacing w:after="240"/>
-              <w:rPr>
-                <w:rFonts w:cs="Calibri"/>
-                <w:color w:val="000000"/>
-                <w:spacing w:val="2"/>
-              </w:rPr>
-            </w:pPr>
-            <w:r>
-              <w:rPr>
-                <w:rFonts w:cs="Calibri"/>
-                <w:color w:val="000000"/>
-                <w:spacing w:val="2"/>
-              </w:rPr>
-              <w:lastRenderedPageBreak/>
-              <w:t>A5</w:t>
-            </w:r>
-          </w:p>
-        </w:tc>
-        <w:tc>
-          <w:tcPr>
-            <w:tcW w:w="2977" w:type="dxa"/>
-            <w:tcBorders>
-              <w:top w:val="single" w:sz="6" w:space="0" w:color="DFE2E5"/>
-              <w:left w:val="single" w:sz="6" w:space="0" w:color="DFE2E5"/>
-              <w:bottom w:val="single" w:sz="6" w:space="0" w:color="DFE2E5"/>
-              <w:right w:val="single" w:sz="6" w:space="0" w:color="DFE2E5"/>
-            </w:tcBorders>
-            <w:shd w:val="clear" w:color="auto" w:fill="F6F8FA"/>
-            <w:tcMar>
-              <w:top w:w="90" w:type="dxa"/>
-              <w:left w:w="195" w:type="dxa"/>
-              <w:bottom w:w="90" w:type="dxa"/>
-              <w:right w:w="195" w:type="dxa"/>
-            </w:tcMar>
-            <w:vAlign w:val="center"/>
-            <w:hideMark/>
-          </w:tcPr>
-          <w:p>
-            <w:pPr>
-              <w:spacing w:after="240"/>
-              <w:rPr>
-                <w:rFonts w:cs="Calibri"/>
-                <w:color w:val="000000"/>
-                <w:spacing w:val="2"/>
-              </w:rPr>
-            </w:pPr>
-            <w:r>
-              <w:rPr>
-                <w:rFonts w:cs="Calibri"/>
-                <w:color w:val="000000"/>
-                <w:spacing w:val="2"/>
-              </w:rPr>
-              <w:t>DS1307 RTC</w:t>
-            </w:r>
-          </w:p>
-        </w:tc>
-        <w:tc>
-          <w:tcPr>
-            <w:tcW w:w="2835" w:type="dxa"/>
-            <w:tcBorders>
-              <w:top w:val="single" w:sz="6" w:space="0" w:color="DFE2E5"/>
-              <w:left w:val="single" w:sz="6" w:space="0" w:color="DFE2E5"/>
-              <w:bottom w:val="single" w:sz="6" w:space="0" w:color="DFE2E5"/>
-              <w:right w:val="single" w:sz="6" w:space="0" w:color="DFE2E5"/>
-            </w:tcBorders>
-            <w:shd w:val="clear" w:color="auto" w:fill="F6F8FA"/>
-            <w:tcMar>
-              <w:top w:w="90" w:type="dxa"/>
-              <w:left w:w="195" w:type="dxa"/>
-              <w:bottom w:w="90" w:type="dxa"/>
-              <w:right w:w="195" w:type="dxa"/>
-            </w:tcMar>
-            <w:vAlign w:val="center"/>
-            <w:hideMark/>
-          </w:tcPr>
-          <w:p>
-            <w:pPr>
-              <w:spacing w:after="240"/>
-              <w:rPr>
-                <w:rFonts w:cs="Calibri"/>
-                <w:color w:val="000000"/>
-                <w:spacing w:val="2"/>
-              </w:rPr>
-            </w:pPr>
-            <w:r>
-              <w:rPr>
-                <w:rFonts w:cs="Calibri"/>
-                <w:color w:val="000000"/>
-                <w:spacing w:val="2"/>
-              </w:rPr>
-              <w:t>SCL</w:t>
+              <w:t>Red</w:t>
             </w:r>
           </w:p>
         </w:tc>
@@ -4239,6 +3071,7 @@
         <w:rPr>
           <w:lang w:val="en-GB"/>
         </w:rPr>
+        <w:lastRenderedPageBreak/>
         <w:t>Reflection</w:t>
       </w:r>
     </w:p>
@@ -5260,6 +4093,18 @@
       <w:lang w:eastAsia="en-US"/>
     </w:rPr>
   </w:style>
+  <w:style w:type="character" w:styleId="FollowedHyperlink">
+    <w:name w:val="FollowedHyperlink"/>
+    <w:basedOn w:val="DefaultParagraphFont"/>
+    <w:uiPriority w:val="99"/>
+    <w:semiHidden/>
+    <w:unhideWhenUsed/>
+    <w:rsid w:val="00F1394B"/>
+    <w:rPr>
+      <w:color w:val="954F72" w:themeColor="followedHyperlink"/>
+      <w:u w:val="single"/>
+    </w:rPr>
+  </w:style>
 </w:styles>
 </file>
 
@@ -5559,10 +4404,6 @@
 </file>
 
 <file path=customXml/item1.xml><?xml version="1.0" encoding="utf-8"?>
-<b:Sources xmlns:b="http://schemas.openxmlformats.org/officeDocument/2006/bibliography" xmlns="http://schemas.openxmlformats.org/officeDocument/2006/bibliography" SelectedStyle="\HarvardAnglia2008OfficeOnline.xsl" StyleName="Harvard – Anglia 2008"/>
-</file>
-
-<file path=customXml/item2.xml><?xml version="1.0" encoding="utf-8"?>
 <p:properties xmlns:p="http://schemas.microsoft.com/office/2006/metadata/properties" xmlns:xsi="http://www.w3.org/2001/XMLSchema-instance" xmlns:pc="http://schemas.microsoft.com/office/infopath/2007/PartnerControls">
   <documentManagement>
     <lcf76f155ced4ddcb4097134ff3c332f xmlns="e7d6067d-bc6e-4f84-b586-3469bc701aa9">
@@ -5573,7 +4414,20 @@
 </p:properties>
 </file>
 
+<file path=customXml/item2.xml><?xml version="1.0" encoding="utf-8"?>
+<b:Sources xmlns:b="http://schemas.openxmlformats.org/officeDocument/2006/bibliography" xmlns="http://schemas.openxmlformats.org/officeDocument/2006/bibliography" SelectedStyle="\HarvardAnglia2008OfficeOnline.xsl" StyleName="Harvard – Anglia 2008"/>
+</file>
+
 <file path=customXml/item3.xml><?xml version="1.0" encoding="utf-8"?>
+<?mso-contentType ?>
+<FormTemplates xmlns="http://schemas.microsoft.com/sharepoint/v3/contenttype/forms">
+  <Display>DocumentLibraryForm</Display>
+  <Edit>DocumentLibraryForm</Edit>
+  <New>DocumentLibraryForm</New>
+</FormTemplates>
+</file>
+
+<file path=customXml/item4.xml><?xml version="1.0" encoding="utf-8"?>
 <ct:contentTypeSchema xmlns:ct="http://schemas.microsoft.com/office/2006/metadata/contentType" xmlns:ma="http://schemas.microsoft.com/office/2006/metadata/properties/metaAttributes" ct:_="" ma:_="" ma:contentTypeName="Document" ma:contentTypeID="0x010100ACCA975F8D0D5746984DB0EB9F8E158E" ma:contentTypeVersion="9" ma:contentTypeDescription="Create a new document." ma:contentTypeScope="" ma:versionID="9e878cca08fb2ba6f2f3d5d4bfc6d679">
   <xsd:schema xmlns:xsd="http://www.w3.org/2001/XMLSchema" xmlns:xs="http://www.w3.org/2001/XMLSchema" xmlns:p="http://schemas.microsoft.com/office/2006/metadata/properties" xmlns:ns2="e7d6067d-bc6e-4f84-b586-3469bc701aa9" xmlns:ns3="fd9f5c74-e2a0-45b3-9622-3259d29162da" targetNamespace="http://schemas.microsoft.com/office/2006/metadata/properties" ma:root="true" ma:fieldsID="1c5c9a3537fac3b313b835e7731d6036" ns2:_="" ns3:_="">
     <xsd:import namespace="e7d6067d-bc6e-4f84-b586-3469bc701aa9"/>
@@ -5754,24 +4608,7 @@
 </ct:contentTypeSchema>
 </file>
 
-<file path=customXml/item4.xml><?xml version="1.0" encoding="utf-8"?>
-<?mso-contentType ?>
-<FormTemplates xmlns="http://schemas.microsoft.com/sharepoint/v3/contenttype/forms">
-  <Display>DocumentLibraryForm</Display>
-  <Edit>DocumentLibraryForm</Edit>
-  <New>DocumentLibraryForm</New>
-</FormTemplates>
-</file>
-
 <file path=customXml/itemProps1.xml><?xml version="1.0" encoding="utf-8"?>
-<ds:datastoreItem xmlns:ds="http://schemas.openxmlformats.org/officeDocument/2006/customXml" ds:itemID="{79D91E43-2625-4669-B221-6762C448E6C6}">
-  <ds:schemaRefs>
-    <ds:schemaRef ds:uri="http://schemas.openxmlformats.org/officeDocument/2006/bibliography"/>
-  </ds:schemaRefs>
-</ds:datastoreItem>
-</file>
-
-<file path=customXml/itemProps2.xml><?xml version="1.0" encoding="utf-8"?>
 <ds:datastoreItem xmlns:ds="http://schemas.openxmlformats.org/officeDocument/2006/customXml" ds:itemID="{04511DF0-BEF7-49A8-9761-2E82C4E3AAF3}">
   <ds:schemaRefs>
     <ds:schemaRef ds:uri="http://schemas.microsoft.com/office/2006/metadata/properties"/>
@@ -5782,7 +4619,23 @@
 </ds:datastoreItem>
 </file>
 
+<file path=customXml/itemProps2.xml><?xml version="1.0" encoding="utf-8"?>
+<ds:datastoreItem xmlns:ds="http://schemas.openxmlformats.org/officeDocument/2006/customXml" ds:itemID="{79D91E43-2625-4669-B221-6762C448E6C6}">
+  <ds:schemaRefs>
+    <ds:schemaRef ds:uri="http://schemas.openxmlformats.org/officeDocument/2006/bibliography"/>
+  </ds:schemaRefs>
+</ds:datastoreItem>
+</file>
+
 <file path=customXml/itemProps3.xml><?xml version="1.0" encoding="utf-8"?>
+<ds:datastoreItem xmlns:ds="http://schemas.openxmlformats.org/officeDocument/2006/customXml" ds:itemID="{37B8B796-B504-47D4-A4B6-F42D797F5D90}">
+  <ds:schemaRefs>
+    <ds:schemaRef ds:uri="http://schemas.microsoft.com/sharepoint/v3/contenttype/forms"/>
+  </ds:schemaRefs>
+</ds:datastoreItem>
+</file>
+
+<file path=customXml/itemProps4.xml><?xml version="1.0" encoding="utf-8"?>
 <ds:datastoreItem xmlns:ds="http://schemas.openxmlformats.org/officeDocument/2006/customXml" ds:itemID="{EDC293C0-468E-449F-B9BA-414800CA2CBC}">
   <ds:schemaRefs>
     <ds:schemaRef ds:uri="http://schemas.microsoft.com/office/2006/metadata/contentType"/>
@@ -5799,12 +4652,4 @@
     <ds:schemaRef ds:uri="http://schemas.microsoft.com/internal/obd"/>
   </ds:schemaRefs>
 </ds:datastoreItem>
-</file>
-
-<file path=customXml/itemProps4.xml><?xml version="1.0" encoding="utf-8"?>
-<ds:datastoreItem xmlns:ds="http://schemas.openxmlformats.org/officeDocument/2006/customXml" ds:itemID="{37B8B796-B504-47D4-A4B6-F42D797F5D90}">
-  <ds:schemaRefs>
-    <ds:schemaRef ds:uri="http://schemas.microsoft.com/sharepoint/v3/contenttype/forms"/>
-  </ds:schemaRefs>
-</ds:datastoreItem>
 </file>
</xml_diff>

<commit_message>
renamed some of the word docs so that it's more clear. refactored some code. i think it's fully ready now. did more of the report, now on the bit where you explain the code. once i do that it's just user testing and reflection.
</commit_message>
<xml_diff>
--- a/physical_interaction_CA2_Report.docx
+++ b/physical_interaction_CA2_Report.docx
@@ -210,7 +210,13 @@
               <w:rPr>
                 <w:lang w:val="en-GB"/>
               </w:rPr>
-              <w:t>01</w:t>
+              <w:t>0</w:t>
+            </w:r>
+            <w:r>
+              <w:rPr>
+                <w:lang w:val="en-GB"/>
+              </w:rPr>
+              <w:t>2</w:t>
             </w:r>
             <w:r>
               <w:rPr>
@@ -276,25 +282,177 @@
         <w:rPr>
           <w:lang w:val="en-GB"/>
         </w:rPr>
-        <w:t>A brief description of your project goes here. Explain its purpose and sensor input and desired output. Mention the tutorials or references [</w:t>
-      </w:r>
-      <w:r>
-        <w:rPr>
-          <w:lang w:val="en-GB"/>
-        </w:rPr>
-        <w:t>1</w:t>
-      </w:r>
-      <w:r>
-        <w:rPr>
-          <w:lang w:val="en-GB"/>
-        </w:rPr>
-        <w:t>] that you have used. List these in the reference section</w:t>
+        <w:t>This project is an alternate controller for the browser driving game Slow Roads [1]</w:t>
       </w:r>
       <w:r>
         <w:rPr>
           <w:lang w:val="en-GB"/>
         </w:rPr>
         <w:t>.</w:t>
+      </w:r>
+      <w:r>
+        <w:rPr>
+          <w:lang w:val="en-GB"/>
+        </w:rPr>
+        <w:t xml:space="preserve"> Instead</w:t>
+      </w:r>
+      <w:r>
+        <w:rPr>
+          <w:lang w:val="en-GB"/>
+        </w:rPr>
+        <w:t xml:space="preserve"> of using the keyboard to steer</w:t>
+      </w:r>
+      <w:r>
+        <w:rPr>
+          <w:lang w:val="en-GB"/>
+        </w:rPr>
+        <w:t xml:space="preserve">, the player steers by </w:t>
+      </w:r>
+      <w:r>
+        <w:rPr>
+          <w:lang w:val="en-GB"/>
+        </w:rPr>
+        <w:t xml:space="preserve">holding out their arm and pointing in the direction they want to steer. </w:t>
+      </w:r>
+      <w:r>
+        <w:rPr>
+          <w:lang w:val="en-GB"/>
+        </w:rPr>
+        <w:t>A</w:t>
+      </w:r>
+      <w:r>
+        <w:rPr>
+          <w:lang w:val="en-GB"/>
+        </w:rPr>
+        <w:t xml:space="preserve"> HC-SR04 ultrasonic sensor </w:t>
+      </w:r>
+      <w:r>
+        <w:rPr>
+          <w:lang w:val="en-GB"/>
+        </w:rPr>
+        <w:t>measures the distance from itself to the player’s arm</w:t>
+      </w:r>
+      <w:r>
+        <w:rPr>
+          <w:lang w:val="en-GB"/>
+        </w:rPr>
+        <w:t xml:space="preserve">. The distance </w:t>
+      </w:r>
+      <w:r>
+        <w:rPr>
+          <w:lang w:val="en-GB"/>
+        </w:rPr>
+        <w:t xml:space="preserve">is </w:t>
+      </w:r>
+      <w:r>
+        <w:rPr>
+          <w:lang w:val="en-GB"/>
+        </w:rPr>
+        <w:t xml:space="preserve">then </w:t>
+      </w:r>
+      <w:r>
+        <w:rPr>
+          <w:lang w:val="en-GB"/>
+        </w:rPr>
+        <w:t>converted into a steering direction by</w:t>
+      </w:r>
+      <w:r>
+        <w:rPr>
+          <w:lang w:val="en-GB"/>
+        </w:rPr>
+        <w:t xml:space="preserve"> the code on the Arduino Leonardo</w:t>
+      </w:r>
+      <w:r>
+        <w:rPr>
+          <w:lang w:val="en-GB"/>
+        </w:rPr>
+        <w:t>.</w:t>
+      </w:r>
+      <w:r>
+        <w:rPr>
+          <w:lang w:val="en-GB"/>
+        </w:rPr>
+        <w:t xml:space="preserve"> </w:t>
+      </w:r>
+    </w:p>
+    <w:p>
+      <w:pPr>
+        <w:rPr>
+          <w:lang w:val="en-GB"/>
+        </w:rPr>
+      </w:pPr>
+      <w:r>
+        <w:rPr>
+          <w:lang w:val="en-GB"/>
+        </w:rPr>
+        <w:t>Three buttons handle the</w:t>
+      </w:r>
+      <w:r>
+        <w:rPr>
+          <w:lang w:val="en-GB"/>
+        </w:rPr>
+        <w:t xml:space="preserve"> remaining</w:t>
+      </w:r>
+      <w:r>
+        <w:rPr>
+          <w:lang w:val="en-GB"/>
+        </w:rPr>
+        <w:t xml:space="preserve"> controls</w:t>
+      </w:r>
+      <w:r>
+        <w:rPr>
+          <w:lang w:val="en-GB"/>
+        </w:rPr>
+        <w:t xml:space="preserve"> by emulating keyboard presses</w:t>
+      </w:r>
+      <w:r>
+        <w:rPr>
+          <w:lang w:val="en-GB"/>
+        </w:rPr>
+        <w:t>:</w:t>
+      </w:r>
+      <w:r>
+        <w:rPr>
+          <w:lang w:val="en-GB"/>
+        </w:rPr>
+        <w:t xml:space="preserve"> </w:t>
+      </w:r>
+      <w:r>
+        <w:rPr>
+          <w:lang w:val="en-GB"/>
+        </w:rPr>
+        <w:t xml:space="preserve">W to accelerate, S to reverse/brake, and R to reset the car onto the road. </w:t>
+      </w:r>
+    </w:p>
+    <w:p>
+      <w:pPr>
+        <w:rPr>
+          <w:lang w:val="en-GB"/>
+        </w:rPr>
+      </w:pPr>
+      <w:r>
+        <w:rPr>
+          <w:lang w:val="en-GB"/>
+        </w:rPr>
+        <w:t>A fourth button toggles a safety that disables all other controls. The safety state is shown by an RGB LED: red means the safety is on and the controls are disabled,</w:t>
+      </w:r>
+      <w:r>
+        <w:rPr>
+          <w:lang w:val="en-GB"/>
+        </w:rPr>
+        <w:t xml:space="preserve"> and</w:t>
+      </w:r>
+      <w:r>
+        <w:rPr>
+          <w:lang w:val="en-GB"/>
+        </w:rPr>
+        <w:t xml:space="preserve"> green means the safety is off and the controls are enabled.</w:t>
+      </w:r>
+      <w:r>
+        <w:rPr>
+          <w:lang w:val="en-GB"/>
+        </w:rPr>
+        <w:t xml:space="preserve"> </w:t>
       </w:r>
     </w:p>
     <w:p>
@@ -323,6 +481,18 @@
           <w:lang w:val="en-GB"/>
         </w:rPr>
       </w:pPr>
+      <w:r>
+        <w:rPr>
+          <w:lang w:val="en-GB"/>
+        </w:rPr>
+        <w:t xml:space="preserve">Place the alternate controller on the table in front of you, slightly to the right, where a computer mouse would be. Ensure that the ultrasonic sensor is aiming to the left. </w:t>
+      </w:r>
+      <w:r>
+        <w:rPr>
+          <w:lang w:val="en-GB"/>
+        </w:rPr>
+        <w:t xml:space="preserve">Plug the Leonardo into the computer and open Slow Roads. </w:t>
+      </w:r>
     </w:p>
     <w:p>
       <w:pPr>
@@ -334,7 +504,105 @@
         <w:rPr>
           <w:lang w:val="en-GB"/>
         </w:rPr>
-        <w:t xml:space="preserve">Describe how to interact with the hardware and software interfaces of the system. Describe the expected behaviour of the system for given sensor readings. </w:t>
+        <w:t>The safety is on by default, so the light</w:t>
+      </w:r>
+      <w:r>
+        <w:rPr>
+          <w:lang w:val="en-GB"/>
+        </w:rPr>
+        <w:t xml:space="preserve"> from the RGB LED</w:t>
+      </w:r>
+      <w:r>
+        <w:rPr>
+          <w:lang w:val="en-GB"/>
+        </w:rPr>
+        <w:t xml:space="preserve"> will be red. When you are ready to play the game, press the button beside the RGB LED to</w:t>
+      </w:r>
+      <w:r>
+        <w:rPr>
+          <w:lang w:val="en-GB"/>
+        </w:rPr>
+        <w:t xml:space="preserve"> toggle</w:t>
+      </w:r>
+      <w:r>
+        <w:rPr>
+          <w:lang w:val="en-GB"/>
+        </w:rPr>
+        <w:t xml:space="preserve"> the safety. Hold your arm in front of the ultrasonic sensor to steer the car. The closer your arm is to the sensor, the more the car will turn right</w:t>
+      </w:r>
+      <w:r>
+        <w:rPr>
+          <w:lang w:val="en-GB"/>
+        </w:rPr>
+        <w:t xml:space="preserve">. </w:t>
+      </w:r>
+      <w:r>
+        <w:rPr>
+          <w:lang w:val="en-GB"/>
+        </w:rPr>
+        <w:t>T</w:t>
+      </w:r>
+      <w:r>
+        <w:rPr>
+          <w:lang w:val="en-GB"/>
+        </w:rPr>
+        <w:t xml:space="preserve">he further away your arm is, the more the car will turn left. </w:t>
+      </w:r>
+    </w:p>
+    <w:p>
+      <w:pPr>
+        <w:rPr>
+          <w:lang w:val="en-GB"/>
+        </w:rPr>
+      </w:pPr>
+      <w:r>
+        <w:rPr>
+          <w:lang w:val="en-GB"/>
+        </w:rPr>
+        <w:t>To accelerate</w:t>
+      </w:r>
+      <w:r>
+        <w:rPr>
+          <w:lang w:val="en-GB"/>
+        </w:rPr>
+        <w:t xml:space="preserve">, brake, or reset the car back onto the road, press and hold the corresponding button. The accelerate and brake buttons are right beside each other, on the same breadboard as the safety button. The accelerate button is closer to the safety button than the brake button. The button to reset the car back onto the road is the button on the same breadboard as the ultrasonic sensor. </w:t>
+      </w:r>
+    </w:p>
+    <w:p>
+      <w:pPr>
+        <w:rPr>
+          <w:lang w:val="en-GB"/>
+        </w:rPr>
+      </w:pPr>
+      <w:r>
+        <w:rPr>
+          <w:lang w:val="en-GB"/>
+        </w:rPr>
+        <w:t xml:space="preserve">To turn on/off the light from the RGB LED that shows the safety state, hold down the safety button for one second. Doing this does not change the safety state, </w:t>
+      </w:r>
+      <w:r>
+        <w:rPr>
+          <w:lang w:val="en-GB"/>
+        </w:rPr>
+        <w:t xml:space="preserve">and the </w:t>
+      </w:r>
+      <w:r>
+        <w:rPr>
+          <w:lang w:val="en-GB"/>
+        </w:rPr>
+        <w:t>safety button</w:t>
+      </w:r>
+      <w:r>
+        <w:rPr>
+          <w:lang w:val="en-GB"/>
+        </w:rPr>
+        <w:t xml:space="preserve"> still works while the light is off</w:t>
+      </w:r>
+      <w:r>
+        <w:rPr>
+          <w:lang w:val="en-GB"/>
+        </w:rPr>
+        <w:t xml:space="preserve">. </w:t>
       </w:r>
     </w:p>
     <w:p>
@@ -349,26 +617,6 @@
           <w:lang w:val="en-GB"/>
         </w:rPr>
         <w:t>Hardware</w:t>
-      </w:r>
-    </w:p>
-    <w:p>
-      <w:pPr>
-        <w:rPr>
-          <w:lang w:val="en-GB"/>
-        </w:rPr>
-      </w:pPr>
-    </w:p>
-    <w:p>
-      <w:pPr>
-        <w:rPr>
-          <w:lang w:val="en-GB"/>
-        </w:rPr>
-      </w:pPr>
-      <w:r>
-        <w:rPr>
-          <w:lang w:val="en-GB"/>
-        </w:rPr>
-        <w:t>Include a bill of materials used in the build of the project, such as:</w:t>
       </w:r>
     </w:p>
     <w:tbl>
@@ -686,6 +934,7 @@
                 <w:spacing w:val="2"/>
                 <w:lang w:eastAsia="en-IE"/>
               </w:rPr>
+              <w:lastRenderedPageBreak/>
               <w:t>HC-SR04 Ultrasonic Sensor</w:t>
             </w:r>
             <w:r>
@@ -1370,17 +1619,7 @@
                 <w:spacing w:val="2"/>
                 <w:lang w:eastAsia="en-IE"/>
               </w:rPr>
-              <w:t xml:space="preserve"> ‘W’ for accelerating the car forward, ‘S’ </w:t>
-            </w:r>
-            <w:r>
-              <w:rPr>
-                <w:rFonts w:ascii="Cambria" w:eastAsia="Times New Roman" w:hAnsi="Cambria" w:cs="Segoe UI"/>
-                <w:color w:val="000000"/>
-                <w:spacing w:val="2"/>
-                <w:lang w:eastAsia="en-IE"/>
-              </w:rPr>
-              <w:lastRenderedPageBreak/>
-              <w:t xml:space="preserve">for reversing/braking, </w:t>
+              <w:t xml:space="preserve"> ‘W’ for accelerating the car forward, ‘S’ for reversing/braking, </w:t>
             </w:r>
             <w:r>
               <w:rPr>
@@ -1561,6 +1800,7 @@
               <w:rPr>
                 <w:noProof/>
               </w:rPr>
+              <w:lastRenderedPageBreak/>
               <w:drawing>
                 <wp:inline distT="0" distB="0" distL="0" distR="0" wp14:anchorId="7D551F5F" wp14:editId="29D022C1">
                   <wp:extent cx="5455544" cy="2868603"/>
@@ -1634,50 +1874,6 @@
           <w:lang w:val="en-GB"/>
         </w:rPr>
       </w:pPr>
-      <w:r>
-        <w:rPr>
-          <w:lang w:val="en-GB"/>
-        </w:rPr>
-        <w:br/>
-      </w:r>
-      <w:r>
-        <w:rPr>
-          <w:lang w:val="en-GB"/>
-        </w:rPr>
-        <w:t>Include a d</w:t>
-      </w:r>
-      <w:r>
-        <w:rPr>
-          <w:lang w:val="en-GB"/>
-        </w:rPr>
-        <w:t>iagram/Schematic of your project here. Also include relevant information</w:t>
-      </w:r>
-      <w:r>
-        <w:rPr>
-          <w:lang w:val="en-GB"/>
-        </w:rPr>
-        <w:t xml:space="preserve"> </w:t>
-      </w:r>
-      <w:r>
-        <w:rPr>
-          <w:lang w:val="en-GB"/>
-        </w:rPr>
-        <w:t>about type of sensors. What voltage they are producing based on which environmental input. You could refer to their respective datasheets. [2]</w:t>
-      </w:r>
-    </w:p>
-    <w:p>
-      <w:pPr>
-        <w:rPr>
-          <w:lang w:val="en-GB"/>
-        </w:rPr>
-      </w:pPr>
-      <w:r>
-        <w:rPr>
-          <w:lang w:val="en-GB"/>
-        </w:rPr>
-        <w:lastRenderedPageBreak/>
-        <w:t>Describe the PIN connections for your system here</w:t>
-      </w:r>
     </w:p>
     <w:p>
       <w:pPr>
@@ -2860,7 +3056,6 @@
           <w:lang w:val="en-GB"/>
         </w:rPr>
       </w:pPr>
-      <w:proofErr w:type="gramStart"/>
       <w:r>
         <w:rPr>
           <w:lang w:val="en-GB"/>
@@ -2873,7 +3068,6 @@
         </w:rPr>
         <w:t>Structure</w:t>
       </w:r>
-      <w:proofErr w:type="gramEnd"/>
     </w:p>
     <w:p>
       <w:pPr>
@@ -2881,6 +3075,42 @@
           <w:lang w:val="en-GB"/>
         </w:rPr>
       </w:pPr>
+      <w:r>
+        <w:rPr>
+          <w:lang w:val="en-GB"/>
+        </w:rPr>
+        <w:t xml:space="preserve">The code is in a single Arduino sketch. It uses the </w:t>
+      </w:r>
+      <w:r>
+        <w:rPr>
+          <w:lang w:val="en-GB"/>
+        </w:rPr>
+        <w:t>HID-Project library [</w:t>
+      </w:r>
+      <w:r>
+        <w:rPr>
+          <w:lang w:val="en-GB"/>
+        </w:rPr>
+        <w:t>2</w:t>
+      </w:r>
+      <w:r>
+        <w:rPr>
+          <w:lang w:val="en-GB"/>
+        </w:rPr>
+        <w:t xml:space="preserve">] </w:t>
+      </w:r>
+      <w:r>
+        <w:rPr>
+          <w:lang w:val="en-GB"/>
+        </w:rPr>
+        <w:t xml:space="preserve">which </w:t>
+      </w:r>
+      <w:r>
+        <w:rPr>
+          <w:lang w:val="en-GB"/>
+        </w:rPr>
+        <w:t xml:space="preserve">allows the Leonardo to appear as both a keyboard and a gamepad over USB. The gamepad is used for steering because its joystick axis gives a range of values, which suits a steering wheel much better than the binary on/off of a keypress. </w:t>
+      </w:r>
     </w:p>
     <w:p>
       <w:pPr>
@@ -2892,13 +3122,7 @@
         <w:rPr>
           <w:lang w:val="en-GB"/>
         </w:rPr>
-        <w:t>The code is divided into several modules</w:t>
-      </w:r>
-      <w:r>
-        <w:rPr>
-          <w:lang w:val="en-GB"/>
-        </w:rPr>
-        <w:t>. Describe these here and any libraries that you used for example servo.</w:t>
+        <w:t xml:space="preserve">Each button is an instance of this class. </w:t>
       </w:r>
     </w:p>
     <w:p>
@@ -2911,33 +3135,13 @@
         <w:rPr>
           <w:lang w:val="en-GB"/>
         </w:rPr>
-        <w:t xml:space="preserve">The code should be split into </w:t>
-      </w:r>
-      <w:proofErr w:type="gramStart"/>
-      <w:r>
-        <w:rPr>
-          <w:lang w:val="en-GB"/>
-        </w:rPr>
-        <w:t xml:space="preserve">HW </w:t>
-      </w:r>
-      <w:r>
-        <w:rPr>
-          <w:lang w:val="en-GB"/>
-        </w:rPr>
-        <w:t xml:space="preserve"> section</w:t>
-      </w:r>
-      <w:proofErr w:type="gramEnd"/>
-      <w:r>
-        <w:rPr>
-          <w:lang w:val="en-GB"/>
-        </w:rPr>
-        <w:t xml:space="preserve"> and Interface</w:t>
-      </w:r>
-      <w:r>
-        <w:rPr>
-          <w:lang w:val="en-GB"/>
-        </w:rPr>
-        <w:t>. You do not need to copy and paste the entire</w:t>
+        <w:t>Button class</w:t>
+      </w:r>
+      <w:r>
+        <w:rPr>
+          <w:lang w:val="en-GB"/>
+        </w:rPr>
+        <w:t>. Does a bunch of stuff. Only made it as a refactor</w:t>
       </w:r>
       <w:r>
         <w:rPr>
@@ -2945,40 +3149,23 @@
         </w:rPr>
         <w:t xml:space="preserve"> </w:t>
       </w:r>
-      <w:proofErr w:type="gramStart"/>
-      <w:r>
-        <w:rPr>
-          <w:lang w:val="en-GB"/>
-        </w:rPr>
-        <w:t>codebase</w:t>
-      </w:r>
-      <w:proofErr w:type="gramEnd"/>
-      <w:r>
-        <w:rPr>
-          <w:lang w:val="en-GB"/>
-        </w:rPr>
-        <w:t xml:space="preserve"> but </w:t>
-      </w:r>
-      <w:r>
-        <w:rPr>
-          <w:lang w:val="en-GB"/>
-        </w:rPr>
-        <w:t xml:space="preserve">it </w:t>
-      </w:r>
-      <w:r>
-        <w:rPr>
-          <w:lang w:val="en-GB"/>
-        </w:rPr>
-        <w:t xml:space="preserve">should include a walkthrough how the system functions. You can point to key functions that support the function of your system: </w:t>
+      <w:proofErr w:type="spellStart"/>
+      <w:r>
+        <w:rPr>
+          <w:lang w:val="en-GB"/>
+        </w:rPr>
+        <w:t>bc</w:t>
+      </w:r>
+      <w:proofErr w:type="spellEnd"/>
+      <w:r>
+        <w:rPr>
+          <w:lang w:val="en-GB"/>
+        </w:rPr>
+        <w:t xml:space="preserve"> I was typing identical code multiple times.</w:t>
       </w:r>
     </w:p>
     <w:p>
       <w:pPr>
-        <w:pStyle w:val="ListParagraph"/>
-        <w:numPr>
-          <w:ilvl w:val="0"/>
-          <w:numId w:val="1"/>
-        </w:numPr>
         <w:rPr>
           <w:lang w:val="en-GB"/>
         </w:rPr>
@@ -2987,16 +3174,29 @@
         <w:rPr>
           <w:lang w:val="en-GB"/>
         </w:rPr>
-        <w:t>Arduino code</w:t>
+        <w:t>Setup</w:t>
+      </w:r>
+      <w:r>
+        <w:rPr>
+          <w:lang w:val="en-GB"/>
+        </w:rPr>
+        <w:t xml:space="preserve">. </w:t>
+      </w:r>
+      <w:r>
+        <w:rPr>
+          <w:lang w:val="en-GB"/>
+        </w:rPr>
+        <w:t>sets the pin modes</w:t>
+      </w:r>
+      <w:r>
+        <w:rPr>
+          <w:lang w:val="en-GB"/>
+        </w:rPr>
+        <w:t xml:space="preserve"> and begins the keyboard and gamepad.</w:t>
       </w:r>
     </w:p>
     <w:p>
       <w:pPr>
-        <w:pStyle w:val="ListParagraph"/>
-        <w:numPr>
-          <w:ilvl w:val="0"/>
-          <w:numId w:val="1"/>
-        </w:numPr>
         <w:rPr>
           <w:lang w:val="en-GB"/>
         </w:rPr>
@@ -3005,21 +3205,52 @@
         <w:rPr>
           <w:lang w:val="en-GB"/>
         </w:rPr>
-        <w:t xml:space="preserve">Processing or </w:t>
-      </w:r>
-      <w:proofErr w:type="gramStart"/>
-      <w:r>
-        <w:rPr>
-          <w:lang w:val="en-GB"/>
-        </w:rPr>
-        <w:t>other</w:t>
-      </w:r>
-      <w:proofErr w:type="gramEnd"/>
-      <w:r>
-        <w:rPr>
-          <w:lang w:val="en-GB"/>
-        </w:rPr>
-        <w:t xml:space="preserve"> platform</w:t>
+        <w:t>Ultrasonic sensor reading and filtering and mapping to joystick range</w:t>
+      </w:r>
+    </w:p>
+    <w:p>
+      <w:pPr>
+        <w:rPr>
+          <w:lang w:val="en-GB"/>
+        </w:rPr>
+      </w:pPr>
+      <w:r>
+        <w:rPr>
+          <w:lang w:val="en-GB"/>
+        </w:rPr>
+        <w:t xml:space="preserve">Safety button debounce and long press </w:t>
+      </w:r>
+    </w:p>
+    <w:p>
+      <w:pPr>
+        <w:rPr>
+          <w:lang w:val="en-GB"/>
+        </w:rPr>
+      </w:pPr>
+      <w:r>
+        <w:rPr>
+          <w:lang w:val="en-GB"/>
+        </w:rPr>
+        <w:t>Button and wheel controls and LED controls</w:t>
+      </w:r>
+    </w:p>
+    <w:p>
+      <w:pPr>
+        <w:rPr>
+          <w:lang w:val="en-GB"/>
+        </w:rPr>
+      </w:pPr>
+      <w:r>
+        <w:rPr>
+          <w:lang w:val="en-GB"/>
+        </w:rPr>
+        <w:t>Median function</w:t>
+      </w:r>
+      <w:r>
+        <w:rPr>
+          <w:lang w:val="en-GB"/>
+        </w:rPr>
+        <w:t xml:space="preserve"> gets the median value from an array</w:t>
       </w:r>
     </w:p>
     <w:p>
@@ -3071,7 +3302,6 @@
         <w:rPr>
           <w:lang w:val="en-GB"/>
         </w:rPr>
-        <w:lastRenderedPageBreak/>
         <w:t>Reflection</w:t>
       </w:r>
     </w:p>
@@ -3124,6 +3354,144 @@
     </w:p>
     <w:p>
       <w:pPr>
+        <w:ind w:left="720" w:hanging="720"/>
+        <w:rPr>
+          <w:lang w:val="en-GB"/>
+        </w:rPr>
+      </w:pPr>
+      <w:r>
+        <w:rPr>
+          <w:lang w:val="en-GB"/>
+        </w:rPr>
+        <w:t>[1]</w:t>
+      </w:r>
+      <w:r>
+        <w:rPr>
+          <w:lang w:val="en-GB"/>
+        </w:rPr>
+        <w:tab/>
+      </w:r>
+      <w:r>
+        <w:rPr>
+          <w:lang w:val="en-GB"/>
+        </w:rPr>
+        <w:t xml:space="preserve">Driving game: </w:t>
+      </w:r>
+      <w:hyperlink r:id="rId13" w:history="1">
+        <w:r>
+          <w:rPr>
+            <w:rStyle w:val="Hyperlink"/>
+            <w:lang w:val="en-GB"/>
+          </w:rPr>
+          <w:t>https://slowroads.io/</w:t>
+        </w:r>
+      </w:hyperlink>
+      <w:r>
+        <w:rPr>
+          <w:lang w:val="en-GB"/>
+        </w:rPr>
+        <w:t xml:space="preserve"> </w:t>
+      </w:r>
+      <w:r>
+        <w:rPr>
+          <w:noProof/>
+        </w:rPr>
+        <w:br/>
+        <w:t>A</w:t>
+      </w:r>
+      <w:r>
+        <w:rPr>
+          <w:noProof/>
+        </w:rPr>
+        <w:t>ccessed 29</w:t>
+      </w:r>
+      <w:r>
+        <w:rPr>
+          <w:noProof/>
+          <w:vertAlign w:val="superscript"/>
+        </w:rPr>
+        <w:t>th</w:t>
+      </w:r>
+      <w:r>
+        <w:rPr>
+          <w:noProof/>
+        </w:rPr>
+        <w:t xml:space="preserve"> October 2026</w:t>
+      </w:r>
+    </w:p>
+    <w:p>
+      <w:pPr>
+        <w:ind w:left="720" w:hanging="720"/>
+        <w:rPr>
+          <w:lang w:val="en-GB"/>
+        </w:rPr>
+      </w:pPr>
+      <w:r>
+        <w:rPr>
+          <w:lang w:val="en-GB"/>
+        </w:rPr>
+        <w:t>[</w:t>
+      </w:r>
+      <w:r>
+        <w:rPr>
+          <w:lang w:val="en-GB"/>
+        </w:rPr>
+        <w:t>5</w:t>
+      </w:r>
+      <w:r>
+        <w:rPr>
+          <w:lang w:val="en-GB"/>
+        </w:rPr>
+        <w:t>]</w:t>
+      </w:r>
+      <w:r>
+        <w:rPr>
+          <w:lang w:val="en-GB"/>
+        </w:rPr>
+        <w:tab/>
+      </w:r>
+      <w:r>
+        <w:rPr>
+          <w:lang w:val="en-GB"/>
+        </w:rPr>
+        <w:t>HID-Project library</w:t>
+      </w:r>
+      <w:r>
+        <w:rPr>
+          <w:noProof/>
+        </w:rPr>
+        <w:t xml:space="preserve"> </w:t>
+      </w:r>
+      <w:r>
+        <w:rPr>
+          <w:noProof/>
+        </w:rPr>
+        <w:br/>
+        <w:t>Accessed 29</w:t>
+      </w:r>
+      <w:r>
+        <w:rPr>
+          <w:noProof/>
+          <w:vertAlign w:val="superscript"/>
+        </w:rPr>
+        <w:t>th</w:t>
+      </w:r>
+      <w:r>
+        <w:rPr>
+          <w:noProof/>
+        </w:rPr>
+        <w:t xml:space="preserve"> October 2026</w:t>
+      </w:r>
+    </w:p>
+    <w:p>
+      <w:pPr>
+        <w:rPr>
+          <w:lang w:val="en-GB"/>
+        </w:rPr>
+      </w:pPr>
+    </w:p>
+    <w:p>
+      <w:pPr>
         <w:ind w:left="709" w:hanging="709"/>
         <w:rPr>
           <w:lang w:val="en-GB"/>
@@ -3150,7 +3518,7 @@
       <w:r>
         <w:t xml:space="preserve"> </w:t>
       </w:r>
-      <w:hyperlink r:id="rId13" w:history="1">
+      <w:hyperlink r:id="rId14" w:history="1">
         <w:r>
           <w:rPr>
             <w:rStyle w:val="Hyperlink"/>
@@ -3181,7 +3549,7 @@
       <w:pPr>
         <w:ind w:left="709" w:hanging="709"/>
         <w:rPr>
-          <w:lang w:val="en-GB"/>
+          <w:noProof/>
         </w:rPr>
       </w:pPr>
       <w:r>
@@ -3196,7 +3564,7 @@
         </w:rPr>
         <w:tab/>
       </w:r>
-      <w:hyperlink r:id="rId14" w:history="1">
+      <w:hyperlink r:id="rId15" w:history="1">
         <w:r>
           <w:rPr>
             <w:rStyle w:val="Hyperlink"/>
@@ -3214,9 +3582,23 @@
         <w:t>Accessed 25th January 2012</w:t>
       </w:r>
     </w:p>
+    <w:p>
+      <w:pPr>
+        <w:ind w:left="709" w:hanging="709"/>
+        <w:rPr>
+          <w:lang w:val="en-GB"/>
+        </w:rPr>
+      </w:pPr>
+      <w:r>
+        <w:rPr>
+          <w:noProof/>
+        </w:rPr>
+        <w:t xml:space="preserve">Maybe add a reference for how I learned to write the class code. </w:t>
+      </w:r>
+    </w:p>
     <w:sectPr>
-      <w:headerReference w:type="default" r:id="rId15"/>
-      <w:footerReference w:type="default" r:id="rId16"/>
+      <w:headerReference w:type="default" r:id="rId16"/>
+      <w:footerReference w:type="default" r:id="rId17"/>
       <w:pgSz w:w="11906" w:h="16838"/>
       <w:pgMar w:top="709" w:right="1440" w:bottom="1134" w:left="1440" w:header="708" w:footer="708" w:gutter="0"/>
       <w:cols w:space="708"/>
@@ -3912,7 +4294,6 @@
   <w:style w:type="character" w:default="1" w:styleId="DefaultParagraphFont">
     <w:name w:val="Default Paragraph Font"/>
     <w:uiPriority w:val="1"/>
-    <w:semiHidden/>
     <w:unhideWhenUsed/>
   </w:style>
   <w:style w:type="table" w:default="1" w:styleId="TableNormal">
@@ -4026,7 +4407,6 @@
   <w:style w:type="character" w:styleId="Hyperlink">
     <w:name w:val="Hyperlink"/>
     <w:uiPriority w:val="99"/>
-    <w:semiHidden/>
     <w:unhideWhenUsed/>
     <w:rsid w:val="00470DF0"/>
     <w:rPr>
@@ -4103,6 +4483,31 @@
     <w:rPr>
       <w:color w:val="954F72" w:themeColor="followedHyperlink"/>
       <w:u w:val="single"/>
+    </w:rPr>
+  </w:style>
+  <w:style w:type="character" w:styleId="UnresolvedMention">
+    <w:name w:val="Unresolved Mention"/>
+    <w:basedOn w:val="DefaultParagraphFont"/>
+    <w:uiPriority w:val="99"/>
+    <w:semiHidden/>
+    <w:unhideWhenUsed/>
+    <w:rsid w:val="00E577FD"/>
+    <w:rPr>
+      <w:color w:val="605E5C"/>
+      <w:shd w:val="clear" w:color="auto" w:fill="E1DFDD"/>
+    </w:rPr>
+  </w:style>
+  <w:style w:type="paragraph" w:styleId="NormalWeb">
+    <w:name w:val="Normal (Web)"/>
+    <w:basedOn w:val="Normal"/>
+    <w:uiPriority w:val="99"/>
+    <w:semiHidden/>
+    <w:unhideWhenUsed/>
+    <w:rsid w:val="002A39B9"/>
+    <w:rPr>
+      <w:rFonts w:ascii="Times New Roman" w:hAnsi="Times New Roman"/>
+      <w:sz w:val="24"/>
+      <w:szCs w:val="24"/>
     </w:rPr>
   </w:style>
 </w:styles>
@@ -4404,6 +4809,10 @@
 </file>
 
 <file path=customXml/item1.xml><?xml version="1.0" encoding="utf-8"?>
+<b:Sources xmlns:b="http://schemas.openxmlformats.org/officeDocument/2006/bibliography" xmlns="http://schemas.openxmlformats.org/officeDocument/2006/bibliography" SelectedStyle="\HarvardAnglia2008OfficeOnline.xsl" StyleName="Harvard – Anglia 2008"/>
+</file>
+
+<file path=customXml/item2.xml><?xml version="1.0" encoding="utf-8"?>
 <p:properties xmlns:p="http://schemas.microsoft.com/office/2006/metadata/properties" xmlns:xsi="http://www.w3.org/2001/XMLSchema-instance" xmlns:pc="http://schemas.microsoft.com/office/infopath/2007/PartnerControls">
   <documentManagement>
     <lcf76f155ced4ddcb4097134ff3c332f xmlns="e7d6067d-bc6e-4f84-b586-3469bc701aa9">
@@ -4414,20 +4823,7 @@
 </p:properties>
 </file>
 
-<file path=customXml/item2.xml><?xml version="1.0" encoding="utf-8"?>
-<b:Sources xmlns:b="http://schemas.openxmlformats.org/officeDocument/2006/bibliography" xmlns="http://schemas.openxmlformats.org/officeDocument/2006/bibliography" SelectedStyle="\HarvardAnglia2008OfficeOnline.xsl" StyleName="Harvard – Anglia 2008"/>
-</file>
-
 <file path=customXml/item3.xml><?xml version="1.0" encoding="utf-8"?>
-<?mso-contentType ?>
-<FormTemplates xmlns="http://schemas.microsoft.com/sharepoint/v3/contenttype/forms">
-  <Display>DocumentLibraryForm</Display>
-  <Edit>DocumentLibraryForm</Edit>
-  <New>DocumentLibraryForm</New>
-</FormTemplates>
-</file>
-
-<file path=customXml/item4.xml><?xml version="1.0" encoding="utf-8"?>
 <ct:contentTypeSchema xmlns:ct="http://schemas.microsoft.com/office/2006/metadata/contentType" xmlns:ma="http://schemas.microsoft.com/office/2006/metadata/properties/metaAttributes" ct:_="" ma:_="" ma:contentTypeName="Document" ma:contentTypeID="0x010100ACCA975F8D0D5746984DB0EB9F8E158E" ma:contentTypeVersion="9" ma:contentTypeDescription="Create a new document." ma:contentTypeScope="" ma:versionID="9e878cca08fb2ba6f2f3d5d4bfc6d679">
   <xsd:schema xmlns:xsd="http://www.w3.org/2001/XMLSchema" xmlns:xs="http://www.w3.org/2001/XMLSchema" xmlns:p="http://schemas.microsoft.com/office/2006/metadata/properties" xmlns:ns2="e7d6067d-bc6e-4f84-b586-3469bc701aa9" xmlns:ns3="fd9f5c74-e2a0-45b3-9622-3259d29162da" targetNamespace="http://schemas.microsoft.com/office/2006/metadata/properties" ma:root="true" ma:fieldsID="1c5c9a3537fac3b313b835e7731d6036" ns2:_="" ns3:_="">
     <xsd:import namespace="e7d6067d-bc6e-4f84-b586-3469bc701aa9"/>
@@ -4608,7 +5004,24 @@
 </ct:contentTypeSchema>
 </file>
 
+<file path=customXml/item4.xml><?xml version="1.0" encoding="utf-8"?>
+<?mso-contentType ?>
+<FormTemplates xmlns="http://schemas.microsoft.com/sharepoint/v3/contenttype/forms">
+  <Display>DocumentLibraryForm</Display>
+  <Edit>DocumentLibraryForm</Edit>
+  <New>DocumentLibraryForm</New>
+</FormTemplates>
+</file>
+
 <file path=customXml/itemProps1.xml><?xml version="1.0" encoding="utf-8"?>
+<ds:datastoreItem xmlns:ds="http://schemas.openxmlformats.org/officeDocument/2006/customXml" ds:itemID="{79D91E43-2625-4669-B221-6762C448E6C6}">
+  <ds:schemaRefs>
+    <ds:schemaRef ds:uri="http://schemas.openxmlformats.org/officeDocument/2006/bibliography"/>
+  </ds:schemaRefs>
+</ds:datastoreItem>
+</file>
+
+<file path=customXml/itemProps2.xml><?xml version="1.0" encoding="utf-8"?>
 <ds:datastoreItem xmlns:ds="http://schemas.openxmlformats.org/officeDocument/2006/customXml" ds:itemID="{04511DF0-BEF7-49A8-9761-2E82C4E3AAF3}">
   <ds:schemaRefs>
     <ds:schemaRef ds:uri="http://schemas.microsoft.com/office/2006/metadata/properties"/>
@@ -4619,23 +5032,7 @@
 </ds:datastoreItem>
 </file>
 
-<file path=customXml/itemProps2.xml><?xml version="1.0" encoding="utf-8"?>
-<ds:datastoreItem xmlns:ds="http://schemas.openxmlformats.org/officeDocument/2006/customXml" ds:itemID="{79D91E43-2625-4669-B221-6762C448E6C6}">
-  <ds:schemaRefs>
-    <ds:schemaRef ds:uri="http://schemas.openxmlformats.org/officeDocument/2006/bibliography"/>
-  </ds:schemaRefs>
-</ds:datastoreItem>
-</file>
-
 <file path=customXml/itemProps3.xml><?xml version="1.0" encoding="utf-8"?>
-<ds:datastoreItem xmlns:ds="http://schemas.openxmlformats.org/officeDocument/2006/customXml" ds:itemID="{37B8B796-B504-47D4-A4B6-F42D797F5D90}">
-  <ds:schemaRefs>
-    <ds:schemaRef ds:uri="http://schemas.microsoft.com/sharepoint/v3/contenttype/forms"/>
-  </ds:schemaRefs>
-</ds:datastoreItem>
-</file>
-
-<file path=customXml/itemProps4.xml><?xml version="1.0" encoding="utf-8"?>
 <ds:datastoreItem xmlns:ds="http://schemas.openxmlformats.org/officeDocument/2006/customXml" ds:itemID="{EDC293C0-468E-449F-B9BA-414800CA2CBC}">
   <ds:schemaRefs>
     <ds:schemaRef ds:uri="http://schemas.microsoft.com/office/2006/metadata/contentType"/>
@@ -4652,4 +5049,12 @@
     <ds:schemaRef ds:uri="http://schemas.microsoft.com/internal/obd"/>
   </ds:schemaRefs>
 </ds:datastoreItem>
+</file>
+
+<file path=customXml/itemProps4.xml><?xml version="1.0" encoding="utf-8"?>
+<ds:datastoreItem xmlns:ds="http://schemas.openxmlformats.org/officeDocument/2006/customXml" ds:itemID="{37B8B796-B504-47D4-A4B6-F42D797F5D90}">
+  <ds:schemaRefs>
+    <ds:schemaRef ds:uri="http://schemas.microsoft.com/sharepoint/v3/contenttype/forms"/>
+  </ds:schemaRefs>
+</ds:datastoreItem>
 </file>
</xml_diff>

<commit_message>
did the code section of the report.
</commit_message>
<xml_diff>
--- a/physical_interaction_CA2_Report.docx
+++ b/physical_interaction_CA2_Report.docx
@@ -3056,6 +3056,7 @@
           <w:lang w:val="en-GB"/>
         </w:rPr>
       </w:pPr>
+      <w:proofErr w:type="gramStart"/>
       <w:r>
         <w:rPr>
           <w:lang w:val="en-GB"/>
@@ -3068,48 +3069,21 @@
         </w:rPr>
         <w:t>Structure</w:t>
       </w:r>
+      <w:proofErr w:type="gramEnd"/>
     </w:p>
     <w:p>
       <w:pPr>
+        <w:pStyle w:val="Heading3"/>
         <w:rPr>
           <w:lang w:val="en-GB"/>
         </w:rPr>
       </w:pPr>
       <w:r>
         <w:rPr>
-          <w:lang w:val="en-GB"/>
-        </w:rPr>
-        <w:t xml:space="preserve">The code is in a single Arduino sketch. It uses the </w:t>
-      </w:r>
-      <w:r>
-        <w:rPr>
-          <w:lang w:val="en-GB"/>
-        </w:rPr>
-        <w:t>HID-Project library [</w:t>
-      </w:r>
-      <w:r>
-        <w:rPr>
-          <w:lang w:val="en-GB"/>
-        </w:rPr>
-        <w:t>2</w:t>
-      </w:r>
-      <w:r>
-        <w:rPr>
-          <w:lang w:val="en-GB"/>
-        </w:rPr>
-        <w:t xml:space="preserve">] </w:t>
-      </w:r>
-      <w:r>
-        <w:rPr>
-          <w:lang w:val="en-GB"/>
-        </w:rPr>
-        <w:t xml:space="preserve">which </w:t>
-      </w:r>
-      <w:r>
-        <w:rPr>
-          <w:lang w:val="en-GB"/>
-        </w:rPr>
-        <w:t xml:space="preserve">allows the Leonardo to appear as both a keyboard and a gamepad over USB. The gamepad is used for steering because its joystick axis gives a range of values, which suits a steering wheel much better than the binary on/off of a keypress. </w:t>
+          <w:u w:val="double"/>
+          <w:lang w:val="en-GB"/>
+        </w:rPr>
+        <w:t>Hardware</w:t>
       </w:r>
     </w:p>
     <w:p>
@@ -3122,7 +3096,105 @@
         <w:rPr>
           <w:lang w:val="en-GB"/>
         </w:rPr>
-        <w:t xml:space="preserve">Each button is an instance of this class. </w:t>
+        <w:t xml:space="preserve">The code is in a single Arduino sketch. </w:t>
+      </w:r>
+      <w:r>
+        <w:rPr>
+          <w:lang w:val="en-GB"/>
+        </w:rPr>
+        <w:t xml:space="preserve">As shown in </w:t>
+      </w:r>
+      <w:r>
+        <w:rPr>
+          <w:lang w:val="en-GB"/>
+        </w:rPr>
+        <w:fldChar w:fldCharType="begin"/>
+      </w:r>
+      <w:r>
+        <w:rPr>
+          <w:lang w:val="en-GB"/>
+        </w:rPr>
+        <w:instrText xml:space="preserve"> REF _Ref244282348 \h </w:instrText>
+      </w:r>
+      <w:r>
+        <w:rPr>
+          <w:lang w:val="en-GB"/>
+        </w:rPr>
+      </w:r>
+      <w:r>
+        <w:rPr>
+          <w:lang w:val="en-GB"/>
+        </w:rPr>
+        <w:fldChar w:fldCharType="separate"/>
+      </w:r>
+      <w:r>
+        <w:t xml:space="preserve">Figure </w:t>
+      </w:r>
+      <w:r>
+        <w:rPr>
+          <w:noProof/>
+        </w:rPr>
+        <w:t>3</w:t>
+      </w:r>
+      <w:r>
+        <w:rPr>
+          <w:lang w:val="en-GB"/>
+        </w:rPr>
+        <w:fldChar w:fldCharType="end"/>
+      </w:r>
+      <w:r>
+        <w:rPr>
+          <w:lang w:val="en-GB"/>
+        </w:rPr>
+        <w:t xml:space="preserve"> i</w:t>
+      </w:r>
+      <w:r>
+        <w:rPr>
+          <w:lang w:val="en-GB"/>
+        </w:rPr>
+        <w:t xml:space="preserve">t uses the </w:t>
+      </w:r>
+      <w:r>
+        <w:rPr>
+          <w:lang w:val="en-GB"/>
+        </w:rPr>
+        <w:t>HID-Project library [</w:t>
+      </w:r>
+      <w:r>
+        <w:rPr>
+          <w:lang w:val="en-GB"/>
+        </w:rPr>
+        <w:t>2</w:t>
+      </w:r>
+      <w:r>
+        <w:rPr>
+          <w:lang w:val="en-GB"/>
+        </w:rPr>
+        <w:t>]</w:t>
+      </w:r>
+      <w:r>
+        <w:rPr>
+          <w:lang w:val="en-GB"/>
+        </w:rPr>
+        <w:t>,</w:t>
+      </w:r>
+      <w:r>
+        <w:rPr>
+          <w:lang w:val="en-GB"/>
+        </w:rPr>
+        <w:t xml:space="preserve"> </w:t>
+      </w:r>
+      <w:r>
+        <w:rPr>
+          <w:lang w:val="en-GB"/>
+        </w:rPr>
+        <w:t xml:space="preserve">which </w:t>
+      </w:r>
+      <w:r>
+        <w:rPr>
+          <w:lang w:val="en-GB"/>
+        </w:rPr>
+        <w:t xml:space="preserve">allows the Leonardo to appear as both a keyboard and a gamepad over USB. The gamepad is used for steering because its joystick axis gives a range of values, which suits a steering wheel much better than the binary on/off of a keypress. </w:t>
       </w:r>
     </w:p>
     <w:p>
@@ -3135,13 +3207,159 @@
         <w:rPr>
           <w:lang w:val="en-GB"/>
         </w:rPr>
-        <w:t>Button class</w:t>
-      </w:r>
-      <w:r>
-        <w:rPr>
-          <w:lang w:val="en-GB"/>
-        </w:rPr>
-        <w:t>. Does a bunch of stuff. Only made it as a refactor</w:t>
+        <w:t xml:space="preserve">Each button </w:t>
+      </w:r>
+      <w:r>
+        <w:rPr>
+          <w:lang w:val="en-GB"/>
+        </w:rPr>
+        <w:t xml:space="preserve">used </w:t>
+      </w:r>
+      <w:r>
+        <w:rPr>
+          <w:lang w:val="en-GB"/>
+        </w:rPr>
+        <w:t xml:space="preserve">is an instance of </w:t>
+      </w:r>
+      <w:r>
+        <w:rPr>
+          <w:lang w:val="en-GB"/>
+        </w:rPr>
+        <w:t>the Button</w:t>
+      </w:r>
+      <w:r>
+        <w:rPr>
+          <w:lang w:val="en-GB"/>
+        </w:rPr>
+        <w:t xml:space="preserve"> class</w:t>
+      </w:r>
+      <w:r>
+        <w:rPr>
+          <w:lang w:val="en-GB"/>
+        </w:rPr>
+        <w:t xml:space="preserve">, as shown in </w:t>
+      </w:r>
+      <w:r>
+        <w:rPr>
+          <w:lang w:val="en-GB"/>
+        </w:rPr>
+        <w:fldChar w:fldCharType="begin"/>
+      </w:r>
+      <w:r>
+        <w:rPr>
+          <w:lang w:val="en-GB"/>
+        </w:rPr>
+        <w:instrText xml:space="preserve"> REF _Ref244282348 \h </w:instrText>
+      </w:r>
+      <w:r>
+        <w:rPr>
+          <w:lang w:val="en-GB"/>
+        </w:rPr>
+      </w:r>
+      <w:r>
+        <w:rPr>
+          <w:lang w:val="en-GB"/>
+        </w:rPr>
+        <w:fldChar w:fldCharType="separate"/>
+      </w:r>
+      <w:r>
+        <w:t>Figu</w:t>
+      </w:r>
+      <w:r>
+        <w:t>r</w:t>
+      </w:r>
+      <w:r>
+        <w:t xml:space="preserve">e </w:t>
+      </w:r>
+      <w:r>
+        <w:rPr>
+          <w:noProof/>
+        </w:rPr>
+        <w:t>3</w:t>
+      </w:r>
+      <w:r>
+        <w:rPr>
+          <w:lang w:val="en-GB"/>
+        </w:rPr>
+        <w:fldChar w:fldCharType="end"/>
+      </w:r>
+      <w:r>
+        <w:rPr>
+          <w:lang w:val="en-GB"/>
+        </w:rPr>
+        <w:t xml:space="preserve">. </w:t>
+      </w:r>
+      <w:r>
+        <w:rPr>
+          <w:lang w:val="en-GB"/>
+        </w:rPr>
+        <w:t xml:space="preserve">The class allows multiple buttons to share the same </w:t>
+      </w:r>
+      <w:r>
+        <w:rPr>
+          <w:lang w:val="en-GB"/>
+        </w:rPr>
+        <w:t>methods</w:t>
+      </w:r>
+      <w:r>
+        <w:rPr>
+          <w:lang w:val="en-GB"/>
+        </w:rPr>
+        <w:t>, which avoids the need to repeatedly write the same code for each button. Each instance stores its own set</w:t>
+      </w:r>
+      <w:r>
+        <w:rPr>
+          <w:lang w:val="en-GB"/>
+        </w:rPr>
+        <w:t xml:space="preserve"> of variables</w:t>
+      </w:r>
+      <w:r>
+        <w:rPr>
+          <w:lang w:val="en-GB"/>
+        </w:rPr>
+        <w:t xml:space="preserve">, known as data members, which are declared in the class’s public section. The </w:t>
+      </w:r>
+      <w:r>
+        <w:rPr>
+          <w:lang w:val="en-GB"/>
+        </w:rPr>
+        <w:t>constructor allows selected data members to</w:t>
+      </w:r>
+      <w:r>
+        <w:rPr>
+          <w:lang w:val="en-GB"/>
+        </w:rPr>
+        <w:t xml:space="preserve"> be </w:t>
+      </w:r>
+      <w:r>
+        <w:rPr>
+          <w:lang w:val="en-GB"/>
+        </w:rPr>
+        <w:t>initialized with values supplied when creating each instance.</w:t>
+      </w:r>
+      <w:r>
+        <w:rPr>
+          <w:lang w:val="en-GB"/>
+        </w:rPr>
+        <w:t xml:space="preserve"> This allows each instance to have different values for their </w:t>
+      </w:r>
+      <w:r>
+        <w:rPr>
+          <w:lang w:val="en-GB"/>
+        </w:rPr>
+        <w:t>data members</w:t>
+      </w:r>
+      <w:r>
+        <w:rPr>
+          <w:lang w:val="en-GB"/>
+        </w:rPr>
+        <w:t>,</w:t>
+      </w:r>
+      <w:r>
+        <w:rPr>
+          <w:lang w:val="en-GB"/>
+        </w:rPr>
+        <w:t xml:space="preserve"> causing</w:t>
       </w:r>
       <w:r>
         <w:rPr>
@@ -3149,67 +3367,137 @@
         </w:rPr>
         <w:t xml:space="preserve"> </w:t>
       </w:r>
-      <w:proofErr w:type="spellStart"/>
-      <w:r>
-        <w:rPr>
-          <w:lang w:val="en-GB"/>
-        </w:rPr>
-        <w:t>bc</w:t>
-      </w:r>
-      <w:proofErr w:type="spellEnd"/>
-      <w:r>
-        <w:rPr>
-          <w:lang w:val="en-GB"/>
-        </w:rPr>
-        <w:t xml:space="preserve"> I was typing identical code multiple times.</w:t>
+      <w:r>
+        <w:rPr>
+          <w:lang w:val="en-GB"/>
+        </w:rPr>
+        <w:t xml:space="preserve">the </w:t>
+      </w:r>
+      <w:r>
+        <w:rPr>
+          <w:lang w:val="en-GB"/>
+        </w:rPr>
+        <w:t>class’s methods</w:t>
+      </w:r>
+      <w:r>
+        <w:rPr>
+          <w:lang w:val="en-GB"/>
+        </w:rPr>
+        <w:t xml:space="preserve"> to </w:t>
+      </w:r>
+      <w:r>
+        <w:rPr>
+          <w:lang w:val="en-GB"/>
+        </w:rPr>
+        <w:t>behave differently for each instance,</w:t>
+      </w:r>
+      <w:r>
+        <w:rPr>
+          <w:lang w:val="en-GB"/>
+        </w:rPr>
+        <w:t xml:space="preserve"> despite </w:t>
+      </w:r>
+      <w:r>
+        <w:rPr>
+          <w:lang w:val="en-GB"/>
+        </w:rPr>
+        <w:t xml:space="preserve">the code </w:t>
+      </w:r>
+      <w:r>
+        <w:rPr>
+          <w:lang w:val="en-GB"/>
+        </w:rPr>
+        <w:t>remaining the same</w:t>
+      </w:r>
+      <w:r>
+        <w:rPr>
+          <w:lang w:val="en-GB"/>
+        </w:rPr>
+        <w:t xml:space="preserve">. </w:t>
       </w:r>
     </w:p>
     <w:p>
       <w:pPr>
-        <w:rPr>
-          <w:lang w:val="en-GB"/>
-        </w:rPr>
+        <w:keepNext/>
       </w:pPr>
       <w:r>
         <w:rPr>
           <w:lang w:val="en-GB"/>
         </w:rPr>
-        <w:t>Setup</w:t>
-      </w:r>
-      <w:r>
-        <w:rPr>
-          <w:lang w:val="en-GB"/>
-        </w:rPr>
-        <w:t xml:space="preserve">. </w:t>
-      </w:r>
-      <w:r>
-        <w:rPr>
-          <w:lang w:val="en-GB"/>
-        </w:rPr>
-        <w:t>sets the pin modes</w:t>
-      </w:r>
-      <w:r>
-        <w:rPr>
-          <w:lang w:val="en-GB"/>
-        </w:rPr>
-        <w:t xml:space="preserve"> and begins the keyboard and gamepad.</w:t>
+        <w:drawing>
+          <wp:inline distT="0" distB="0" distL="0" distR="0" wp14:anchorId="566250E6" wp14:editId="0F437270">
+            <wp:extent cx="4540624" cy="4820325"/>
+            <wp:effectExtent l="0" t="0" r="0" b="0"/>
+            <wp:docPr id="721440466" name="Picture 1"/>
+            <wp:cNvGraphicFramePr>
+              <a:graphicFrameLocks xmlns:a="http://schemas.openxmlformats.org/drawingml/2006/main" noChangeAspect="1"/>
+            </wp:cNvGraphicFramePr>
+            <a:graphic xmlns:a="http://schemas.openxmlformats.org/drawingml/2006/main">
+              <a:graphicData uri="http://schemas.openxmlformats.org/drawingml/2006/picture">
+                <pic:pic xmlns:pic="http://schemas.openxmlformats.org/drawingml/2006/picture">
+                  <pic:nvPicPr>
+                    <pic:cNvPr id="721440466" name=""/>
+                    <pic:cNvPicPr/>
+                  </pic:nvPicPr>
+                  <pic:blipFill>
+                    <a:blip r:embed="rId13"/>
+                    <a:stretch>
+                      <a:fillRect/>
+                    </a:stretch>
+                  </pic:blipFill>
+                  <pic:spPr>
+                    <a:xfrm>
+                      <a:off x="0" y="0"/>
+                      <a:ext cx="4544083" cy="4823997"/>
+                    </a:xfrm>
+                    <a:prstGeom prst="rect">
+                      <a:avLst/>
+                    </a:prstGeom>
+                  </pic:spPr>
+                </pic:pic>
+              </a:graphicData>
+            </a:graphic>
+          </wp:inline>
+        </w:drawing>
       </w:r>
     </w:p>
     <w:p>
       <w:pPr>
+        <w:pStyle w:val="Caption"/>
         <w:rPr>
           <w:lang w:val="en-GB"/>
         </w:rPr>
       </w:pPr>
-      <w:r>
-        <w:rPr>
-          <w:lang w:val="en-GB"/>
-        </w:rPr>
-        <w:t>Ultrasonic sensor reading and filtering and mapping to joystick range</w:t>
+      <w:bookmarkStart w:id="0" w:name="_Ref244282348"/>
+      <w:r>
+        <w:t xml:space="preserve">Figure </w:t>
+      </w:r>
+      <w:r>
+        <w:fldChar w:fldCharType="begin"/>
+      </w:r>
+      <w:r>
+        <w:instrText xml:space="preserve"> SEQ Figure \* ARABIC </w:instrText>
+      </w:r>
+      <w:r>
+        <w:fldChar w:fldCharType="separate"/>
+      </w:r>
+      <w:r>
+        <w:rPr>
+          <w:noProof/>
+        </w:rPr>
+        <w:t>3</w:t>
+      </w:r>
+      <w:r>
+        <w:fldChar w:fldCharType="end"/>
+      </w:r>
+      <w:bookmarkEnd w:id="0"/>
+      <w:r>
+        <w:t xml:space="preserve"> Button class</w:t>
       </w:r>
     </w:p>
     <w:p>
       <w:pPr>
+        <w:spacing w:after="0" w:line="240" w:lineRule="auto"/>
         <w:rPr>
           <w:lang w:val="en-GB"/>
         </w:rPr>
@@ -3218,7 +3506,7 @@
         <w:rPr>
           <w:lang w:val="en-GB"/>
         </w:rPr>
-        <w:t xml:space="preserve">Safety button debounce and long press </w:t>
+        <w:br w:type="page"/>
       </w:r>
     </w:p>
     <w:p>
@@ -3231,26 +3519,1850 @@
         <w:rPr>
           <w:lang w:val="en-GB"/>
         </w:rPr>
-        <w:t>Button and wheel controls and LED controls</w:t>
+        <w:lastRenderedPageBreak/>
+        <w:t>As shown in</w:t>
+      </w:r>
+      <w:r>
+        <w:rPr>
+          <w:lang w:val="en-GB"/>
+        </w:rPr>
+        <w:t xml:space="preserve"> </w:t>
+      </w:r>
+      <w:r>
+        <w:rPr>
+          <w:lang w:val="en-GB"/>
+        </w:rPr>
+        <w:fldChar w:fldCharType="begin"/>
+      </w:r>
+      <w:r>
+        <w:rPr>
+          <w:lang w:val="en-GB"/>
+        </w:rPr>
+        <w:instrText xml:space="preserve"> REF _Ref244281559 \h </w:instrText>
+      </w:r>
+      <w:r>
+        <w:rPr>
+          <w:lang w:val="en-GB"/>
+        </w:rPr>
+      </w:r>
+      <w:r>
+        <w:rPr>
+          <w:lang w:val="en-GB"/>
+        </w:rPr>
+        <w:fldChar w:fldCharType="separate"/>
+      </w:r>
+      <w:r>
+        <w:t>Figu</w:t>
+      </w:r>
+      <w:r>
+        <w:t>r</w:t>
+      </w:r>
+      <w:r>
+        <w:t xml:space="preserve">e </w:t>
+      </w:r>
+      <w:r>
+        <w:rPr>
+          <w:noProof/>
+        </w:rPr>
+        <w:t>4</w:t>
+      </w:r>
+      <w:r>
+        <w:rPr>
+          <w:lang w:val="en-GB"/>
+        </w:rPr>
+        <w:fldChar w:fldCharType="end"/>
+      </w:r>
+      <w:r>
+        <w:rPr>
+          <w:lang w:val="en-GB"/>
+        </w:rPr>
+        <w:t>, t</w:t>
+      </w:r>
+      <w:r>
+        <w:rPr>
+          <w:lang w:val="en-GB"/>
+        </w:rPr>
+        <w:t xml:space="preserve">he button instances are created, each with their own values (pin and letter) passed as parameters to the constructor. The safety button uses ‘\0’, which </w:t>
+      </w:r>
+      <w:r>
+        <w:rPr>
+          <w:lang w:val="en-GB"/>
+        </w:rPr>
+        <w:t>represents</w:t>
+      </w:r>
+      <w:r>
+        <w:rPr>
+          <w:lang w:val="en-GB"/>
+        </w:rPr>
+        <w:t xml:space="preserve"> a null character, because it uses </w:t>
+      </w:r>
+      <w:r>
+        <w:rPr>
+          <w:lang w:val="en-GB"/>
+        </w:rPr>
+        <w:t xml:space="preserve">separate </w:t>
+      </w:r>
+      <w:r>
+        <w:rPr>
+          <w:lang w:val="en-GB"/>
+        </w:rPr>
+        <w:t xml:space="preserve">logic in the code, rather than </w:t>
+      </w:r>
+      <w:r>
+        <w:rPr>
+          <w:lang w:val="en-GB"/>
+        </w:rPr>
+        <w:t xml:space="preserve">sending a keypress to the keyboard. </w:t>
+      </w:r>
+      <w:r>
+        <w:rPr>
+          <w:lang w:val="en-GB"/>
+        </w:rPr>
+        <w:t xml:space="preserve"> </w:t>
       </w:r>
     </w:p>
     <w:p>
       <w:pPr>
-        <w:rPr>
-          <w:lang w:val="en-GB"/>
-        </w:rPr>
+        <w:keepNext/>
       </w:pPr>
       <w:r>
         <w:rPr>
           <w:lang w:val="en-GB"/>
         </w:rPr>
-        <w:t>Median function</w:t>
-      </w:r>
-      <w:r>
-        <w:rPr>
-          <w:lang w:val="en-GB"/>
-        </w:rPr>
-        <w:t xml:space="preserve"> gets the median value from an array</w:t>
+        <w:drawing>
+          <wp:inline distT="0" distB="0" distL="0" distR="0" wp14:anchorId="11CA37FC" wp14:editId="625D88C4">
+            <wp:extent cx="4108300" cy="1567000"/>
+            <wp:effectExtent l="0" t="0" r="6985" b="0"/>
+            <wp:docPr id="1269932691" name="Picture 1"/>
+            <wp:cNvGraphicFramePr>
+              <a:graphicFrameLocks xmlns:a="http://schemas.openxmlformats.org/drawingml/2006/main" noChangeAspect="1"/>
+            </wp:cNvGraphicFramePr>
+            <a:graphic xmlns:a="http://schemas.openxmlformats.org/drawingml/2006/main">
+              <a:graphicData uri="http://schemas.openxmlformats.org/drawingml/2006/picture">
+                <pic:pic xmlns:pic="http://schemas.openxmlformats.org/drawingml/2006/picture">
+                  <pic:nvPicPr>
+                    <pic:cNvPr id="1269932691" name=""/>
+                    <pic:cNvPicPr/>
+                  </pic:nvPicPr>
+                  <pic:blipFill>
+                    <a:blip r:embed="rId14"/>
+                    <a:stretch>
+                      <a:fillRect/>
+                    </a:stretch>
+                  </pic:blipFill>
+                  <pic:spPr>
+                    <a:xfrm>
+                      <a:off x="0" y="0"/>
+                      <a:ext cx="4112205" cy="1568489"/>
+                    </a:xfrm>
+                    <a:prstGeom prst="rect">
+                      <a:avLst/>
+                    </a:prstGeom>
+                  </pic:spPr>
+                </pic:pic>
+              </a:graphicData>
+            </a:graphic>
+          </wp:inline>
+        </w:drawing>
+      </w:r>
+    </w:p>
+    <w:p>
+      <w:pPr>
+        <w:pStyle w:val="Caption"/>
+        <w:rPr>
+          <w:lang w:val="en-GB"/>
+        </w:rPr>
+      </w:pPr>
+      <w:bookmarkStart w:id="1" w:name="_Ref244281559"/>
+      <w:r>
+        <w:t xml:space="preserve">Figure </w:t>
+      </w:r>
+      <w:r>
+        <w:fldChar w:fldCharType="begin"/>
+      </w:r>
+      <w:r>
+        <w:instrText xml:space="preserve"> SEQ Figure \* ARABIC </w:instrText>
+      </w:r>
+      <w:r>
+        <w:fldChar w:fldCharType="separate"/>
+      </w:r>
+      <w:r>
+        <w:rPr>
+          <w:noProof/>
+        </w:rPr>
+        <w:t>4</w:t>
+      </w:r>
+      <w:r>
+        <w:fldChar w:fldCharType="end"/>
+      </w:r>
+      <w:bookmarkEnd w:id="1"/>
+      <w:r>
+        <w:t xml:space="preserve"> Create button instances </w:t>
+      </w:r>
+    </w:p>
+    <w:p>
+      <w:pPr>
+        <w:rPr>
+          <w:lang w:val="en-GB"/>
+        </w:rPr>
+      </w:pPr>
+      <w:r>
+        <w:rPr>
+          <w:lang w:val="en-GB"/>
+        </w:rPr>
+        <w:t xml:space="preserve">As shown in </w:t>
+      </w:r>
+      <w:r>
+        <w:rPr>
+          <w:lang w:val="en-GB"/>
+        </w:rPr>
+        <w:fldChar w:fldCharType="begin"/>
+      </w:r>
+      <w:r>
+        <w:rPr>
+          <w:lang w:val="en-GB"/>
+        </w:rPr>
+        <w:instrText xml:space="preserve"> REF _Ref244283346 \h </w:instrText>
+      </w:r>
+      <w:r>
+        <w:rPr>
+          <w:lang w:val="en-GB"/>
+        </w:rPr>
+      </w:r>
+      <w:r>
+        <w:rPr>
+          <w:lang w:val="en-GB"/>
+        </w:rPr>
+        <w:fldChar w:fldCharType="separate"/>
+      </w:r>
+      <w:r>
+        <w:t xml:space="preserve">Figure </w:t>
+      </w:r>
+      <w:r>
+        <w:rPr>
+          <w:noProof/>
+        </w:rPr>
+        <w:t>5</w:t>
+      </w:r>
+      <w:r>
+        <w:rPr>
+          <w:lang w:val="en-GB"/>
+        </w:rPr>
+        <w:fldChar w:fldCharType="end"/>
+      </w:r>
+      <w:r>
+        <w:rPr>
+          <w:lang w:val="en-GB"/>
+        </w:rPr>
+        <w:t xml:space="preserve">, the setup function </w:t>
+      </w:r>
+      <w:r>
+        <w:rPr>
+          <w:lang w:val="en-GB"/>
+        </w:rPr>
+        <w:t>sets the pin mode</w:t>
+      </w:r>
+      <w:r>
+        <w:rPr>
+          <w:lang w:val="en-GB"/>
+        </w:rPr>
+        <w:t>s</w:t>
+      </w:r>
+      <w:r>
+        <w:rPr>
+          <w:lang w:val="en-GB"/>
+        </w:rPr>
+        <w:t xml:space="preserve"> for all the pins used. </w:t>
+      </w:r>
+      <w:r>
+        <w:rPr>
+          <w:lang w:val="en-GB"/>
+        </w:rPr>
+        <w:t xml:space="preserve">Each </w:t>
+      </w:r>
+      <w:r>
+        <w:rPr>
+          <w:lang w:val="en-GB"/>
+        </w:rPr>
+        <w:t>button instance</w:t>
+      </w:r>
+      <w:r>
+        <w:rPr>
+          <w:lang w:val="en-GB"/>
+        </w:rPr>
+        <w:t xml:space="preserve"> does this by calling the </w:t>
+      </w:r>
+      <w:proofErr w:type="spellStart"/>
+      <w:proofErr w:type="gramStart"/>
+      <w:r>
+        <w:rPr>
+          <w:lang w:val="en-GB"/>
+        </w:rPr>
+        <w:t>setPinMode</w:t>
+      </w:r>
+      <w:proofErr w:type="spellEnd"/>
+      <w:r>
+        <w:rPr>
+          <w:lang w:val="en-GB"/>
+        </w:rPr>
+        <w:t>(</w:t>
+      </w:r>
+      <w:proofErr w:type="gramEnd"/>
+      <w:r>
+        <w:rPr>
+          <w:lang w:val="en-GB"/>
+        </w:rPr>
+        <w:t xml:space="preserve">) method, which is defined in the Button class shown in </w:t>
+      </w:r>
+      <w:r>
+        <w:rPr>
+          <w:lang w:val="en-GB"/>
+        </w:rPr>
+        <w:fldChar w:fldCharType="begin"/>
+      </w:r>
+      <w:r>
+        <w:rPr>
+          <w:lang w:val="en-GB"/>
+        </w:rPr>
+        <w:instrText xml:space="preserve"> REF _Ref244282348 \h </w:instrText>
+      </w:r>
+      <w:r>
+        <w:rPr>
+          <w:lang w:val="en-GB"/>
+        </w:rPr>
+      </w:r>
+      <w:r>
+        <w:rPr>
+          <w:lang w:val="en-GB"/>
+        </w:rPr>
+        <w:fldChar w:fldCharType="separate"/>
+      </w:r>
+      <w:r>
+        <w:t xml:space="preserve">Figure </w:t>
+      </w:r>
+      <w:r>
+        <w:rPr>
+          <w:noProof/>
+        </w:rPr>
+        <w:t>3</w:t>
+      </w:r>
+      <w:r>
+        <w:rPr>
+          <w:lang w:val="en-GB"/>
+        </w:rPr>
+        <w:fldChar w:fldCharType="end"/>
+      </w:r>
+      <w:r>
+        <w:rPr>
+          <w:lang w:val="en-GB"/>
+        </w:rPr>
+        <w:t xml:space="preserve">. The buttons use INPUT_PULLUP, which makes use of the Leonardo’s built in resistors. </w:t>
+      </w:r>
+      <w:r>
+        <w:rPr>
+          <w:lang w:val="en-GB"/>
+        </w:rPr>
+        <w:t xml:space="preserve">This is also </w:t>
+      </w:r>
+      <w:r>
+        <w:rPr>
+          <w:lang w:val="en-GB"/>
+        </w:rPr>
+        <w:t xml:space="preserve">why </w:t>
+      </w:r>
+      <w:r>
+        <w:rPr>
+          <w:lang w:val="en-GB"/>
+        </w:rPr>
+        <w:t xml:space="preserve">a </w:t>
+      </w:r>
+      <w:r>
+        <w:rPr>
+          <w:lang w:val="en-GB"/>
+        </w:rPr>
+        <w:t xml:space="preserve">button reads LOW when pressed. </w:t>
+      </w:r>
+      <w:r>
+        <w:rPr>
+          <w:lang w:val="en-GB"/>
+        </w:rPr>
+        <w:t xml:space="preserve">The other pins used are for the ultrasonic sensor and the RGB LED. </w:t>
+      </w:r>
+      <w:r>
+        <w:rPr>
+          <w:lang w:val="en-GB"/>
+        </w:rPr>
+        <w:t>The setup function</w:t>
+      </w:r>
+      <w:r>
+        <w:t xml:space="preserve"> then initializes the keyboard and gamepad functionality</w:t>
+      </w:r>
+      <w:r>
+        <w:t xml:space="preserve">. </w:t>
+      </w:r>
+    </w:p>
+    <w:p>
+      <w:pPr>
+        <w:keepNext/>
+      </w:pPr>
+      <w:r>
+        <w:rPr>
+          <w:lang w:val="en-GB"/>
+        </w:rPr>
+        <w:drawing>
+          <wp:inline distT="0" distB="0" distL="0" distR="0" wp14:anchorId="33974E2A" wp14:editId="54EEF9DD">
+            <wp:extent cx="3592595" cy="2913097"/>
+            <wp:effectExtent l="0" t="0" r="8255" b="1905"/>
+            <wp:docPr id="974411285" name="Picture 1"/>
+            <wp:cNvGraphicFramePr>
+              <a:graphicFrameLocks xmlns:a="http://schemas.openxmlformats.org/drawingml/2006/main" noChangeAspect="1"/>
+            </wp:cNvGraphicFramePr>
+            <a:graphic xmlns:a="http://schemas.openxmlformats.org/drawingml/2006/main">
+              <a:graphicData uri="http://schemas.openxmlformats.org/drawingml/2006/picture">
+                <pic:pic xmlns:pic="http://schemas.openxmlformats.org/drawingml/2006/picture">
+                  <pic:nvPicPr>
+                    <pic:cNvPr id="974411285" name=""/>
+                    <pic:cNvPicPr/>
+                  </pic:nvPicPr>
+                  <pic:blipFill>
+                    <a:blip r:embed="rId15"/>
+                    <a:stretch>
+                      <a:fillRect/>
+                    </a:stretch>
+                  </pic:blipFill>
+                  <pic:spPr>
+                    <a:xfrm>
+                      <a:off x="0" y="0"/>
+                      <a:ext cx="3596231" cy="2916045"/>
+                    </a:xfrm>
+                    <a:prstGeom prst="rect">
+                      <a:avLst/>
+                    </a:prstGeom>
+                  </pic:spPr>
+                </pic:pic>
+              </a:graphicData>
+            </a:graphic>
+          </wp:inline>
+        </w:drawing>
+      </w:r>
+    </w:p>
+    <w:p>
+      <w:pPr>
+        <w:pStyle w:val="Caption"/>
+        <w:rPr>
+          <w:lang w:val="en-GB"/>
+        </w:rPr>
+      </w:pPr>
+      <w:bookmarkStart w:id="2" w:name="_Ref244283346"/>
+      <w:r>
+        <w:t xml:space="preserve">Figure </w:t>
+      </w:r>
+      <w:r>
+        <w:fldChar w:fldCharType="begin"/>
+      </w:r>
+      <w:r>
+        <w:instrText xml:space="preserve"> SEQ Figure \* ARABIC </w:instrText>
+      </w:r>
+      <w:r>
+        <w:fldChar w:fldCharType="separate"/>
+      </w:r>
+      <w:r>
+        <w:rPr>
+          <w:noProof/>
+        </w:rPr>
+        <w:t>5</w:t>
+      </w:r>
+      <w:r>
+        <w:fldChar w:fldCharType="end"/>
+      </w:r>
+      <w:bookmarkEnd w:id="2"/>
+      <w:r>
+        <w:t xml:space="preserve"> Setup function</w:t>
+      </w:r>
+    </w:p>
+    <w:p>
+      <w:pPr>
+        <w:rPr>
+          <w:lang w:val="en-GB"/>
+        </w:rPr>
+      </w:pPr>
+      <w:r>
+        <w:rPr>
+          <w:lang w:val="en-GB"/>
+        </w:rPr>
+        <w:t xml:space="preserve">As shown in </w:t>
+      </w:r>
+      <w:r>
+        <w:rPr>
+          <w:lang w:val="en-GB"/>
+        </w:rPr>
+        <w:fldChar w:fldCharType="begin"/>
+      </w:r>
+      <w:r>
+        <w:rPr>
+          <w:lang w:val="en-GB"/>
+        </w:rPr>
+        <w:instrText xml:space="preserve"> REF _Ref244284553 \h </w:instrText>
+      </w:r>
+      <w:r>
+        <w:rPr>
+          <w:lang w:val="en-GB"/>
+        </w:rPr>
+      </w:r>
+      <w:r>
+        <w:rPr>
+          <w:lang w:val="en-GB"/>
+        </w:rPr>
+        <w:fldChar w:fldCharType="separate"/>
+      </w:r>
+      <w:r>
+        <w:t xml:space="preserve">Figure </w:t>
+      </w:r>
+      <w:r>
+        <w:rPr>
+          <w:noProof/>
+        </w:rPr>
+        <w:t>6</w:t>
+      </w:r>
+      <w:r>
+        <w:rPr>
+          <w:lang w:val="en-GB"/>
+        </w:rPr>
+        <w:fldChar w:fldCharType="end"/>
+      </w:r>
+      <w:r>
+        <w:rPr>
+          <w:lang w:val="en-GB"/>
+        </w:rPr>
+        <w:t xml:space="preserve">, </w:t>
+      </w:r>
+      <w:proofErr w:type="spellStart"/>
+      <w:proofErr w:type="gramStart"/>
+      <w:r>
+        <w:rPr>
+          <w:lang w:val="en-GB"/>
+        </w:rPr>
+        <w:t>millis</w:t>
+      </w:r>
+      <w:proofErr w:type="spellEnd"/>
+      <w:r>
+        <w:rPr>
+          <w:lang w:val="en-GB"/>
+        </w:rPr>
+        <w:t>(</w:t>
+      </w:r>
+      <w:proofErr w:type="gramEnd"/>
+      <w:r>
+        <w:rPr>
+          <w:lang w:val="en-GB"/>
+        </w:rPr>
+        <w:t xml:space="preserve">) is used to limit how often the following code runs. Without this limiter, the code would run more </w:t>
+      </w:r>
+      <w:r>
+        <w:rPr>
+          <w:lang w:val="en-GB"/>
+        </w:rPr>
+        <w:t xml:space="preserve">often </w:t>
+      </w:r>
+      <w:r>
+        <w:rPr>
+          <w:lang w:val="en-GB"/>
+        </w:rPr>
+        <w:t>than</w:t>
+      </w:r>
+      <w:r>
+        <w:rPr>
+          <w:lang w:val="en-GB"/>
+        </w:rPr>
+        <w:t xml:space="preserve"> necessary</w:t>
+      </w:r>
+      <w:r>
+        <w:rPr>
+          <w:lang w:val="en-GB"/>
+        </w:rPr>
+        <w:t>. The code</w:t>
+      </w:r>
+      <w:r>
+        <w:rPr>
+          <w:lang w:val="en-GB"/>
+        </w:rPr>
+        <w:t xml:space="preserve"> only runs while the safety is off</w:t>
+      </w:r>
+      <w:r>
+        <w:rPr>
+          <w:lang w:val="en-GB"/>
+        </w:rPr>
+        <w:t xml:space="preserve">. It </w:t>
+      </w:r>
+      <w:r>
+        <w:rPr>
+          <w:lang w:val="en-GB"/>
+        </w:rPr>
+        <w:t xml:space="preserve">triggers the ultrasonic sensor and calculates the distance </w:t>
+      </w:r>
+      <w:r>
+        <w:rPr>
+          <w:lang w:val="en-GB"/>
+        </w:rPr>
+        <w:t>to the detected object</w:t>
+      </w:r>
+      <w:r>
+        <w:rPr>
+          <w:lang w:val="en-GB"/>
+        </w:rPr>
+        <w:t>. This reading is only accepted if it</w:t>
+      </w:r>
+      <w:r>
+        <w:rPr>
+          <w:lang w:val="en-GB"/>
+        </w:rPr>
+        <w:t xml:space="preserve"> is </w:t>
+      </w:r>
+      <w:r>
+        <w:rPr>
+          <w:lang w:val="en-GB"/>
+        </w:rPr>
+        <w:t>within the required range</w:t>
+      </w:r>
+      <w:r>
+        <w:rPr>
+          <w:lang w:val="en-GB"/>
+        </w:rPr>
+        <w:t>,</w:t>
+      </w:r>
+      <w:r>
+        <w:rPr>
+          <w:lang w:val="en-GB"/>
+        </w:rPr>
+        <w:t xml:space="preserve"> </w:t>
+      </w:r>
+      <w:r>
+        <w:rPr>
+          <w:lang w:val="en-GB"/>
+        </w:rPr>
+        <w:t xml:space="preserve">or </w:t>
+      </w:r>
+      <w:r>
+        <w:rPr>
+          <w:lang w:val="en-GB"/>
+        </w:rPr>
+        <w:t xml:space="preserve">within </w:t>
+      </w:r>
+      <w:r>
+        <w:rPr>
+          <w:lang w:val="en-GB"/>
+        </w:rPr>
+        <w:t xml:space="preserve">10% </w:t>
+      </w:r>
+      <w:r>
+        <w:rPr>
+          <w:lang w:val="en-GB"/>
+        </w:rPr>
+        <w:t xml:space="preserve">of </w:t>
+      </w:r>
+      <w:r>
+        <w:rPr>
+          <w:lang w:val="en-GB"/>
+        </w:rPr>
+        <w:t>the range</w:t>
+      </w:r>
+      <w:r>
+        <w:rPr>
+          <w:lang w:val="en-GB"/>
+        </w:rPr>
+        <w:t>’s width beyond either end</w:t>
+      </w:r>
+      <w:r>
+        <w:rPr>
+          <w:lang w:val="en-GB"/>
+        </w:rPr>
+        <w:t xml:space="preserve">. </w:t>
+      </w:r>
+      <w:r>
+        <w:rPr>
+          <w:lang w:val="en-GB"/>
+        </w:rPr>
+        <w:t>Readings further outside than this are discarded as errors. Accepted readings that fall just outside the range are clamped to the limits</w:t>
+      </w:r>
+      <w:r>
+        <w:rPr>
+          <w:lang w:val="en-GB"/>
+        </w:rPr>
+        <w:t xml:space="preserve">. </w:t>
+      </w:r>
+    </w:p>
+    <w:p>
+      <w:pPr>
+        <w:rPr>
+          <w:lang w:val="en-GB"/>
+        </w:rPr>
+      </w:pPr>
+      <w:r>
+        <w:rPr>
+          <w:lang w:val="en-GB"/>
+        </w:rPr>
+        <w:t>Next</w:t>
+      </w:r>
+      <w:r>
+        <w:rPr>
+          <w:lang w:val="en-GB"/>
+        </w:rPr>
+        <w:t xml:space="preserve">, </w:t>
+      </w:r>
+      <w:r>
+        <w:rPr>
+          <w:lang w:val="en-GB"/>
+        </w:rPr>
+        <w:t xml:space="preserve">a rolling median filter </w:t>
+      </w:r>
+      <w:r>
+        <w:rPr>
+          <w:lang w:val="en-GB"/>
+        </w:rPr>
+        <w:t xml:space="preserve">is applied </w:t>
+      </w:r>
+      <w:r>
+        <w:rPr>
+          <w:lang w:val="en-GB"/>
+        </w:rPr>
+        <w:t>to</w:t>
+      </w:r>
+      <w:r>
+        <w:rPr>
+          <w:lang w:val="en-GB"/>
+        </w:rPr>
+        <w:t xml:space="preserve"> prevent inaccurate</w:t>
+      </w:r>
+      <w:r>
+        <w:rPr>
+          <w:lang w:val="en-GB"/>
+        </w:rPr>
+        <w:t xml:space="preserve"> readings</w:t>
+      </w:r>
+      <w:r>
+        <w:rPr>
+          <w:lang w:val="en-GB"/>
+        </w:rPr>
+        <w:t xml:space="preserve"> from affecting the result</w:t>
+      </w:r>
+      <w:r>
+        <w:rPr>
+          <w:lang w:val="en-GB"/>
+        </w:rPr>
+        <w:t xml:space="preserve">. </w:t>
+      </w:r>
+      <w:r>
+        <w:rPr>
+          <w:lang w:val="en-GB"/>
+        </w:rPr>
+        <w:t>The</w:t>
+      </w:r>
+      <w:r>
+        <w:rPr>
+          <w:lang w:val="en-GB"/>
+        </w:rPr>
+        <w:t xml:space="preserve"> rolling median filter </w:t>
+      </w:r>
+      <w:r>
+        <w:rPr>
+          <w:lang w:val="en-GB"/>
+        </w:rPr>
+        <w:t xml:space="preserve">keeps </w:t>
+      </w:r>
+      <w:r>
+        <w:rPr>
+          <w:lang w:val="en-GB"/>
+        </w:rPr>
+        <w:t xml:space="preserve">track of the </w:t>
+      </w:r>
+      <w:r>
+        <w:rPr>
+          <w:lang w:val="en-GB"/>
+        </w:rPr>
+        <w:t xml:space="preserve">5 </w:t>
+      </w:r>
+      <w:r>
+        <w:rPr>
+          <w:lang w:val="en-GB"/>
+        </w:rPr>
+        <w:t xml:space="preserve">most recent readings and </w:t>
+      </w:r>
+      <w:r>
+        <w:rPr>
+          <w:lang w:val="en-GB"/>
+        </w:rPr>
+        <w:t>calculates</w:t>
+      </w:r>
+      <w:r>
+        <w:rPr>
+          <w:lang w:val="en-GB"/>
+        </w:rPr>
+        <w:t xml:space="preserve"> the</w:t>
+      </w:r>
+      <w:r>
+        <w:rPr>
+          <w:lang w:val="en-GB"/>
+        </w:rPr>
+        <w:t xml:space="preserve">ir </w:t>
+      </w:r>
+      <w:r>
+        <w:rPr>
+          <w:lang w:val="en-GB"/>
+        </w:rPr>
+        <w:t>median value</w:t>
+      </w:r>
+      <w:r>
+        <w:rPr>
+          <w:lang w:val="en-GB"/>
+        </w:rPr>
+        <w:t xml:space="preserve"> using the </w:t>
+      </w:r>
+      <w:proofErr w:type="gramStart"/>
+      <w:r>
+        <w:rPr>
+          <w:lang w:val="en-GB"/>
+        </w:rPr>
+        <w:t>median(</w:t>
+      </w:r>
+      <w:proofErr w:type="gramEnd"/>
+      <w:r>
+        <w:rPr>
+          <w:lang w:val="en-GB"/>
+        </w:rPr>
+        <w:t xml:space="preserve">) function, as shown in </w:t>
+      </w:r>
+      <w:r>
+        <w:rPr>
+          <w:lang w:val="en-GB"/>
+        </w:rPr>
+        <w:fldChar w:fldCharType="begin"/>
+      </w:r>
+      <w:r>
+        <w:rPr>
+          <w:lang w:val="en-GB"/>
+        </w:rPr>
+        <w:instrText xml:space="preserve"> REF _Ref244285394 \h </w:instrText>
+      </w:r>
+      <w:r>
+        <w:rPr>
+          <w:lang w:val="en-GB"/>
+        </w:rPr>
+      </w:r>
+      <w:r>
+        <w:rPr>
+          <w:lang w:val="en-GB"/>
+        </w:rPr>
+        <w:fldChar w:fldCharType="separate"/>
+      </w:r>
+      <w:r>
+        <w:t xml:space="preserve">Figure </w:t>
+      </w:r>
+      <w:r>
+        <w:rPr>
+          <w:noProof/>
+        </w:rPr>
+        <w:t>7</w:t>
+      </w:r>
+      <w:r>
+        <w:rPr>
+          <w:lang w:val="en-GB"/>
+        </w:rPr>
+        <w:fldChar w:fldCharType="end"/>
+      </w:r>
+      <w:r>
+        <w:rPr>
+          <w:lang w:val="en-GB"/>
+        </w:rPr>
+        <w:t>.</w:t>
+      </w:r>
+      <w:r>
+        <w:rPr>
+          <w:lang w:val="en-GB"/>
+        </w:rPr>
+        <w:t xml:space="preserve"> </w:t>
+      </w:r>
+      <w:r>
+        <w:rPr>
+          <w:lang w:val="en-GB"/>
+        </w:rPr>
+        <w:t xml:space="preserve">The median is used instead of the average </w:t>
+      </w:r>
+      <w:r>
+        <w:rPr>
+          <w:lang w:val="en-GB"/>
+        </w:rPr>
+        <w:lastRenderedPageBreak/>
+        <w:t xml:space="preserve">because the average would be pulled towards outliers, whereas the median is not. </w:t>
+      </w:r>
+      <w:r>
+        <w:rPr>
+          <w:lang w:val="en-GB"/>
+        </w:rPr>
+        <w:t xml:space="preserve">The median value </w:t>
+      </w:r>
+      <w:r>
+        <w:rPr>
+          <w:lang w:val="en-GB"/>
+        </w:rPr>
+        <w:t>is then used as the filtered distance</w:t>
+      </w:r>
+      <w:r>
+        <w:rPr>
+          <w:lang w:val="en-GB"/>
+        </w:rPr>
+        <w:t xml:space="preserve">. </w:t>
+      </w:r>
+      <w:r>
+        <w:rPr>
+          <w:lang w:val="en-GB"/>
+        </w:rPr>
+        <w:t xml:space="preserve">After each new </w:t>
+      </w:r>
+      <w:r>
+        <w:rPr>
+          <w:lang w:val="en-GB"/>
+        </w:rPr>
+        <w:t xml:space="preserve">reading, </w:t>
+      </w:r>
+      <w:r>
+        <w:rPr>
+          <w:lang w:val="en-GB"/>
+        </w:rPr>
+        <w:t>the array</w:t>
+      </w:r>
+      <w:r>
+        <w:rPr>
+          <w:lang w:val="en-GB"/>
+        </w:rPr>
+        <w:t xml:space="preserve"> </w:t>
+      </w:r>
+      <w:r>
+        <w:rPr>
+          <w:lang w:val="en-GB"/>
+        </w:rPr>
+        <w:t>is updated</w:t>
+      </w:r>
+      <w:r>
+        <w:rPr>
+          <w:lang w:val="en-GB"/>
+        </w:rPr>
+        <w:t xml:space="preserve"> to contain the 5 most recent readings. This is </w:t>
+      </w:r>
+      <w:r>
+        <w:rPr>
+          <w:lang w:val="en-GB"/>
+        </w:rPr>
+        <w:t>more efficient</w:t>
+      </w:r>
+      <w:r>
+        <w:rPr>
+          <w:lang w:val="en-GB"/>
+        </w:rPr>
+        <w:t xml:space="preserve"> than taking 5 new readings </w:t>
+      </w:r>
+      <w:r>
+        <w:rPr>
+          <w:lang w:val="en-GB"/>
+        </w:rPr>
+        <w:t>each time the median is calculated</w:t>
+      </w:r>
+      <w:r>
+        <w:rPr>
+          <w:lang w:val="en-GB"/>
+        </w:rPr>
+        <w:t xml:space="preserve">. </w:t>
+      </w:r>
+      <w:r>
+        <w:rPr>
+          <w:lang w:val="en-GB"/>
+        </w:rPr>
+        <w:t>Finally, the filtered value is</w:t>
+      </w:r>
+      <w:r>
+        <w:rPr>
+          <w:lang w:val="en-GB"/>
+        </w:rPr>
+        <w:t xml:space="preserve"> map</w:t>
+      </w:r>
+      <w:r>
+        <w:rPr>
+          <w:lang w:val="en-GB"/>
+        </w:rPr>
+        <w:t>ped from the</w:t>
+      </w:r>
+      <w:r>
+        <w:rPr>
+          <w:lang w:val="en-GB"/>
+        </w:rPr>
+        <w:t xml:space="preserve"> minimum and maximum distance</w:t>
+      </w:r>
+      <w:r>
+        <w:rPr>
+          <w:lang w:val="en-GB"/>
+        </w:rPr>
+        <w:t xml:space="preserve"> range</w:t>
+      </w:r>
+      <w:r>
+        <w:rPr>
+          <w:lang w:val="en-GB"/>
+        </w:rPr>
+        <w:t xml:space="preserve"> to the minimum and maximum values </w:t>
+      </w:r>
+      <w:r>
+        <w:rPr>
+          <w:lang w:val="en-GB"/>
+        </w:rPr>
+        <w:t>accepted by</w:t>
+      </w:r>
+      <w:r>
+        <w:rPr>
+          <w:lang w:val="en-GB"/>
+        </w:rPr>
+        <w:t xml:space="preserve"> the joystic</w:t>
+      </w:r>
+      <w:r>
+        <w:rPr>
+          <w:lang w:val="en-GB"/>
+        </w:rPr>
+        <w:t>k</w:t>
+      </w:r>
+      <w:r>
+        <w:rPr>
+          <w:lang w:val="en-GB"/>
+        </w:rPr>
+        <w:t xml:space="preserve">. </w:t>
+      </w:r>
+    </w:p>
+    <w:p>
+      <w:pPr>
+        <w:keepNext/>
+      </w:pPr>
+      <w:r>
+        <w:rPr>
+          <w:lang w:val="en-GB"/>
+        </w:rPr>
+        <w:drawing>
+          <wp:inline distT="0" distB="0" distL="0" distR="0" wp14:anchorId="2FA50072" wp14:editId="22F18363">
+            <wp:extent cx="5731510" cy="4704715"/>
+            <wp:effectExtent l="0" t="0" r="2540" b="635"/>
+            <wp:docPr id="1903358209" name="Picture 1"/>
+            <wp:cNvGraphicFramePr>
+              <a:graphicFrameLocks xmlns:a="http://schemas.openxmlformats.org/drawingml/2006/main" noChangeAspect="1"/>
+            </wp:cNvGraphicFramePr>
+            <a:graphic xmlns:a="http://schemas.openxmlformats.org/drawingml/2006/main">
+              <a:graphicData uri="http://schemas.openxmlformats.org/drawingml/2006/picture">
+                <pic:pic xmlns:pic="http://schemas.openxmlformats.org/drawingml/2006/picture">
+                  <pic:nvPicPr>
+                    <pic:cNvPr id="1903358209" name=""/>
+                    <pic:cNvPicPr/>
+                  </pic:nvPicPr>
+                  <pic:blipFill>
+                    <a:blip r:embed="rId16"/>
+                    <a:stretch>
+                      <a:fillRect/>
+                    </a:stretch>
+                  </pic:blipFill>
+                  <pic:spPr>
+                    <a:xfrm>
+                      <a:off x="0" y="0"/>
+                      <a:ext cx="5731510" cy="4704715"/>
+                    </a:xfrm>
+                    <a:prstGeom prst="rect">
+                      <a:avLst/>
+                    </a:prstGeom>
+                  </pic:spPr>
+                </pic:pic>
+              </a:graphicData>
+            </a:graphic>
+          </wp:inline>
+        </w:drawing>
+      </w:r>
+    </w:p>
+    <w:p>
+      <w:pPr>
+        <w:pStyle w:val="Caption"/>
+        <w:rPr>
+          <w:lang w:val="en-GB"/>
+        </w:rPr>
+      </w:pPr>
+      <w:bookmarkStart w:id="3" w:name="_Ref244284553"/>
+      <w:r>
+        <w:t xml:space="preserve">Figure </w:t>
+      </w:r>
+      <w:r>
+        <w:fldChar w:fldCharType="begin"/>
+      </w:r>
+      <w:r>
+        <w:instrText xml:space="preserve"> SEQ Figure \* ARABIC </w:instrText>
+      </w:r>
+      <w:r>
+        <w:fldChar w:fldCharType="separate"/>
+      </w:r>
+      <w:r>
+        <w:rPr>
+          <w:noProof/>
+        </w:rPr>
+        <w:t>6</w:t>
+      </w:r>
+      <w:r>
+        <w:fldChar w:fldCharType="end"/>
+      </w:r>
+      <w:bookmarkEnd w:id="3"/>
+      <w:r>
+        <w:t xml:space="preserve"> Ultrasonic sensor reading and filtering</w:t>
+      </w:r>
+    </w:p>
+    <w:p>
+      <w:pPr>
+        <w:keepNext/>
+      </w:pPr>
+      <w:r>
+        <w:rPr>
+          <w:lang w:val="en-GB"/>
+        </w:rPr>
+        <w:lastRenderedPageBreak/>
+        <w:drawing>
+          <wp:inline distT="0" distB="0" distL="0" distR="0" wp14:anchorId="21EA9C69" wp14:editId="465D869E">
+            <wp:extent cx="4988030" cy="3709246"/>
+            <wp:effectExtent l="0" t="0" r="3175" b="5715"/>
+            <wp:docPr id="1515613143" name="Picture 1"/>
+            <wp:cNvGraphicFramePr>
+              <a:graphicFrameLocks xmlns:a="http://schemas.openxmlformats.org/drawingml/2006/main" noChangeAspect="1"/>
+            </wp:cNvGraphicFramePr>
+            <a:graphic xmlns:a="http://schemas.openxmlformats.org/drawingml/2006/main">
+              <a:graphicData uri="http://schemas.openxmlformats.org/drawingml/2006/picture">
+                <pic:pic xmlns:pic="http://schemas.openxmlformats.org/drawingml/2006/picture">
+                  <pic:nvPicPr>
+                    <pic:cNvPr id="1515613143" name=""/>
+                    <pic:cNvPicPr/>
+                  </pic:nvPicPr>
+                  <pic:blipFill>
+                    <a:blip r:embed="rId17"/>
+                    <a:stretch>
+                      <a:fillRect/>
+                    </a:stretch>
+                  </pic:blipFill>
+                  <pic:spPr>
+                    <a:xfrm>
+                      <a:off x="0" y="0"/>
+                      <a:ext cx="4992348" cy="3712457"/>
+                    </a:xfrm>
+                    <a:prstGeom prst="rect">
+                      <a:avLst/>
+                    </a:prstGeom>
+                  </pic:spPr>
+                </pic:pic>
+              </a:graphicData>
+            </a:graphic>
+          </wp:inline>
+        </w:drawing>
+      </w:r>
+    </w:p>
+    <w:p>
+      <w:pPr>
+        <w:pStyle w:val="Caption"/>
+        <w:rPr>
+          <w:lang w:val="en-GB"/>
+        </w:rPr>
+      </w:pPr>
+      <w:bookmarkStart w:id="4" w:name="_Ref244285394"/>
+      <w:r>
+        <w:t xml:space="preserve">Figure </w:t>
+      </w:r>
+      <w:r>
+        <w:fldChar w:fldCharType="begin"/>
+      </w:r>
+      <w:r>
+        <w:instrText xml:space="preserve"> SEQ Figure \* ARABIC </w:instrText>
+      </w:r>
+      <w:r>
+        <w:fldChar w:fldCharType="separate"/>
+      </w:r>
+      <w:r>
+        <w:rPr>
+          <w:noProof/>
+        </w:rPr>
+        <w:t>7</w:t>
+      </w:r>
+      <w:r>
+        <w:fldChar w:fldCharType="end"/>
+      </w:r>
+      <w:bookmarkEnd w:id="4"/>
+      <w:r>
+        <w:t xml:space="preserve"> Median function</w:t>
+      </w:r>
+    </w:p>
+    <w:p>
+      <w:pPr>
+        <w:keepNext/>
+        <w:rPr>
+          <w:lang w:val="en-GB"/>
+        </w:rPr>
+      </w:pPr>
+      <w:r>
+        <w:rPr>
+          <w:lang w:val="en-GB"/>
+        </w:rPr>
+        <w:t xml:space="preserve">As shown in </w:t>
+      </w:r>
+      <w:r>
+        <w:rPr>
+          <w:lang w:val="en-GB"/>
+        </w:rPr>
+        <w:fldChar w:fldCharType="begin"/>
+      </w:r>
+      <w:r>
+        <w:rPr>
+          <w:lang w:val="en-GB"/>
+        </w:rPr>
+        <w:instrText xml:space="preserve"> REF _Ref244286643 \h </w:instrText>
+      </w:r>
+      <w:r>
+        <w:rPr>
+          <w:lang w:val="en-GB"/>
+        </w:rPr>
+      </w:r>
+      <w:r>
+        <w:rPr>
+          <w:lang w:val="en-GB"/>
+        </w:rPr>
+        <w:fldChar w:fldCharType="separate"/>
+      </w:r>
+      <w:r>
+        <w:t xml:space="preserve">Figure </w:t>
+      </w:r>
+      <w:r>
+        <w:rPr>
+          <w:noProof/>
+        </w:rPr>
+        <w:t>8</w:t>
+      </w:r>
+      <w:r>
+        <w:rPr>
+          <w:lang w:val="en-GB"/>
+        </w:rPr>
+        <w:fldChar w:fldCharType="end"/>
+      </w:r>
+      <w:r>
+        <w:rPr>
+          <w:lang w:val="en-GB"/>
+        </w:rPr>
+        <w:t xml:space="preserve">, </w:t>
+      </w:r>
+      <w:r>
+        <w:rPr>
+          <w:lang w:val="en-GB"/>
+        </w:rPr>
+        <w:t>t</w:t>
+      </w:r>
+      <w:r>
+        <w:rPr>
+          <w:lang w:val="en-GB"/>
+        </w:rPr>
+        <w:t xml:space="preserve">he button instances call the </w:t>
+      </w:r>
+      <w:proofErr w:type="gramStart"/>
+      <w:r>
+        <w:rPr>
+          <w:lang w:val="en-GB"/>
+        </w:rPr>
+        <w:t>debounce(</w:t>
+      </w:r>
+      <w:proofErr w:type="gramEnd"/>
+      <w:r>
+        <w:rPr>
+          <w:lang w:val="en-GB"/>
+        </w:rPr>
+        <w:t xml:space="preserve">) method, shown in </w:t>
+      </w:r>
+      <w:r>
+        <w:rPr>
+          <w:lang w:val="en-GB"/>
+        </w:rPr>
+        <w:fldChar w:fldCharType="begin"/>
+      </w:r>
+      <w:r>
+        <w:rPr>
+          <w:lang w:val="en-GB"/>
+        </w:rPr>
+        <w:instrText xml:space="preserve"> REF _Ref244282348 \h </w:instrText>
+      </w:r>
+      <w:r>
+        <w:rPr>
+          <w:lang w:val="en-GB"/>
+        </w:rPr>
+      </w:r>
+      <w:r>
+        <w:rPr>
+          <w:lang w:val="en-GB"/>
+        </w:rPr>
+        <w:fldChar w:fldCharType="separate"/>
+      </w:r>
+      <w:r>
+        <w:t xml:space="preserve">Figure </w:t>
+      </w:r>
+      <w:r>
+        <w:rPr>
+          <w:noProof/>
+        </w:rPr>
+        <w:t>3</w:t>
+      </w:r>
+      <w:r>
+        <w:rPr>
+          <w:lang w:val="en-GB"/>
+        </w:rPr>
+        <w:fldChar w:fldCharType="end"/>
+      </w:r>
+      <w:r>
+        <w:rPr>
+          <w:lang w:val="en-GB"/>
+        </w:rPr>
+        <w:t xml:space="preserve">, to </w:t>
+      </w:r>
+      <w:r>
+        <w:rPr>
+          <w:lang w:val="en-GB"/>
+        </w:rPr>
+        <w:t xml:space="preserve">stop electrical </w:t>
+      </w:r>
+      <w:r>
+        <w:rPr>
+          <w:lang w:val="en-GB"/>
+        </w:rPr>
+        <w:t>fluctuations</w:t>
+      </w:r>
+      <w:r>
+        <w:rPr>
+          <w:lang w:val="en-GB"/>
+        </w:rPr>
+        <w:t xml:space="preserve"> from being read as extra</w:t>
+      </w:r>
+      <w:r>
+        <w:rPr>
+          <w:lang w:val="en-GB"/>
+        </w:rPr>
+        <w:t xml:space="preserve"> button presses</w:t>
+      </w:r>
+      <w:r>
+        <w:rPr>
+          <w:lang w:val="en-GB"/>
+        </w:rPr>
+        <w:t xml:space="preserve">. </w:t>
+      </w:r>
+      <w:r>
+        <w:rPr>
+          <w:lang w:val="en-GB"/>
+        </w:rPr>
+        <w:t xml:space="preserve">Because these </w:t>
+      </w:r>
+      <w:r>
+        <w:rPr>
+          <w:lang w:val="en-GB"/>
+        </w:rPr>
+        <w:t xml:space="preserve">fluctuations are extremely short, </w:t>
+      </w:r>
+      <w:r>
+        <w:rPr>
+          <w:lang w:val="en-GB"/>
+        </w:rPr>
+        <w:t>the code only accepts a reading if it stays the same for long enough</w:t>
+      </w:r>
+      <w:r>
+        <w:rPr>
+          <w:lang w:val="en-GB"/>
+        </w:rPr>
+        <w:t xml:space="preserve">. In this case, the code waits to see if the input is the same for longer than the </w:t>
+      </w:r>
+      <w:proofErr w:type="spellStart"/>
+      <w:r>
+        <w:rPr>
+          <w:lang w:val="en-GB"/>
+        </w:rPr>
+        <w:t>debounceDelay</w:t>
+      </w:r>
+      <w:proofErr w:type="spellEnd"/>
+      <w:r>
+        <w:rPr>
+          <w:lang w:val="en-GB"/>
+        </w:rPr>
+        <w:t xml:space="preserve"> variable, which is 50 milliseconds. </w:t>
+      </w:r>
+    </w:p>
+    <w:p>
+      <w:pPr>
+        <w:keepNext/>
+        <w:rPr>
+          <w:lang w:val="en-GB"/>
+        </w:rPr>
+      </w:pPr>
+      <w:r>
+        <w:rPr>
+          <w:lang w:val="en-GB"/>
+        </w:rPr>
+        <w:t xml:space="preserve">The safety button is handled separately because it also detects long presses. </w:t>
+      </w:r>
+      <w:r>
+        <w:rPr>
+          <w:lang w:val="en-GB"/>
+        </w:rPr>
+        <w:t xml:space="preserve">A short press of the safety button toggles the safety, while a long press toggles the LED. </w:t>
+      </w:r>
+      <w:r>
+        <w:rPr>
+          <w:lang w:val="en-GB"/>
+        </w:rPr>
+        <w:t>If the button is held for more than a second, the long press logic triggers immediately without waiting for the button to be released.</w:t>
+      </w:r>
+      <w:r>
+        <w:rPr>
+          <w:lang w:val="en-GB"/>
+        </w:rPr>
+        <w:t xml:space="preserve"> </w:t>
+      </w:r>
+      <w:r>
+        <w:rPr>
+          <w:lang w:val="en-GB"/>
+        </w:rPr>
+        <w:t xml:space="preserve">For a short press, the code waits for the button to be released before toggling the safety, provided a long press hasn’t already been detected. This ensures a long press doesn’t also toggle the safety. </w:t>
+      </w:r>
+    </w:p>
+    <w:p>
+      <w:pPr>
+        <w:keepNext/>
+      </w:pPr>
+      <w:r>
+        <w:rPr>
+          <w:lang w:val="en-GB"/>
+        </w:rPr>
+        <w:drawing>
+          <wp:inline distT="0" distB="0" distL="0" distR="0" wp14:anchorId="431C7598" wp14:editId="3AA252C3">
+            <wp:extent cx="4394824" cy="2435511"/>
+            <wp:effectExtent l="0" t="0" r="6350" b="3175"/>
+            <wp:docPr id="1741715939" name="Picture 1"/>
+            <wp:cNvGraphicFramePr>
+              <a:graphicFrameLocks xmlns:a="http://schemas.openxmlformats.org/drawingml/2006/main" noChangeAspect="1"/>
+            </wp:cNvGraphicFramePr>
+            <a:graphic xmlns:a="http://schemas.openxmlformats.org/drawingml/2006/main">
+              <a:graphicData uri="http://schemas.openxmlformats.org/drawingml/2006/picture">
+                <pic:pic xmlns:pic="http://schemas.openxmlformats.org/drawingml/2006/picture">
+                  <pic:nvPicPr>
+                    <pic:cNvPr id="1741715939" name=""/>
+                    <pic:cNvPicPr/>
+                  </pic:nvPicPr>
+                  <pic:blipFill>
+                    <a:blip r:embed="rId18"/>
+                    <a:stretch>
+                      <a:fillRect/>
+                    </a:stretch>
+                  </pic:blipFill>
+                  <pic:spPr>
+                    <a:xfrm>
+                      <a:off x="0" y="0"/>
+                      <a:ext cx="4428787" cy="2454332"/>
+                    </a:xfrm>
+                    <a:prstGeom prst="rect">
+                      <a:avLst/>
+                    </a:prstGeom>
+                  </pic:spPr>
+                </pic:pic>
+              </a:graphicData>
+            </a:graphic>
+          </wp:inline>
+        </w:drawing>
+      </w:r>
+    </w:p>
+    <w:p>
+      <w:pPr>
+        <w:pStyle w:val="Caption"/>
+        <w:rPr>
+          <w:lang w:val="en-GB"/>
+        </w:rPr>
+      </w:pPr>
+      <w:bookmarkStart w:id="5" w:name="_Ref244286643"/>
+      <w:r>
+        <w:t xml:space="preserve">Figure </w:t>
+      </w:r>
+      <w:r>
+        <w:fldChar w:fldCharType="begin"/>
+      </w:r>
+      <w:r>
+        <w:instrText xml:space="preserve"> SEQ Figure \* ARABIC </w:instrText>
+      </w:r>
+      <w:r>
+        <w:fldChar w:fldCharType="separate"/>
+      </w:r>
+      <w:r>
+        <w:rPr>
+          <w:noProof/>
+        </w:rPr>
+        <w:t>8</w:t>
+      </w:r>
+      <w:r>
+        <w:fldChar w:fldCharType="end"/>
+      </w:r>
+      <w:bookmarkEnd w:id="5"/>
+      <w:r>
+        <w:t xml:space="preserve"> Debounce buttons</w:t>
+      </w:r>
+    </w:p>
+    <w:p>
+      <w:pPr>
+        <w:rPr>
+          <w:lang w:val="en-GB"/>
+        </w:rPr>
+      </w:pPr>
+      <w:r>
+        <w:rPr>
+          <w:rStyle w:val="Heading3Char"/>
+          <w:rFonts w:eastAsia="Calibri"/>
+          <w:u w:val="double"/>
+          <w:lang w:val="en-GB"/>
+        </w:rPr>
+        <w:lastRenderedPageBreak/>
+        <w:t>Interface</w:t>
+      </w:r>
+    </w:p>
+    <w:p>
+      <w:pPr>
+        <w:rPr>
+          <w:lang w:val="en-GB"/>
+        </w:rPr>
+      </w:pPr>
+      <w:r>
+        <w:rPr>
+          <w:lang w:val="en-GB"/>
+        </w:rPr>
+        <w:t xml:space="preserve">The code shown in </w:t>
+      </w:r>
+      <w:r>
+        <w:rPr>
+          <w:lang w:val="en-GB"/>
+        </w:rPr>
+        <w:fldChar w:fldCharType="begin"/>
+      </w:r>
+      <w:r>
+        <w:rPr>
+          <w:lang w:val="en-GB"/>
+        </w:rPr>
+        <w:instrText xml:space="preserve"> REF _Ref244288347 \h </w:instrText>
+      </w:r>
+      <w:r>
+        <w:rPr>
+          <w:lang w:val="en-GB"/>
+        </w:rPr>
+      </w:r>
+      <w:r>
+        <w:rPr>
+          <w:lang w:val="en-GB"/>
+        </w:rPr>
+        <w:fldChar w:fldCharType="separate"/>
+      </w:r>
+      <w:r>
+        <w:t xml:space="preserve">Figure </w:t>
+      </w:r>
+      <w:r>
+        <w:rPr>
+          <w:noProof/>
+        </w:rPr>
+        <w:t>9</w:t>
+      </w:r>
+      <w:r>
+        <w:rPr>
+          <w:lang w:val="en-GB"/>
+        </w:rPr>
+        <w:fldChar w:fldCharType="end"/>
+      </w:r>
+      <w:r>
+        <w:rPr>
+          <w:lang w:val="en-GB"/>
+        </w:rPr>
+        <w:t xml:space="preserve"> determines what inputs are </w:t>
+      </w:r>
+      <w:proofErr w:type="gramStart"/>
+      <w:r>
+        <w:rPr>
+          <w:lang w:val="en-GB"/>
+        </w:rPr>
+        <w:t>actually sent</w:t>
+      </w:r>
+      <w:proofErr w:type="gramEnd"/>
+      <w:r>
+        <w:rPr>
+          <w:lang w:val="en-GB"/>
+        </w:rPr>
+        <w:t xml:space="preserve"> to the computer. If the safety is on, the controller</w:t>
+      </w:r>
+      <w:r>
+        <w:rPr>
+          <w:lang w:val="en-GB"/>
+        </w:rPr>
+        <w:t xml:space="preserve"> inputs</w:t>
+      </w:r>
+      <w:r>
+        <w:rPr>
+          <w:lang w:val="en-GB"/>
+        </w:rPr>
+        <w:t xml:space="preserve"> should be dis</w:t>
+      </w:r>
+      <w:r>
+        <w:rPr>
+          <w:lang w:val="en-GB"/>
+        </w:rPr>
+        <w:t>abled</w:t>
+      </w:r>
+      <w:r>
+        <w:rPr>
+          <w:lang w:val="en-GB"/>
+        </w:rPr>
+        <w:t xml:space="preserve">, so </w:t>
+      </w:r>
+      <w:r>
+        <w:rPr>
+          <w:lang w:val="en-GB"/>
+        </w:rPr>
+        <w:t>the code</w:t>
+      </w:r>
+      <w:r>
+        <w:rPr>
+          <w:lang w:val="en-GB"/>
+        </w:rPr>
+        <w:t xml:space="preserve"> releases all keys and sends a neutral joystick input to the computer. </w:t>
+      </w:r>
+      <w:r>
+        <w:rPr>
+          <w:lang w:val="en-GB"/>
+        </w:rPr>
+        <w:t xml:space="preserve">If the safety is off, </w:t>
+      </w:r>
+      <w:r>
+        <w:rPr>
+          <w:lang w:val="en-GB"/>
+        </w:rPr>
+        <w:t>t</w:t>
+      </w:r>
+      <w:r>
+        <w:rPr>
+          <w:lang w:val="en-GB"/>
+        </w:rPr>
+        <w:t>he joystick value is sent to the computer</w:t>
+      </w:r>
+      <w:r>
+        <w:rPr>
+          <w:lang w:val="en-GB"/>
+        </w:rPr>
+        <w:t>, and</w:t>
+      </w:r>
+      <w:r>
+        <w:rPr>
+          <w:lang w:val="en-GB"/>
+        </w:rPr>
+        <w:t xml:space="preserve"> </w:t>
+      </w:r>
+      <w:r>
+        <w:rPr>
+          <w:lang w:val="en-GB"/>
+        </w:rPr>
+        <w:t xml:space="preserve">each button instance calls the </w:t>
+      </w:r>
+      <w:proofErr w:type="spellStart"/>
+      <w:proofErr w:type="gramStart"/>
+      <w:r>
+        <w:rPr>
+          <w:lang w:val="en-GB"/>
+        </w:rPr>
+        <w:t>buttonControl</w:t>
+      </w:r>
+      <w:proofErr w:type="spellEnd"/>
+      <w:r>
+        <w:rPr>
+          <w:lang w:val="en-GB"/>
+        </w:rPr>
+        <w:t>(</w:t>
+      </w:r>
+      <w:proofErr w:type="gramEnd"/>
+      <w:r>
+        <w:rPr>
+          <w:lang w:val="en-GB"/>
+        </w:rPr>
+        <w:t xml:space="preserve">) method shown in </w:t>
+      </w:r>
+      <w:r>
+        <w:rPr>
+          <w:lang w:val="en-GB"/>
+        </w:rPr>
+        <w:fldChar w:fldCharType="begin"/>
+      </w:r>
+      <w:r>
+        <w:rPr>
+          <w:lang w:val="en-GB"/>
+        </w:rPr>
+        <w:instrText xml:space="preserve"> REF _Ref244282348 \h </w:instrText>
+      </w:r>
+      <w:r>
+        <w:rPr>
+          <w:lang w:val="en-GB"/>
+        </w:rPr>
+      </w:r>
+      <w:r>
+        <w:rPr>
+          <w:lang w:val="en-GB"/>
+        </w:rPr>
+        <w:fldChar w:fldCharType="separate"/>
+      </w:r>
+      <w:r>
+        <w:t xml:space="preserve">Figure </w:t>
+      </w:r>
+      <w:r>
+        <w:rPr>
+          <w:noProof/>
+        </w:rPr>
+        <w:t>3</w:t>
+      </w:r>
+      <w:r>
+        <w:rPr>
+          <w:lang w:val="en-GB"/>
+        </w:rPr>
+        <w:fldChar w:fldCharType="end"/>
+      </w:r>
+      <w:r>
+        <w:rPr>
+          <w:lang w:val="en-GB"/>
+        </w:rPr>
+        <w:t xml:space="preserve">, which checks if the button is currently pressed, and if so, sends that keypress to the computer, otherwise it releases its respective key. </w:t>
+      </w:r>
+    </w:p>
+    <w:p>
+      <w:pPr>
+        <w:rPr>
+          <w:lang w:val="en-GB"/>
+        </w:rPr>
+      </w:pPr>
+      <w:r>
+        <w:rPr>
+          <w:lang w:val="en-GB"/>
+        </w:rPr>
+        <w:t xml:space="preserve">The final piece of code controls the LED, which can be </w:t>
+      </w:r>
+      <w:r>
+        <w:rPr>
+          <w:lang w:val="en-GB"/>
+        </w:rPr>
+        <w:t>enabled or disabled</w:t>
+      </w:r>
+      <w:r>
+        <w:rPr>
+          <w:lang w:val="en-GB"/>
+        </w:rPr>
+        <w:t xml:space="preserve">. If it’s </w:t>
+      </w:r>
+      <w:r>
+        <w:rPr>
+          <w:lang w:val="en-GB"/>
+        </w:rPr>
+        <w:t>disabled</w:t>
+      </w:r>
+      <w:r>
+        <w:rPr>
+          <w:lang w:val="en-GB"/>
+        </w:rPr>
+        <w:t xml:space="preserve">, then the light is simply turned off. If it’s </w:t>
+      </w:r>
+      <w:r>
+        <w:rPr>
+          <w:lang w:val="en-GB"/>
+        </w:rPr>
+        <w:t>enabled</w:t>
+      </w:r>
+      <w:r>
+        <w:rPr>
+          <w:lang w:val="en-GB"/>
+        </w:rPr>
+        <w:t xml:space="preserve">, </w:t>
+      </w:r>
+      <w:r>
+        <w:rPr>
+          <w:lang w:val="en-GB"/>
+        </w:rPr>
+        <w:t xml:space="preserve">it shows a red light if the safety is on, and a green light if the safety is off. </w:t>
+      </w:r>
+    </w:p>
+    <w:p>
+      <w:pPr>
+        <w:keepNext/>
+      </w:pPr>
+      <w:r>
+        <w:rPr>
+          <w:lang w:val="en-GB"/>
+        </w:rPr>
+        <w:drawing>
+          <wp:inline distT="0" distB="0" distL="0" distR="0" wp14:anchorId="5856185D" wp14:editId="21E1D57E">
+            <wp:extent cx="4506995" cy="3067912"/>
+            <wp:effectExtent l="0" t="0" r="8255" b="0"/>
+            <wp:docPr id="1771953383" name="Picture 1"/>
+            <wp:cNvGraphicFramePr>
+              <a:graphicFrameLocks xmlns:a="http://schemas.openxmlformats.org/drawingml/2006/main" noChangeAspect="1"/>
+            </wp:cNvGraphicFramePr>
+            <a:graphic xmlns:a="http://schemas.openxmlformats.org/drawingml/2006/main">
+              <a:graphicData uri="http://schemas.openxmlformats.org/drawingml/2006/picture">
+                <pic:pic xmlns:pic="http://schemas.openxmlformats.org/drawingml/2006/picture">
+                  <pic:nvPicPr>
+                    <pic:cNvPr id="1771953383" name=""/>
+                    <pic:cNvPicPr/>
+                  </pic:nvPicPr>
+                  <pic:blipFill>
+                    <a:blip r:embed="rId19"/>
+                    <a:stretch>
+                      <a:fillRect/>
+                    </a:stretch>
+                  </pic:blipFill>
+                  <pic:spPr>
+                    <a:xfrm>
+                      <a:off x="0" y="0"/>
+                      <a:ext cx="4513380" cy="3072258"/>
+                    </a:xfrm>
+                    <a:prstGeom prst="rect">
+                      <a:avLst/>
+                    </a:prstGeom>
+                  </pic:spPr>
+                </pic:pic>
+              </a:graphicData>
+            </a:graphic>
+          </wp:inline>
+        </w:drawing>
+      </w:r>
+    </w:p>
+    <w:p>
+      <w:pPr>
+        <w:pStyle w:val="Caption"/>
+        <w:rPr>
+          <w:lang w:val="en-GB"/>
+        </w:rPr>
+      </w:pPr>
+      <w:bookmarkStart w:id="6" w:name="_Ref244288347"/>
+      <w:r>
+        <w:t xml:space="preserve">Figure </w:t>
+      </w:r>
+      <w:r>
+        <w:fldChar w:fldCharType="begin"/>
+      </w:r>
+      <w:r>
+        <w:instrText xml:space="preserve"> SEQ Figure \* ARABIC </w:instrText>
+      </w:r>
+      <w:r>
+        <w:fldChar w:fldCharType="separate"/>
+      </w:r>
+      <w:r>
+        <w:rPr>
+          <w:noProof/>
+        </w:rPr>
+        <w:t>9</w:t>
+      </w:r>
+      <w:r>
+        <w:fldChar w:fldCharType="end"/>
+      </w:r>
+      <w:bookmarkEnd w:id="6"/>
+      <w:r>
+        <w:t xml:space="preserve"> Button, wheel, and LED controls</w:t>
       </w:r>
     </w:p>
     <w:p>
@@ -3377,7 +5489,7 @@
         </w:rPr>
         <w:t xml:space="preserve">Driving game: </w:t>
       </w:r>
-      <w:hyperlink r:id="rId13" w:history="1">
+      <w:hyperlink r:id="rId20" w:history="1">
         <w:r>
           <w:rPr>
             <w:rStyle w:val="Hyperlink"/>
@@ -3397,13 +5509,7 @@
           <w:noProof/>
         </w:rPr>
         <w:br/>
-        <w:t>A</w:t>
-      </w:r>
-      <w:r>
-        <w:rPr>
-          <w:noProof/>
-        </w:rPr>
-        <w:t>ccessed 29</w:t>
+        <w:t>Accessed 29</w:t>
       </w:r>
       <w:r>
         <w:rPr>
@@ -3430,30 +5536,13 @@
         <w:rPr>
           <w:lang w:val="en-GB"/>
         </w:rPr>
-        <w:t>[</w:t>
-      </w:r>
-      <w:r>
-        <w:rPr>
-          <w:lang w:val="en-GB"/>
-        </w:rPr>
-        <w:t>5</w:t>
-      </w:r>
-      <w:r>
-        <w:rPr>
-          <w:lang w:val="en-GB"/>
-        </w:rPr>
-        <w:t>]</w:t>
+        <w:t>[5]</w:t>
       </w:r>
       <w:r>
         <w:rPr>
           <w:lang w:val="en-GB"/>
         </w:rPr>
         <w:tab/>
-      </w:r>
-      <w:r>
-        <w:rPr>
-          <w:lang w:val="en-GB"/>
-        </w:rPr>
         <w:t>HID-Project library</w:t>
       </w:r>
       <w:r>
@@ -3501,6 +5590,7 @@
         <w:rPr>
           <w:lang w:val="en-GB"/>
         </w:rPr>
+        <w:lastRenderedPageBreak/>
         <w:t>[1]</w:t>
       </w:r>
       <w:r>
@@ -3518,7 +5608,7 @@
       <w:r>
         <w:t xml:space="preserve"> </w:t>
       </w:r>
-      <w:hyperlink r:id="rId14" w:history="1">
+      <w:hyperlink r:id="rId21" w:history="1">
         <w:r>
           <w:rPr>
             <w:rStyle w:val="Hyperlink"/>
@@ -3564,7 +5654,7 @@
         </w:rPr>
         <w:tab/>
       </w:r>
-      <w:hyperlink r:id="rId15" w:history="1">
+      <w:hyperlink r:id="rId22" w:history="1">
         <w:r>
           <w:rPr>
             <w:rStyle w:val="Hyperlink"/>
@@ -3597,8 +5687,8 @@
       </w:r>
     </w:p>
     <w:sectPr>
-      <w:headerReference w:type="default" r:id="rId16"/>
-      <w:footerReference w:type="default" r:id="rId17"/>
+      <w:headerReference w:type="default" r:id="rId23"/>
+      <w:footerReference w:type="default" r:id="rId24"/>
       <w:pgSz w:w="11906" w:h="16838"/>
       <w:pgMar w:top="709" w:right="1440" w:bottom="1134" w:left="1440" w:header="708" w:footer="708" w:gutter="0"/>
       <w:cols w:space="708"/>
@@ -4274,7 +6364,6 @@
     <w:next w:val="Normal"/>
     <w:link w:val="Heading3Char"/>
     <w:uiPriority w:val="9"/>
-    <w:semiHidden/>
     <w:unhideWhenUsed/>
     <w:qFormat/>
     <w:rsid w:val="000859DA"/>
@@ -4462,7 +6551,6 @@
     <w:name w:val="Heading 3 Char"/>
     <w:link w:val="Heading3"/>
     <w:uiPriority w:val="9"/>
-    <w:semiHidden/>
     <w:rsid w:val="000859DA"/>
     <w:rPr>
       <w:rFonts w:ascii="Calibri Light" w:eastAsia="Times New Roman" w:hAnsi="Calibri Light" w:cs="Times New Roman"/>
@@ -4809,10 +6897,6 @@
 </file>
 
 <file path=customXml/item1.xml><?xml version="1.0" encoding="utf-8"?>
-<b:Sources xmlns:b="http://schemas.openxmlformats.org/officeDocument/2006/bibliography" xmlns="http://schemas.openxmlformats.org/officeDocument/2006/bibliography" SelectedStyle="\HarvardAnglia2008OfficeOnline.xsl" StyleName="Harvard – Anglia 2008"/>
-</file>
-
-<file path=customXml/item2.xml><?xml version="1.0" encoding="utf-8"?>
 <p:properties xmlns:p="http://schemas.microsoft.com/office/2006/metadata/properties" xmlns:xsi="http://www.w3.org/2001/XMLSchema-instance" xmlns:pc="http://schemas.microsoft.com/office/infopath/2007/PartnerControls">
   <documentManagement>
     <lcf76f155ced4ddcb4097134ff3c332f xmlns="e7d6067d-bc6e-4f84-b586-3469bc701aa9">
@@ -4823,7 +6907,20 @@
 </p:properties>
 </file>
 
+<file path=customXml/item2.xml><?xml version="1.0" encoding="utf-8"?>
+<b:Sources xmlns:b="http://schemas.openxmlformats.org/officeDocument/2006/bibliography" xmlns="http://schemas.openxmlformats.org/officeDocument/2006/bibliography" SelectedStyle="\HarvardAnglia2008OfficeOnline.xsl" StyleName="Harvard – Anglia 2008"/>
+</file>
+
 <file path=customXml/item3.xml><?xml version="1.0" encoding="utf-8"?>
+<?mso-contentType ?>
+<FormTemplates xmlns="http://schemas.microsoft.com/sharepoint/v3/contenttype/forms">
+  <Display>DocumentLibraryForm</Display>
+  <Edit>DocumentLibraryForm</Edit>
+  <New>DocumentLibraryForm</New>
+</FormTemplates>
+</file>
+
+<file path=customXml/item4.xml><?xml version="1.0" encoding="utf-8"?>
 <ct:contentTypeSchema xmlns:ct="http://schemas.microsoft.com/office/2006/metadata/contentType" xmlns:ma="http://schemas.microsoft.com/office/2006/metadata/properties/metaAttributes" ct:_="" ma:_="" ma:contentTypeName="Document" ma:contentTypeID="0x010100ACCA975F8D0D5746984DB0EB9F8E158E" ma:contentTypeVersion="9" ma:contentTypeDescription="Create a new document." ma:contentTypeScope="" ma:versionID="9e878cca08fb2ba6f2f3d5d4bfc6d679">
   <xsd:schema xmlns:xsd="http://www.w3.org/2001/XMLSchema" xmlns:xs="http://www.w3.org/2001/XMLSchema" xmlns:p="http://schemas.microsoft.com/office/2006/metadata/properties" xmlns:ns2="e7d6067d-bc6e-4f84-b586-3469bc701aa9" xmlns:ns3="fd9f5c74-e2a0-45b3-9622-3259d29162da" targetNamespace="http://schemas.microsoft.com/office/2006/metadata/properties" ma:root="true" ma:fieldsID="1c5c9a3537fac3b313b835e7731d6036" ns2:_="" ns3:_="">
     <xsd:import namespace="e7d6067d-bc6e-4f84-b586-3469bc701aa9"/>
@@ -5004,24 +7101,7 @@
 </ct:contentTypeSchema>
 </file>
 
-<file path=customXml/item4.xml><?xml version="1.0" encoding="utf-8"?>
-<?mso-contentType ?>
-<FormTemplates xmlns="http://schemas.microsoft.com/sharepoint/v3/contenttype/forms">
-  <Display>DocumentLibraryForm</Display>
-  <Edit>DocumentLibraryForm</Edit>
-  <New>DocumentLibraryForm</New>
-</FormTemplates>
-</file>
-
 <file path=customXml/itemProps1.xml><?xml version="1.0" encoding="utf-8"?>
-<ds:datastoreItem xmlns:ds="http://schemas.openxmlformats.org/officeDocument/2006/customXml" ds:itemID="{79D91E43-2625-4669-B221-6762C448E6C6}">
-  <ds:schemaRefs>
-    <ds:schemaRef ds:uri="http://schemas.openxmlformats.org/officeDocument/2006/bibliography"/>
-  </ds:schemaRefs>
-</ds:datastoreItem>
-</file>
-
-<file path=customXml/itemProps2.xml><?xml version="1.0" encoding="utf-8"?>
 <ds:datastoreItem xmlns:ds="http://schemas.openxmlformats.org/officeDocument/2006/customXml" ds:itemID="{04511DF0-BEF7-49A8-9761-2E82C4E3AAF3}">
   <ds:schemaRefs>
     <ds:schemaRef ds:uri="http://schemas.microsoft.com/office/2006/metadata/properties"/>
@@ -5032,7 +7112,23 @@
 </ds:datastoreItem>
 </file>
 
+<file path=customXml/itemProps2.xml><?xml version="1.0" encoding="utf-8"?>
+<ds:datastoreItem xmlns:ds="http://schemas.openxmlformats.org/officeDocument/2006/customXml" ds:itemID="{79D91E43-2625-4669-B221-6762C448E6C6}">
+  <ds:schemaRefs>
+    <ds:schemaRef ds:uri="http://schemas.openxmlformats.org/officeDocument/2006/bibliography"/>
+  </ds:schemaRefs>
+</ds:datastoreItem>
+</file>
+
 <file path=customXml/itemProps3.xml><?xml version="1.0" encoding="utf-8"?>
+<ds:datastoreItem xmlns:ds="http://schemas.openxmlformats.org/officeDocument/2006/customXml" ds:itemID="{37B8B796-B504-47D4-A4B6-F42D797F5D90}">
+  <ds:schemaRefs>
+    <ds:schemaRef ds:uri="http://schemas.microsoft.com/sharepoint/v3/contenttype/forms"/>
+  </ds:schemaRefs>
+</ds:datastoreItem>
+</file>
+
+<file path=customXml/itemProps4.xml><?xml version="1.0" encoding="utf-8"?>
 <ds:datastoreItem xmlns:ds="http://schemas.openxmlformats.org/officeDocument/2006/customXml" ds:itemID="{EDC293C0-468E-449F-B9BA-414800CA2CBC}">
   <ds:schemaRefs>
     <ds:schemaRef ds:uri="http://schemas.microsoft.com/office/2006/metadata/contentType"/>
@@ -5049,12 +7145,4 @@
     <ds:schemaRef ds:uri="http://schemas.microsoft.com/internal/obd"/>
   </ds:schemaRefs>
 </ds:datastoreItem>
-</file>
-
-<file path=customXml/itemProps4.xml><?xml version="1.0" encoding="utf-8"?>
-<ds:datastoreItem xmlns:ds="http://schemas.openxmlformats.org/officeDocument/2006/customXml" ds:itemID="{37B8B796-B504-47D4-A4B6-F42D797F5D90}">
-  <ds:schemaRefs>
-    <ds:schemaRef ds:uri="http://schemas.microsoft.com/sharepoint/v3/contenttype/forms"/>
-  </ds:schemaRefs>
-</ds:datastoreItem>
 </file>
</xml_diff>